<commit_message>
docs: rewrite the technical documentation in the team's own voice; same figures, cleaner file references
</commit_message>
<xml_diff>
--- a/submission/StudyRoute_Technical_Documentation.docx
+++ b/submission/StudyRoute_Technical_Documentation.docx
@@ -42,22 +42,7 @@
           <w:b w:val="0"/>
           <w:i w:val="0"/>
         </w:rPr>
-        <w:t xml:space="preserve">International Track, Topic C: Cross-border and Student Finance Assistant. Team: TeamEkxin. Code and evidence: https://github.com/NoobCrow/StudyRoute (public; </w:t>
-      </w:r>
-      <w:r>
-        <w:rPr>
-          <w:rFonts w:ascii="Consolas" w:hAnsi="Consolas"/>
-          <w:b w:val="0"/>
-          <w:i w:val="0"/>
-        </w:rPr>
-        <w:t>docker compose up --build</w:t>
-      </w:r>
-      <w:r>
-        <w:rPr>
-          <w:b w:val="0"/>
-          <w:i w:val="0"/>
-        </w:rPr>
-        <w:t>, then http://localhost:8080).</w:t>
+        <w:t>International Track, Topic C: Cross-border and Student Finance Assistant. Team: TeamEkxin. Code and evidence: https://github.com/NoobCrow/StudyRoute (public; run it with docker compose up --build, then open http://localhost:8080).</w:t>
       </w:r>
     </w:p>
     <w:p>
@@ -90,7 +75,7 @@
           <w:b w:val="0"/>
           <w:i w:val="0"/>
         </w:rPr>
-        <w:t>StudyRoute is a sandbox agent that turns one sentence from a parent into a ranked, deadline-aware payment plan that only a person can approve. This report describes how it is built, how it was evaluated, and where the evidence stops.</w:t>
+        <w:t>We built StudyRoute because paying a university abroad from Bangladesh is harder than it should be. A parent types one sentence, and StudyRoute turns it into a ranked, deadline-aware payment plan that only that parent can approve. In this report we explain how we built it, how we tested it, and where our evidence stops.</w:t>
       </w:r>
     </w:p>
     <w:tbl>
@@ -117,7 +102,7 @@
                 <w:color w:val="FFFFFF"/>
                 <w:sz w:val="17"/>
               </w:rPr>
-              <w:t>Assessment area</w:t>
+              <w:t>Area</w:t>
             </w:r>
           </w:p>
         </w:tc>
@@ -134,7 +119,7 @@
                 <w:color w:val="FFFFFF"/>
                 <w:sz w:val="17"/>
               </w:rPr>
-              <w:t>Conclusion</w:t>
+              <w:t>Where we stand</w:t>
             </w:r>
           </w:p>
         </w:tc>
@@ -166,7 +151,7 @@
                 <w:i w:val="0"/>
                 <w:sz w:val="17"/>
               </w:rPr>
-              <w:t>A pure engine computes every number. A domain layer enforces a state machine whose approval step needs a role, a token scope, ownership, a fresh MFA proof and the hash of the summary the person saw. Models sit behind deterministic checks and are optional.</w:t>
+              <w:t>A pure engine calculates every number. A domain layer enforces a state machine, and approving a payment needs the right role, token scope and ownership, a fresh MFA proof and the hash of the summary the parent actually saw. The models sit behind deterministic checks, and each one can be switched off.</w:t>
             </w:r>
           </w:p>
         </w:tc>
@@ -200,7 +185,7 @@
                 <w:i w:val="0"/>
                 <w:sz w:val="17"/>
               </w:rPr>
-              <w:t>Exact integer-money cost ranking, a two-calendar deadline planner, a send-plan optimiser and a stress test, each asserted by tests.</w:t>
+              <w:t>Exact integer-money cost ranking, a deadline planner that respects two calendars, a send-plan optimiser and a currency stress test. Tests assert each of them.</w:t>
             </w:r>
           </w:p>
         </w:tc>
@@ -232,7 +217,7 @@
                 <w:i w:val="0"/>
                 <w:sz w:val="17"/>
               </w:rPr>
-              <w:t>Four small models: a reader, a dialogue policy, an explainer and a review router. Each is measured against a baseline we ran, none is a payment authority, and the modest results are stated (sections 2.7 to 2.12). The contribution is the safety envelope around them, not the models.</w:t>
+              <w:t>Four small models: a reader, a dialogue policy, an explainer and a review router. We measured each against a baseline we ran ourselves, none of them can move money, and we report their modest results openly (sections 2.7 to 2.12). Our contribution is the safety envelope around them, not the models.</w:t>
             </w:r>
           </w:p>
         </w:tc>
@@ -266,7 +251,7 @@
                 <w:i w:val="0"/>
                 <w:sz w:val="17"/>
               </w:rPr>
-              <w:t>Human-only, MFA-bound approval; idempotency; signed webhooks; a hash-chained audit log; a 146-attack self-run probe. Self-assessed: no outside test.</w:t>
+              <w:t>Human-only, MFA-bound approval; idempotency; signed webhooks; a hash-chained audit log; and 146 attacks we ran against our own app. All of it is self-assessed: nobody outside the team has tested it yet.</w:t>
             </w:r>
           </w:p>
         </w:tc>
@@ -298,7 +283,7 @@
                 <w:i w:val="0"/>
                 <w:sz w:val="17"/>
               </w:rPr>
-              <w:t>A controlled, synthetic-data sandbox demonstration. Not production assurance.</w:t>
+              <w:t>A controlled sandbox demonstration on synthetic data. It is not ready for real money.</w:t>
             </w:r>
           </w:p>
         </w:tc>
@@ -318,7 +303,7 @@
           <w:i w:val="0"/>
           <w:sz w:val="19"/>
         </w:rPr>
-        <w:t>Not independently certified</w:t>
+        <w:t>Our own assessment.</w:t>
       </w:r>
       <w:r>
         <w:rPr>
@@ -326,7 +311,7 @@
           <w:i w:val="0"/>
           <w:sz w:val="19"/>
         </w:rPr>
-        <w:t xml:space="preserve"> — This is the team's own description and evidence. It is not an audit, a penetration test, a banking approval or a statement that no vulnerabilities exist. Sections 5 and 6 say what was checked and what was not.</w:t>
+        <w:t xml:space="preserve"> Everything in this report is our description of our own work and the evidence we recorded. It is not an audit, a penetration test or a banking approval, and we do not claim the system has no vulnerabilities. Sections 5 and 6 set out what we checked and what we did not.</w:t>
       </w:r>
     </w:p>
     <w:p>
@@ -342,7 +327,7 @@
           <w:b w:val="0"/>
           <w:i w:val="0"/>
         </w:rPr>
-        <w:t xml:space="preserve"> A parent in Bangladesh paying tuition abroad usually compares banks by the fee they are shown. The larger cost is the exchange-rate margin. In our worked example (GBP 10,000, synthetic rates) 63% of the best provider's cost is margin: BDT 16,000 of BDT 25,300. Fees taken on the way can leave the university short-paid, the due date has to respect two calendars, and the paperwork is unclear. The corridor is large and growing: Bangladesh Bank data, reported by The Observer on 24 July 2026 [8], show USD 881.7 million sent through banks for overseas education in 2025-26, a record and 32% more than a year earlier.</w:t>
+        <w:t xml:space="preserve"> A parent in Bangladesh paying tuition abroad usually compares banks by the fee they are shown, but the bigger cost is hidden in the exchange rate. In our worked example (GBP 10,000, synthetic rates), 63% of the best provider's cost is margin: BDT 16,000 of BDT 25,300. Banks along the way can take fees from the amount and leave the university short-paid, the due date has to fit two countries' calendars, and nobody tells the family clearly which documents the bank will want. The need is real and growing. Bangladesh Bank data, reported by The Observer on 24 July 2026 [8], show USD 881.7 million sent through banks for overseas education in 2025-26, a record and 32% more than the year before.</w:t>
       </w:r>
     </w:p>
     <w:p>
@@ -358,7 +343,7 @@
           <w:b w:val="0"/>
           <w:i w:val="0"/>
         </w:rPr>
-        <w:t xml:space="preserve"> StudyRoute is a sandbox agent. One sentence ("I need to pay GBP 10,000 tuition by 28 October") becomes a quote with every provider ranked by true total cost, a deadline plan across both countries' working days, a document checklist and a draft. The parent approves with a fresh MFA proof bound to the exact summary they saw. A simulated provider settles the payment, and every step is written to a hash-chained audit log. Around that core are a student budget and arrival guide, a simulated bank network, an escrow on a simulated chain, and a bank review desk that routes unusual payments to a person.</w:t>
+        <w:t xml:space="preserve"> A parent types something like "I need to pay GBP 10,000 tuition by 28 October". StudyRoute answers with a quote in which every provider is ranked by its true total cost, a deadline plan across both countries' working days, a document checklist and a draft payment. The parent approves with a fresh MFA proof tied to the exact summary they saw. A simulated provider then settles the payment, and every step lands in a hash-chained audit log. Around that core we added a budget and arrival guide for the student, a simulated bank network, an escrow on a simulated chain, and a bank review desk that routes unusual payments to a person.</w:t>
       </w:r>
     </w:p>
     <w:p>
@@ -367,14 +352,14 @@
           <w:b/>
           <w:i w:val="0"/>
         </w:rPr>
-        <w:t>What we claim as our contribution.</w:t>
+        <w:t>What we think is ours.</w:t>
       </w:r>
       <w:r>
         <w:rPr>
           <w:b w:val="0"/>
           <w:i w:val="0"/>
         </w:rPr>
-        <w:t xml:space="preserve"> Nothing in the algorithms is new: decimal arithmetic, JWT, Argon2, HMAC, hash chains, ONNX, Double DQN and distillation are all established. The contribution is how they are put together and how well the result is checked.</w:t>
+        <w:t xml:space="preserve"> None of the building blocks is new. Decimal arithmetic, JWT, Argon2, HMAC, hash chains, ONNX, Double DQN and distillation are all well established. What we contribute is the way we put them together and how carefully we checked the result.</w:t>
       </w:r>
     </w:p>
     <w:p>
@@ -383,7 +368,7 @@
           <w:b w:val="0"/>
           <w:i w:val="0"/>
         </w:rPr>
-        <w:t>Our thesis: AI can participate in a financial decision only if it cannot be the financial authority. We built the envelope that makes that true, and then measured four small models inside it.</w:t>
+        <w:t>Our thesis is simple: AI should be allowed to take part in a financial decision only if it cannot be the financial authority. We built the envelope that makes that true, and then we measured four small models inside it.</w:t>
       </w:r>
     </w:p>
     <w:p>
@@ -402,7 +387,7 @@
           <w:b w:val="0"/>
           <w:i w:val="0"/>
         </w:rPr>
-        <w:t xml:space="preserve"> An architecture in which a language model can help without being able to hurt. Every number comes from a</w:t>
+        <w:t xml:space="preserve"> A language model can help without being able to hurt. Every number comes from a pure</w:t>
       </w:r>
     </w:p>
     <w:p>
@@ -411,7 +396,7 @@
           <w:b w:val="0"/>
           <w:i w:val="0"/>
         </w:rPr>
-        <w:t>pure engine. Each learned component has a deterministic check or a fallback around it. Only a person with a fresh MFA proof can approve a payment, and a permission table in code, not a prompt, enforces that.</w:t>
+        <w:t>engine. Every learned component has a deterministic check or a fallback around it. Only a person with a fresh MFA proof can approve a payment, and a permission table in code, not a prompt, enforces that.</w:t>
       </w:r>
     </w:p>
     <w:p>
@@ -420,10 +405,17 @@
       </w:pPr>
       <w:r>
         <w:rPr>
+          <w:b/>
+          <w:i w:val="0"/>
+        </w:rPr>
+        <w:t>Four small models, each with one job.</w:t>
+      </w:r>
+      <w:r>
+        <w:rPr>
           <w:b w:val="0"/>
           <w:i w:val="0"/>
         </w:rPr>
-        <w:t>*Four small trained models, each built for one job, each measured against a baseline we actually ran, each</w:t>
+        <w:t xml:space="preserve"> A reader for untidy requests, a dialogue policy, an explainer</w:t>
       </w:r>
     </w:p>
     <w:p>
@@ -432,7 +424,7 @@
           <w:b w:val="0"/>
           <w:i w:val="0"/>
         </w:rPr>
-        <w:t>with its limits published:* a reader of untidy requests, a dialogue policy, an explainer that rewords the engine's answers, and a router that decides which payments a bank reviewer looks at first.</w:t>
+        <w:t>that rewords the engine's answers, and a router that decides which payments a bank reviewer should look at first. We measured each against a baseline we actually ran, and we publish the limits.</w:t>
       </w:r>
     </w:p>
     <w:p>
@@ -441,17 +433,17 @@
       </w:pPr>
       <w:r>
         <w:rPr>
-          <w:b w:val="0"/>
-          <w:i/>
+          <w:b/>
+          <w:i w:val="0"/>
         </w:rPr>
-        <w:t>Evidence a reviewer can re-run, and a list of what it does not show:</w:t>
+        <w:t>Evidence you can re-run, and an honest list of what it does not show.</w:t>
       </w:r>
       <w:r>
         <w:rPr>
           <w:b w:val="0"/>
           <w:i w:val="0"/>
         </w:rPr>
-        <w:t xml:space="preserve"> 1,679 backend tests on a machine that has the explainer fixture (1,678 pass, 1 skipped); a fresh clone collects 1,673, runs 1,672 and skips one module whose fixture is excluded by .gitignore. 463 web tests (439 in an earlier pre-merge log) and 24 browser tests. Mapped to 24 scenarios; a</w:t>
+        <w:t xml:space="preserve"> On a machine that has the</w:t>
       </w:r>
     </w:p>
     <w:p>
@@ -460,7 +452,7 @@
           <w:b w:val="0"/>
           <w:i w:val="0"/>
         </w:rPr>
-        <w:t>146-attack black-box probe, a run in Docker, and a record of what the runs found, including a defect.</w:t>
+        <w:t>explainer fixture there are 1,679 backend tests (1,678 pass, 1 skipped). A fresh clone collects 1,673, runs 1,672 and skips one module, because .gitignore excludes that module's fixture. There are also 463 web tests (439 in an earlier pre-merge log) and 24 browser tests, all mapped to 24 scenarios, plus a 146-attack black-box probe, a run in Docker, and a record of what those runs found, including a defect.</w:t>
       </w:r>
     </w:p>
     <w:p>
@@ -476,22 +468,7 @@
           <w:b w:val="0"/>
           <w:i w:val="0"/>
         </w:rPr>
-        <w:t xml:space="preserve"> (sources in section 5 and in </w:t>
-      </w:r>
-      <w:r>
-        <w:rPr>
-          <w:rFonts w:ascii="Consolas" w:hAnsi="Consolas"/>
-          <w:b w:val="0"/>
-          <w:i w:val="0"/>
-        </w:rPr>
-        <w:t>submission/evidence/</w:t>
-      </w:r>
-      <w:r>
-        <w:rPr>
-          <w:b w:val="0"/>
-          <w:i w:val="0"/>
-        </w:rPr>
-        <w:t>):</w:t>
+        <w:t xml:space="preserve"> (sources in section 5 and in the submission/evidence folder):</w:t>
       </w:r>
     </w:p>
     <w:tbl>
@@ -519,7 +496,7 @@
                 <w:color w:val="FFFFFF"/>
                 <w:sz w:val="17"/>
               </w:rPr>
-              <w:t>What was measured</w:t>
+              <w:t>What we measured</w:t>
             </w:r>
           </w:p>
         </w:tc>
@@ -553,7 +530,7 @@
                 <w:color w:val="FFFFFF"/>
                 <w:sz w:val="17"/>
               </w:rPr>
-              <w:t>Reads as</w:t>
+              <w:t>How to read it</w:t>
             </w:r>
           </w:p>
         </w:tc>
@@ -600,16 +577,7 @@
                 <w:i w:val="0"/>
                 <w:sz w:val="17"/>
               </w:rPr>
-              <w:t xml:space="preserve">Exact; asserted in </w:t>
-            </w:r>
-            <w:r>
-              <w:rPr>
-                <w:rFonts w:ascii="Consolas" w:hAnsi="Consolas"/>
-                <w:b w:val="0"/>
-                <w:i w:val="0"/>
-                <w:sz w:val="17"/>
-              </w:rPr>
-              <w:t>test_engine_quote.py</w:t>
+              <w:t>Exact; asserted in test_engine_quote.py</w:t>
             </w:r>
           </w:p>
         </w:tc>
@@ -659,7 +627,7 @@
                 <w:i w:val="0"/>
                 <w:sz w:val="17"/>
               </w:rPr>
-              <w:t>One or more tests for each of 24 scenarios; the fixture gap is explained in §5</w:t>
+              <w:t>One or more tests for each of 24 scenarios; section 5 explains the fixture gap</w:t>
             </w:r>
           </w:p>
         </w:tc>
@@ -706,7 +674,7 @@
                 <w:i w:val="0"/>
                 <w:sz w:val="17"/>
               </w:rPr>
-              <w:t>Written by the team, not independent</w:t>
+              <w:t>We wrote these tools ourselves; not independent</w:t>
             </w:r>
           </w:p>
         </w:tc>
@@ -803,7 +771,7 @@
                 <w:i w:val="0"/>
                 <w:sz w:val="17"/>
               </w:rPr>
-              <w:t>Simulator is our assumption</w:t>
+              <w:t>The simulator is our own assumption</w:t>
             </w:r>
           </w:p>
         </w:tc>
@@ -853,7 +821,7 @@
                 <w:i w:val="0"/>
                 <w:sz w:val="17"/>
               </w:rPr>
-              <w:t>Mostly rewords; see 2.10</w:t>
+              <w:t>It mostly rewords; see 2.10</w:t>
             </w:r>
           </w:p>
         </w:tc>
@@ -870,7 +838,7 @@
                 <w:i w:val="0"/>
                 <w:sz w:val="17"/>
               </w:rPr>
-              <w:t>Review router, later period it never saw</w:t>
+              <w:t>Review router, on a later period it never saw</w:t>
             </w:r>
           </w:p>
         </w:tc>
@@ -900,7 +868,7 @@
                 <w:i w:val="0"/>
                 <w:sz w:val="17"/>
               </w:rPr>
-              <w:t>Orders well; as a yes/no flag it is modest (section 2.11)</w:t>
+              <w:t>It orders well; as a yes/no flag it is modest (section 2.11)</w:t>
             </w:r>
           </w:p>
         </w:tc>
@@ -920,7 +888,7 @@
           <w:b w:val="0"/>
           <w:i w:val="0"/>
         </w:rPr>
-        <w:t xml:space="preserve"> Providers, fees, rates, KYC, banks and settlement are simulated, and the rates and fees are invented. No real parent or bank has used it, and no outside party has tested its security. The review router was trained on public synthetic data, and as a yes/no flag it is modest. The chain is an in-memory simulation. Most Bangladesh Bank figures are unverified placeholders. Section 6 has the full list.</w:t>
+        <w:t xml:space="preserve"> The providers, fees, rates, KYC, banks and settlement are all simulated, and the rates and fees are invented. No real parent or bank has used StudyRoute, and nobody outside our team has tested its security. We trained the review router on public synthetic data, and as a yes/no flag it is modest. The chain is an in-memory simulation. Most Bangladesh Bank figures are still unverified placeholders. Section 6 has the full list.</w:t>
       </w:r>
     </w:p>
     <w:p>
@@ -945,7 +913,7 @@
           <w:b w:val="0"/>
           <w:i w:val="0"/>
         </w:rPr>
-        <w:t>Five pains drive the design, and each maps to a component:</w:t>
+        <w:t>We started from five problems families actually face, and each one maps to a part of the system:</w:t>
       </w:r>
     </w:p>
     <w:tbl>
@@ -972,7 +940,7 @@
                 <w:color w:val="FFFFFF"/>
                 <w:sz w:val="17"/>
               </w:rPr>
-              <w:t>Pain</w:t>
+              <w:t>Problem</w:t>
             </w:r>
           </w:p>
         </w:tc>
@@ -989,7 +957,7 @@
                 <w:color w:val="FFFFFF"/>
                 <w:sz w:val="17"/>
               </w:rPr>
-              <w:t>Where it is handled</w:t>
+              <w:t>Where we handle it</w:t>
             </w:r>
           </w:p>
         </w:tc>
@@ -1166,7 +1134,7 @@
           <w:b w:val="0"/>
           <w:i w:val="0"/>
         </w:rPr>
-        <w:t xml:space="preserve">The design principle is four sentences: </w:t>
+        <w:t xml:space="preserve">Our design principle fits in one line: </w:t>
       </w:r>
       <w:r>
         <w:rPr>
@@ -1180,7 +1148,7 @@
           <w:b w:val="0"/>
           <w:i w:val="0"/>
         </w:rPr>
-        <w:t xml:space="preserve"> Each is a mechanism with a test:</w:t>
+        <w:t xml:space="preserve"> Each part of that line is a real mechanism with a test behind it:</w:t>
       </w:r>
     </w:p>
     <w:p>
@@ -1196,7 +1164,7 @@
           <w:b w:val="0"/>
           <w:i w:val="0"/>
         </w:rPr>
-        <w:t xml:space="preserve"> Real: the problem framing, the Bangladesh Bank volume figure (USD 881.7m, via The Observer, 24 July 2026), and four study-abroad rules read in Bangladesh Bank circular FEPD-1 No. 40 (no lawyer or AD bank reviewed them). Synthetic: every rate, fee, margin, provider, KYC result, sanction, bank, settlement and student-city cost. Simulated: the chain (in-memory py-evm), the escrow and the bank network. The USD 8.8m saving figure is our arithmetic, not a forecast. Read every number in this document with that box in mind.</w:t>
+        <w:t xml:space="preserve"> Real: the problem itself, the Bangladesh Bank volume figure (USD 881.7m, via The Observer, 24 July 2026), and four study-abroad rules we read in Bangladesh Bank circular FEPD-1 No. 40 (no lawyer or AD bank has reviewed our reading). Synthetic: every rate, fee, margin, provider, KYC result, sanction, bank, settlement and student-city cost. Simulated: the chain (in-memory py-evm), the escrow and the bank network. The USD 8.8m saving is our own arithmetic, not a forecast. Please read every number in this report with that in mind.</w:t>
       </w:r>
     </w:p>
     <w:tbl>
@@ -1224,7 +1192,7 @@
                 <w:color w:val="FFFFFF"/>
                 <w:sz w:val="17"/>
               </w:rPr>
-              <w:t>Statement</w:t>
+              <w:t>What we promise</w:t>
             </w:r>
           </w:p>
         </w:tc>
@@ -1241,7 +1209,7 @@
                 <w:color w:val="FFFFFF"/>
                 <w:sz w:val="17"/>
               </w:rPr>
-              <w:t>Mechanism</w:t>
+              <w:t>How it works</w:t>
             </w:r>
           </w:p>
         </w:tc>
@@ -1258,7 +1226,7 @@
                 <w:color w:val="FFFFFF"/>
                 <w:sz w:val="17"/>
               </w:rPr>
-              <w:t>Test</w:t>
+              <w:t>Where it is tested</w:t>
             </w:r>
           </w:p>
         </w:tc>
@@ -1301,29 +1269,11 @@
           <w:p>
             <w:r>
               <w:rPr>
-                <w:rFonts w:ascii="Consolas" w:hAnsi="Consolas"/>
                 <w:b w:val="0"/>
                 <w:i w:val="0"/>
                 <w:sz w:val="17"/>
               </w:rPr>
-              <w:t>test_engine_quote.py</w:t>
-            </w:r>
-            <w:r>
-              <w:rPr>
-                <w:b w:val="0"/>
-                <w:i w:val="0"/>
-                <w:sz w:val="17"/>
-              </w:rPr>
-              <w:t xml:space="preserve">, </w:t>
-            </w:r>
-            <w:r>
-              <w:rPr>
-                <w:rFonts w:ascii="Consolas" w:hAnsi="Consolas"/>
-                <w:b w:val="0"/>
-                <w:i w:val="0"/>
-                <w:sz w:val="17"/>
-              </w:rPr>
-              <w:t>test_ai_number_guard.py</w:t>
+              <w:t>test_engine_quote.py, test_ai_number_guard.py</w:t>
             </w:r>
           </w:p>
         </w:tc>
@@ -1357,7 +1307,7 @@
                 <w:i w:val="0"/>
                 <w:sz w:val="17"/>
               </w:rPr>
-              <w:t>Models only reword engine drafts or propose a draft; every rewrite passes code checks or the engine's own text is shown</w:t>
+              <w:t>Models only reword engine drafts or propose a draft; every rewrite must pass code checks, or the engine's own text is shown</w:t>
             </w:r>
           </w:p>
         </w:tc>
@@ -1369,7 +1319,6 @@
           <w:p>
             <w:r>
               <w:rPr>
-                <w:rFonts w:ascii="Consolas" w:hAnsi="Consolas"/>
                 <w:b w:val="0"/>
                 <w:i w:val="0"/>
                 <w:sz w:val="17"/>
@@ -1406,49 +1355,22 @@
                 <w:i w:val="0"/>
                 <w:sz w:val="17"/>
               </w:rPr>
-              <w:t xml:space="preserve">Permission table in code; approval needs a fresh MFA proof bound to the payment and to the summary hash; the AI account gets </w:t>
-            </w:r>
-            <w:r>
-              <w:rPr>
-                <w:rFonts w:ascii="Consolas" w:hAnsi="Consolas"/>
+              <w:t>A permission table in code; approval needs a fresh MFA proof bound to the payment and to the summary hash; the AI account gets AI_CANNOT_APPROVE</w:t>
+            </w:r>
+          </w:p>
+        </w:tc>
+        <w:tc>
+          <w:tcPr>
+            <w:tcW w:type="dxa" w:w="3312"/>
+          </w:tcPr>
+          <w:p>
+            <w:r>
+              <w:rPr>
                 <w:b w:val="0"/>
                 <w:i w:val="0"/>
                 <w:sz w:val="17"/>
               </w:rPr>
-              <w:t>AI_CANNOT_APPROVE</w:t>
-            </w:r>
-          </w:p>
-        </w:tc>
-        <w:tc>
-          <w:tcPr>
-            <w:tcW w:type="dxa" w:w="3312"/>
-          </w:tcPr>
-          <w:p>
-            <w:r>
-              <w:rPr>
-                <w:rFonts w:ascii="Consolas" w:hAnsi="Consolas"/>
-                <w:b w:val="0"/>
-                <w:i w:val="0"/>
-                <w:sz w:val="17"/>
-              </w:rPr>
-              <w:t>test_rbac.py</w:t>
-            </w:r>
-            <w:r>
-              <w:rPr>
-                <w:b w:val="0"/>
-                <w:i w:val="0"/>
-                <w:sz w:val="17"/>
-              </w:rPr>
-              <w:t xml:space="preserve">, </w:t>
-            </w:r>
-            <w:r>
-              <w:rPr>
-                <w:rFonts w:ascii="Consolas" w:hAnsi="Consolas"/>
-                <w:b w:val="0"/>
-                <w:i w:val="0"/>
-                <w:sz w:val="17"/>
-              </w:rPr>
-              <w:t>test_api_payment_guards.py</w:t>
+              <w:t>test_rbac.py, test_api_payment_guards.py</w:t>
             </w:r>
           </w:p>
         </w:tc>
@@ -1482,7 +1404,7 @@
                 <w:i w:val="0"/>
                 <w:sz w:val="17"/>
               </w:rPr>
-              <w:t>One audit event per state change in the same transaction; SHA-256 hash chain; triggers block edits</w:t>
+              <w:t>One audit event per state change, in the same transaction; a SHA-256 hash chain; triggers block edits</w:t>
             </w:r>
           </w:p>
         </w:tc>
@@ -1494,20 +1416,11 @@
           <w:p>
             <w:r>
               <w:rPr>
-                <w:rFonts w:ascii="Consolas" w:hAnsi="Consolas"/>
                 <w:b w:val="0"/>
                 <w:i w:val="0"/>
                 <w:sz w:val="17"/>
               </w:rPr>
-              <w:t>test_audit.py</w:t>
-            </w:r>
-            <w:r>
-              <w:rPr>
-                <w:b w:val="0"/>
-                <w:i w:val="0"/>
-                <w:sz w:val="17"/>
-              </w:rPr>
-              <w:t xml:space="preserve"> and the tamper demonstration</w:t>
+              <w:t>test_audit.py and the tamper demonstration</w:t>
             </w:r>
           </w:p>
         </w:tc>
@@ -1666,7 +1579,7 @@
                 <w:color w:val="FFFFFF"/>
                 <w:sz w:val="17"/>
               </w:rPr>
-              <w:t>Responsibility</w:t>
+              <w:t>What it does</w:t>
             </w:r>
           </w:p>
         </w:tc>
@@ -1711,7 +1624,6 @@
           <w:p>
             <w:r>
               <w:rPr>
-                <w:rFonts w:ascii="Consolas" w:hAnsi="Consolas"/>
                 <w:b w:val="0"/>
                 <w:i w:val="0"/>
                 <w:sz w:val="17"/>
@@ -1776,7 +1688,6 @@
           <w:p>
             <w:r>
               <w:rPr>
-                <w:rFonts w:ascii="Consolas" w:hAnsi="Consolas"/>
                 <w:b w:val="0"/>
                 <w:i w:val="0"/>
                 <w:sz w:val="17"/>
@@ -1813,7 +1724,7 @@
                 <w:i w:val="0"/>
                 <w:sz w:val="17"/>
               </w:rPr>
-              <w:t>Database through a passed-in session</w:t>
+              <w:t>Database, through a session passed in</w:t>
             </w:r>
           </w:p>
         </w:tc>
@@ -1841,7 +1752,6 @@
           <w:p>
             <w:r>
               <w:rPr>
-                <w:rFonts w:ascii="Consolas" w:hAnsi="Consolas"/>
                 <w:b w:val="0"/>
                 <w:i w:val="0"/>
                 <w:sz w:val="17"/>
@@ -1906,7 +1816,6 @@
           <w:p>
             <w:r>
               <w:rPr>
-                <w:rFonts w:ascii="Consolas" w:hAnsi="Consolas"/>
                 <w:b w:val="0"/>
                 <w:i w:val="0"/>
                 <w:sz w:val="17"/>
@@ -1971,61 +1880,26 @@
           <w:p>
             <w:r>
               <w:rPr>
-                <w:rFonts w:ascii="Consolas" w:hAnsi="Consolas"/>
                 <w:b w:val="0"/>
                 <w:i w:val="0"/>
                 <w:sz w:val="17"/>
               </w:rPr>
-              <w:t>backend/app/chain/</w:t>
-            </w:r>
+              <w:t>backend/app/chain/, contracts/</w:t>
+            </w:r>
+          </w:p>
+        </w:tc>
+        <w:tc>
+          <w:tcPr>
+            <w:tcW w:type="dxa" w:w="2484"/>
+          </w:tcPr>
+          <w:p>
             <w:r>
               <w:rPr>
                 <w:b w:val="0"/>
                 <w:i w:val="0"/>
                 <w:sz w:val="17"/>
               </w:rPr>
-              <w:t xml:space="preserve">, </w:t>
-            </w:r>
-            <w:r>
-              <w:rPr>
-                <w:rFonts w:ascii="Consolas" w:hAnsi="Consolas"/>
-                <w:b w:val="0"/>
-                <w:i w:val="0"/>
-                <w:sz w:val="17"/>
-              </w:rPr>
-              <w:t>contracts/</w:t>
-            </w:r>
-          </w:p>
-        </w:tc>
-        <w:tc>
-          <w:tcPr>
-            <w:tcW w:type="dxa" w:w="2484"/>
-          </w:tcPr>
-          <w:p>
-            <w:r>
-              <w:rPr>
-                <w:b w:val="0"/>
-                <w:i w:val="0"/>
-                <w:sz w:val="17"/>
-              </w:rPr>
-              <w:t>Compiled contracts, ABI codec, in-memory EVM (</w:t>
-            </w:r>
-            <w:r>
-              <w:rPr>
-                <w:rFonts w:ascii="Consolas" w:hAnsi="Consolas"/>
-                <w:b w:val="0"/>
-                <w:i w:val="0"/>
-                <w:sz w:val="17"/>
-              </w:rPr>
-              <w:t>py-evm</w:t>
-            </w:r>
-            <w:r>
-              <w:rPr>
-                <w:b w:val="0"/>
-                <w:i w:val="0"/>
-                <w:sz w:val="17"/>
-              </w:rPr>
-              <w:t>)</w:t>
+              <w:t>Compiled contracts, ABI codec, in-memory EVM (py-evm)</w:t>
             </w:r>
           </w:p>
         </w:tc>
@@ -2070,7 +1944,6 @@
           <w:p>
             <w:r>
               <w:rPr>
-                <w:rFonts w:ascii="Consolas" w:hAnsi="Consolas"/>
                 <w:b w:val="0"/>
                 <w:i w:val="0"/>
                 <w:sz w:val="17"/>
@@ -2135,7 +2008,6 @@
           <w:p>
             <w:r>
               <w:rPr>
-                <w:rFonts w:ascii="Consolas" w:hAnsi="Consolas"/>
                 <w:b w:val="0"/>
                 <w:i w:val="0"/>
                 <w:sz w:val="17"/>
@@ -2200,7 +2072,6 @@
           <w:p>
             <w:r>
               <w:rPr>
-                <w:rFonts w:ascii="Consolas" w:hAnsi="Consolas"/>
                 <w:b w:val="0"/>
                 <w:i w:val="0"/>
                 <w:sz w:val="17"/>
@@ -2249,7 +2120,7 @@
         <w:pStyle w:val="Heading2"/>
       </w:pPr>
       <w:r>
-        <w:t>1.3 Design decisions and what they cost</w:t>
+        <w:t>1.3 Design decisions and what they cost us</w:t>
       </w:r>
     </w:p>
     <w:tbl>
@@ -2294,7 +2165,7 @@
                 <w:color w:val="FFFFFF"/>
                 <w:sz w:val="17"/>
               </w:rPr>
-              <w:t>Why</w:t>
+              <w:t>Why we made it</w:t>
             </w:r>
           </w:p>
         </w:tc>
@@ -2328,54 +2199,37 @@
                 <w:i w:val="0"/>
                 <w:sz w:val="17"/>
               </w:rPr>
-              <w:t xml:space="preserve">Money as integer minor units plus a currency; rates as </w:t>
-            </w:r>
-            <w:r>
-              <w:rPr>
-                <w:rFonts w:ascii="Consolas" w:hAnsi="Consolas"/>
+              <w:t>Money as integer minor units plus a currency; rates as Decimal; each part rounded once, half-up, at the end</w:t>
+            </w:r>
+          </w:p>
+        </w:tc>
+        <w:tc>
+          <w:tcPr>
+            <w:tcW w:type="dxa" w:w="3312"/>
+          </w:tcPr>
+          <w:p>
+            <w:r>
+              <w:rPr>
                 <w:b w:val="0"/>
                 <w:i w:val="0"/>
                 <w:sz w:val="17"/>
               </w:rPr>
-              <w:t>Decimal</w:t>
-            </w:r>
+              <w:t>Totals are exact and reproducible, and a test checks that the total equals the sum of its parts</w:t>
+            </w:r>
+          </w:p>
+        </w:tc>
+        <w:tc>
+          <w:tcPr>
+            <w:tcW w:type="dxa" w:w="3312"/>
+          </w:tcPr>
+          <w:p>
             <w:r>
               <w:rPr>
                 <w:b w:val="0"/>
                 <w:i w:val="0"/>
                 <w:sz w:val="17"/>
               </w:rPr>
-              <w:t>; each part rounded once, half-up, at the end</w:t>
-            </w:r>
-          </w:p>
-        </w:tc>
-        <w:tc>
-          <w:tcPr>
-            <w:tcW w:type="dxa" w:w="3312"/>
-          </w:tcPr>
-          <w:p>
-            <w:r>
-              <w:rPr>
-                <w:b w:val="0"/>
-                <w:i w:val="0"/>
-                <w:sz w:val="17"/>
-              </w:rPr>
-              <w:t>Totals are exact and reproducible; a test checks that the total equals the sum of its parts</w:t>
-            </w:r>
-          </w:p>
-        </w:tc>
-        <w:tc>
-          <w:tcPr>
-            <w:tcW w:type="dxa" w:w="3312"/>
-          </w:tcPr>
-          <w:p>
-            <w:r>
-              <w:rPr>
-                <w:b w:val="0"/>
-                <w:i w:val="0"/>
-                <w:sz w:val="17"/>
-              </w:rPr>
-              <w:t>More conversion code; display strings are built in the engine</w:t>
+              <w:t>More conversion code; the engine builds the display strings</w:t>
             </w:r>
           </w:p>
         </w:tc>
@@ -2425,7 +2279,7 @@
                 <w:i w:val="0"/>
                 <w:sz w:val="17"/>
               </w:rPr>
-              <w:t>The domain layer must pass data in</w:t>
+              <w:t>The domain layer has to pass the data in</w:t>
             </w:r>
           </w:p>
         </w:tc>
@@ -2457,39 +2311,22 @@
                 <w:i w:val="0"/>
                 <w:sz w:val="17"/>
               </w:rPr>
-              <w:t>One-command start (</w:t>
-            </w:r>
-            <w:r>
-              <w:rPr>
-                <w:rFonts w:ascii="Consolas" w:hAnsi="Consolas"/>
+              <w:t>Anyone can start it with one command (docker compose up)</w:t>
+            </w:r>
+          </w:p>
+        </w:tc>
+        <w:tc>
+          <w:tcPr>
+            <w:tcW w:type="dxa" w:w="3312"/>
+          </w:tcPr>
+          <w:p>
+            <w:r>
+              <w:rPr>
                 <w:b w:val="0"/>
                 <w:i w:val="0"/>
                 <w:sz w:val="17"/>
               </w:rPr>
-              <w:t>docker compose up</w:t>
-            </w:r>
-            <w:r>
-              <w:rPr>
-                <w:b w:val="0"/>
-                <w:i w:val="0"/>
-                <w:sz w:val="17"/>
-              </w:rPr>
-              <w:t>)</w:t>
-            </w:r>
-          </w:p>
-        </w:tc>
-        <w:tc>
-          <w:tcPr>
-            <w:tcW w:type="dxa" w:w="3312"/>
-          </w:tcPr>
-          <w:p>
-            <w:r>
-              <w:rPr>
-                <w:b w:val="0"/>
-                <w:i w:val="0"/>
-                <w:sz w:val="17"/>
-              </w:rPr>
-              <w:t>No database roles: an owner can drop the triggers (risks R7, R8)</w:t>
+              <w:t>No database roles: whoever owns the file can drop the triggers (risks R7, R8)</w:t>
             </w:r>
           </w:p>
         </w:tc>
@@ -2507,7 +2344,7 @@
                 <w:i w:val="0"/>
                 <w:sz w:val="17"/>
               </w:rPr>
-              <w:t>Small local models (ONNX or NumPy) instead of a hosted model by default</w:t>
+              <w:t>Small local models (ONNX or NumPy) by default, instead of a hosted model</w:t>
             </w:r>
           </w:p>
         </w:tc>
@@ -2523,7 +2360,7 @@
                 <w:i w:val="0"/>
                 <w:sz w:val="17"/>
               </w:rPr>
-              <w:t>Works offline with no key; no data leaves the machine; each model file's hash is checked</w:t>
+              <w:t>Works offline with no key; no data leaves the machine; we check each model file's hash</w:t>
             </w:r>
           </w:p>
         </w:tc>
@@ -2539,7 +2376,7 @@
                 <w:i w:val="0"/>
                 <w:sz w:val="17"/>
               </w:rPr>
-              <w:t>Modest quality, measured and reported in sections 2.8 to 2.11</w:t>
+              <w:t>Modest quality, which we measure and report in sections 2.8 to 2.11</w:t>
             </w:r>
           </w:p>
         </w:tc>
@@ -2571,75 +2408,7 @@
                 <w:i w:val="0"/>
                 <w:sz w:val="17"/>
               </w:rPr>
-              <w:t xml:space="preserve">No model failure can block the payment flow; </w:t>
-            </w:r>
-            <w:r>
-              <w:rPr>
-                <w:rFonts w:ascii="Consolas" w:hAnsi="Consolas"/>
-                <w:b w:val="0"/>
-                <w:i w:val="0"/>
-                <w:sz w:val="17"/>
-              </w:rPr>
-              <w:t>NLU_MODE</w:t>
-            </w:r>
-            <w:r>
-              <w:rPr>
-                <w:b w:val="0"/>
-                <w:i w:val="0"/>
-                <w:sz w:val="17"/>
-              </w:rPr>
-              <w:t xml:space="preserve">, </w:t>
-            </w:r>
-            <w:r>
-              <w:rPr>
-                <w:rFonts w:ascii="Consolas" w:hAnsi="Consolas"/>
-                <w:b w:val="0"/>
-                <w:i w:val="0"/>
-                <w:sz w:val="17"/>
-              </w:rPr>
-              <w:t>DIALOGUE_MODE</w:t>
-            </w:r>
-            <w:r>
-              <w:rPr>
-                <w:b w:val="0"/>
-                <w:i w:val="0"/>
-                <w:sz w:val="17"/>
-              </w:rPr>
-              <w:t xml:space="preserve">, </w:t>
-            </w:r>
-            <w:r>
-              <w:rPr>
-                <w:rFonts w:ascii="Consolas" w:hAnsi="Consolas"/>
-                <w:b w:val="0"/>
-                <w:i w:val="0"/>
-                <w:sz w:val="17"/>
-              </w:rPr>
-              <w:t>EXPLAINER_MODE</w:t>
-            </w:r>
-            <w:r>
-              <w:rPr>
-                <w:b w:val="0"/>
-                <w:i w:val="0"/>
-                <w:sz w:val="17"/>
-              </w:rPr>
-              <w:t xml:space="preserve"> and </w:t>
-            </w:r>
-            <w:r>
-              <w:rPr>
-                <w:rFonts w:ascii="Consolas" w:hAnsi="Consolas"/>
-                <w:b w:val="0"/>
-                <w:i w:val="0"/>
-                <w:sz w:val="17"/>
-              </w:rPr>
-              <w:t>RISK_MODE</w:t>
-            </w:r>
-            <w:r>
-              <w:rPr>
-                <w:b w:val="0"/>
-                <w:i w:val="0"/>
-                <w:sz w:val="17"/>
-              </w:rPr>
-              <w:t xml:space="preserve"> can each be switched off</w:t>
+              <w:t>A failing model can never block a payment; NLU_MODE, DIALOGUE_MODE, EXPLAINER_MODE and RISK_MODE can each be switched off</w:t>
             </w:r>
           </w:p>
         </w:tc>
@@ -2688,7 +2457,7 @@
                 <w:i w:val="0"/>
                 <w:sz w:val="17"/>
               </w:rPr>
-              <w:t>The score is a routing aid, not an authority</w:t>
+              <w:t>The score helps decide who looks; it is never an authority</w:t>
             </w:r>
           </w:p>
         </w:tc>
@@ -2704,7 +2473,7 @@
                 <w:i w:val="0"/>
                 <w:sz w:val="17"/>
               </w:rPr>
-              <w:t>No automatic approval path, by design</w:t>
+              <w:t>No automatic approval path, on purpose</w:t>
             </w:r>
           </w:p>
         </w:tc>
@@ -2736,7 +2505,7 @@
                 <w:i w:val="0"/>
                 <w:sz w:val="17"/>
               </w:rPr>
-              <w:t>No real money, no credentials: a judge can run it</w:t>
+              <w:t>No real money and no credentials, so a judge can run everything</w:t>
             </w:r>
           </w:p>
         </w:tc>
@@ -2751,7 +2520,7 @@
                 <w:i w:val="0"/>
                 <w:sz w:val="17"/>
               </w:rPr>
-              <w:t>Figures are illustrative and not calibrated against real quotes</w:t>
+              <w:t>The figures illustrate the method; they are not calibrated against real quotes</w:t>
             </w:r>
           </w:p>
         </w:tc>
@@ -2826,22 +2595,7 @@
           <w:b w:val="0"/>
           <w:i w:val="0"/>
         </w:rPr>
-        <w:t xml:space="preserve">The state machine is a transition table. Every row names the event, the allowed source states, the target state, who may trigger it (parent, AI, admin, system, provider) and the guards that must hold. An illegal move returns </w:t>
-      </w:r>
-      <w:r>
-        <w:rPr>
-          <w:rFonts w:ascii="Consolas" w:hAnsi="Consolas"/>
-          <w:b w:val="0"/>
-          <w:i w:val="0"/>
-        </w:rPr>
-        <w:t>409 INVALID_STATE</w:t>
-      </w:r>
-      <w:r>
-        <w:rPr>
-          <w:b w:val="0"/>
-          <w:i w:val="0"/>
-        </w:rPr>
-        <w:t>. Each transition writes one audit event in the same database transaction, and an optimistic-lock version column stops two simultaneous approvals from both succeeding.</w:t>
+        <w:t>We wrote the state machine as a transition table. Each row names the event, the states it may start from, the state it leads to, who may trigger it (parent, AI, admin, system or provider) and the guards that must hold. An illegal move returns 409 INVALID_STATE. Every transition writes one audit event in the same database transaction, and an optimistic-lock version column stops two simultaneous approvals from both succeeding.</w:t>
       </w:r>
     </w:p>
     <w:p>
@@ -2850,7 +2604,7 @@
           <w:b w:val="0"/>
           <w:i w:val="0"/>
         </w:rPr>
-        <w:t>Approval guards: the quote is still valid, KYC is verified, the recipient is allowlisted, the mock sanctions check is clear, the sandbox per-transaction and daily caps hold, the bank review (if one was opened) is cleared, a fresh MFA proof is presented, and the hash of the approval summary the person saw matches.</w:t>
+        <w:t>Before a payment can be approved, all of these must hold: the quote is still valid, KYC is verified, the recipient is allowlisted, the mock sanctions check is clear, the sandbox per-transaction and daily caps hold, any bank review that was opened has been cleared, a fresh MFA proof is presented, and the hash of the approval summary the parent saw still matches.</w:t>
       </w:r>
     </w:p>
     <w:p>
@@ -2893,7 +2647,7 @@
           <w:b w:val="0"/>
           <w:i w:val="0"/>
         </w:rPr>
-        <w:t xml:space="preserve"> a draft, but a person clicks each step.</w:t>
+        <w:t xml:space="preserve"> a draft, but a person clicks every step.</w:t>
       </w:r>
     </w:p>
     <w:p>
@@ -2926,37 +2680,7 @@
           <w:b w:val="0"/>
           <w:i w:val="0"/>
         </w:rPr>
-        <w:t xml:space="preserve">The parent approves with </w:t>
-      </w:r>
-      <w:r>
-        <w:rPr>
-          <w:rFonts w:ascii="Consolas" w:hAnsi="Consolas"/>
-          <w:b w:val="0"/>
-          <w:i w:val="0"/>
-        </w:rPr>
-        <w:t>X-MFA-Proof</w:t>
-      </w:r>
-      <w:r>
-        <w:rPr>
-          <w:b w:val="0"/>
-          <w:i w:val="0"/>
-        </w:rPr>
-        <w:t xml:space="preserve"> and </w:t>
-      </w:r>
-      <w:r>
-        <w:rPr>
-          <w:rFonts w:ascii="Consolas" w:hAnsi="Consolas"/>
-          <w:b w:val="0"/>
-          <w:i w:val="0"/>
-        </w:rPr>
-        <w:t>confirm_summary_hash</w:t>
-      </w:r>
-      <w:r>
-        <w:rPr>
-          <w:b w:val="0"/>
-          <w:i w:val="0"/>
-        </w:rPr>
-        <w:t>. If anything changed, the hash differs and</w:t>
+        <w:t>The parent approves with an MFA proof and the summary hash they confirmed. If anything has changed since,</w:t>
       </w:r>
     </w:p>
     <w:p>
@@ -2965,7 +2689,7 @@
           <w:b w:val="0"/>
           <w:i w:val="0"/>
         </w:rPr>
-        <w:t>the approval is refused.</w:t>
+        <w:t>the hashes differ and the approval is refused.</w:t>
       </w:r>
     </w:p>
     <w:p>
@@ -2977,7 +2701,7 @@
           <w:b w:val="0"/>
           <w:i w:val="0"/>
         </w:rPr>
-        <w:t>A background worker submits the approved payment after a short cancellation window, assigns a UETR and hands</w:t>
+        <w:t>A background worker submits the approved payment after a short cancellation window, assigns a UETR and</w:t>
       </w:r>
     </w:p>
     <w:p>
@@ -2986,37 +2710,7 @@
           <w:b w:val="0"/>
           <w:i w:val="0"/>
         </w:rPr>
-        <w:t xml:space="preserve">it to the mock provider. The simulator later sends an HMAC-signed webhook; the API verifies it and applies </w:t>
-      </w:r>
-      <w:r>
-        <w:rPr>
-          <w:rFonts w:ascii="Consolas" w:hAnsi="Consolas"/>
-          <w:b w:val="0"/>
-          <w:i w:val="0"/>
-        </w:rPr>
-        <w:t>SETTLED</w:t>
-      </w:r>
-      <w:r>
-        <w:rPr>
-          <w:b w:val="0"/>
-          <w:i w:val="0"/>
-        </w:rPr>
-        <w:t xml:space="preserve"> or </w:t>
-      </w:r>
-      <w:r>
-        <w:rPr>
-          <w:rFonts w:ascii="Consolas" w:hAnsi="Consolas"/>
-          <w:b w:val="0"/>
-          <w:i w:val="0"/>
-        </w:rPr>
-        <w:t>FAILED</w:t>
-      </w:r>
-      <w:r>
-        <w:rPr>
-          <w:b w:val="0"/>
-          <w:i w:val="0"/>
-        </w:rPr>
-        <w:t>.</w:t>
+        <w:t>hands it to the mock provider. The simulator later sends an HMAC-signed webhook; the API verifies it and records SETTLED or FAILED.</w:t>
       </w:r>
     </w:p>
     <w:p>
@@ -3030,378 +2724,10 @@
     <w:p>
       <w:r>
         <w:rPr>
-          <w:rFonts w:ascii="Consolas" w:hAnsi="Consolas"/>
           <w:b w:val="0"/>
           <w:i w:val="0"/>
         </w:rPr>
-        <w:t>users</w:t>
-      </w:r>
-      <w:r>
-        <w:rPr>
-          <w:b w:val="0"/>
-          <w:i w:val="0"/>
-        </w:rPr>
-        <w:t xml:space="preserve">, </w:t>
-      </w:r>
-      <w:r>
-        <w:rPr>
-          <w:rFonts w:ascii="Consolas" w:hAnsi="Consolas"/>
-          <w:b w:val="0"/>
-          <w:i w:val="0"/>
-        </w:rPr>
-        <w:t>recipients</w:t>
-      </w:r>
-      <w:r>
-        <w:rPr>
-          <w:b w:val="0"/>
-          <w:i w:val="0"/>
-        </w:rPr>
-        <w:t xml:space="preserve"> (account stored encrypted with AES-256-GCM, only the last four digits shown), </w:t>
-      </w:r>
-      <w:r>
-        <w:rPr>
-          <w:rFonts w:ascii="Consolas" w:hAnsi="Consolas"/>
-          <w:b w:val="0"/>
-          <w:i w:val="0"/>
-        </w:rPr>
-        <w:t>quotes</w:t>
-      </w:r>
-      <w:r>
-        <w:rPr>
-          <w:b w:val="0"/>
-          <w:i w:val="0"/>
-        </w:rPr>
-        <w:t xml:space="preserve"> (inputs, results, mid-rate source and time, input hash), </w:t>
-      </w:r>
-      <w:r>
-        <w:rPr>
-          <w:rFonts w:ascii="Consolas" w:hAnsi="Consolas"/>
-          <w:b w:val="0"/>
-          <w:i w:val="0"/>
-        </w:rPr>
-        <w:t>payments</w:t>
-      </w:r>
-      <w:r>
-        <w:rPr>
-          <w:b w:val="0"/>
-          <w:i w:val="0"/>
-        </w:rPr>
-        <w:t xml:space="preserve"> (state, summary hash, version for optimistic locking), </w:t>
-      </w:r>
-      <w:r>
-        <w:rPr>
-          <w:rFonts w:ascii="Consolas" w:hAnsi="Consolas"/>
-          <w:b w:val="0"/>
-          <w:i w:val="0"/>
-        </w:rPr>
-        <w:t>payment_transitions</w:t>
-      </w:r>
-      <w:r>
-        <w:rPr>
-          <w:b w:val="0"/>
-          <w:i w:val="0"/>
-        </w:rPr>
-        <w:t xml:space="preserve">, </w:t>
-      </w:r>
-      <w:r>
-        <w:rPr>
-          <w:rFonts w:ascii="Consolas" w:hAnsi="Consolas"/>
-          <w:b w:val="0"/>
-          <w:i w:val="0"/>
-        </w:rPr>
-        <w:t>audit_events</w:t>
-      </w:r>
-      <w:r>
-        <w:rPr>
-          <w:b w:val="0"/>
-          <w:i w:val="0"/>
-        </w:rPr>
-        <w:t xml:space="preserve">, </w:t>
-      </w:r>
-      <w:r>
-        <w:rPr>
-          <w:rFonts w:ascii="Consolas" w:hAnsi="Consolas"/>
-          <w:b w:val="0"/>
-          <w:i w:val="0"/>
-        </w:rPr>
-        <w:t>audit_head</w:t>
-      </w:r>
-      <w:r>
-        <w:rPr>
-          <w:b w:val="0"/>
-          <w:i w:val="0"/>
-        </w:rPr>
-        <w:t xml:space="preserve">, </w:t>
-      </w:r>
-      <w:r>
-        <w:rPr>
-          <w:rFonts w:ascii="Consolas" w:hAnsi="Consolas"/>
-          <w:b w:val="0"/>
-          <w:i w:val="0"/>
-        </w:rPr>
-        <w:t>idempotency_keys</w:t>
-      </w:r>
-      <w:r>
-        <w:rPr>
-          <w:b w:val="0"/>
-          <w:i w:val="0"/>
-        </w:rPr>
-        <w:t xml:space="preserve"> (unique per user and key), </w:t>
-      </w:r>
-      <w:r>
-        <w:rPr>
-          <w:rFonts w:ascii="Consolas" w:hAnsi="Consolas"/>
-          <w:b w:val="0"/>
-          <w:i w:val="0"/>
-        </w:rPr>
-        <w:t>webhook_events</w:t>
-      </w:r>
-      <w:r>
-        <w:rPr>
-          <w:b w:val="0"/>
-          <w:i w:val="0"/>
-        </w:rPr>
-        <w:t xml:space="preserve"> (unique event id), </w:t>
-      </w:r>
-      <w:r>
-        <w:rPr>
-          <w:rFonts w:ascii="Consolas" w:hAnsi="Consolas"/>
-          <w:b w:val="0"/>
-          <w:i w:val="0"/>
-        </w:rPr>
-        <w:t>config_rules</w:t>
-      </w:r>
-      <w:r>
-        <w:rPr>
-          <w:b w:val="0"/>
-          <w:i w:val="0"/>
-        </w:rPr>
-        <w:t xml:space="preserve"> (value, source URL, last checked, verified), </w:t>
-      </w:r>
-      <w:r>
-        <w:rPr>
-          <w:rFonts w:ascii="Consolas" w:hAnsi="Consolas"/>
-          <w:b w:val="0"/>
-          <w:i w:val="0"/>
-        </w:rPr>
-        <w:t>kyc_records</w:t>
-      </w:r>
-      <w:r>
-        <w:rPr>
-          <w:b w:val="0"/>
-          <w:i w:val="0"/>
-        </w:rPr>
-        <w:t xml:space="preserve">, </w:t>
-      </w:r>
-      <w:r>
-        <w:rPr>
-          <w:rFonts w:ascii="Consolas" w:hAnsi="Consolas"/>
-          <w:b w:val="0"/>
-          <w:i w:val="0"/>
-        </w:rPr>
-        <w:t>documents</w:t>
-      </w:r>
-      <w:r>
-        <w:rPr>
-          <w:b w:val="0"/>
-          <w:i w:val="0"/>
-        </w:rPr>
-        <w:t xml:space="preserve">, </w:t>
-      </w:r>
-      <w:r>
-        <w:rPr>
-          <w:rFonts w:ascii="Consolas" w:hAnsi="Consolas"/>
-          <w:b w:val="0"/>
-          <w:i w:val="0"/>
-        </w:rPr>
-        <w:t>mfa_proofs</w:t>
-      </w:r>
-      <w:r>
-        <w:rPr>
-          <w:b w:val="0"/>
-          <w:i w:val="0"/>
-        </w:rPr>
-        <w:t xml:space="preserve">, </w:t>
-      </w:r>
-      <w:r>
-        <w:rPr>
-          <w:rFonts w:ascii="Consolas" w:hAnsi="Consolas"/>
-          <w:b w:val="0"/>
-          <w:i w:val="0"/>
-        </w:rPr>
-        <w:t>refresh_tokens</w:t>
-      </w:r>
-      <w:r>
-        <w:rPr>
-          <w:b w:val="0"/>
-          <w:i w:val="0"/>
-        </w:rPr>
-        <w:t xml:space="preserve">, </w:t>
-      </w:r>
-      <w:r>
-        <w:rPr>
-          <w:rFonts w:ascii="Consolas" w:hAnsi="Consolas"/>
-          <w:b w:val="0"/>
-          <w:i w:val="0"/>
-        </w:rPr>
-        <w:t>provider_ledger</w:t>
-      </w:r>
-      <w:r>
-        <w:rPr>
-          <w:b w:val="0"/>
-          <w:i w:val="0"/>
-        </w:rPr>
-        <w:t xml:space="preserve">, and for the bank network </w:t>
-      </w:r>
-      <w:r>
-        <w:rPr>
-          <w:rFonts w:ascii="Consolas" w:hAnsi="Consolas"/>
-          <w:b w:val="0"/>
-          <w:i w:val="0"/>
-        </w:rPr>
-        <w:t>bank_accounts</w:t>
-      </w:r>
-      <w:r>
-        <w:rPr>
-          <w:b w:val="0"/>
-          <w:i w:val="0"/>
-        </w:rPr>
-        <w:t xml:space="preserve">, </w:t>
-      </w:r>
-      <w:r>
-        <w:rPr>
-          <w:rFonts w:ascii="Consolas" w:hAnsi="Consolas"/>
-          <w:b w:val="0"/>
-          <w:i w:val="0"/>
-        </w:rPr>
-        <w:t>bank_transfers</w:t>
-      </w:r>
-      <w:r>
-        <w:rPr>
-          <w:b w:val="0"/>
-          <w:i w:val="0"/>
-        </w:rPr>
-        <w:t xml:space="preserve">, </w:t>
-      </w:r>
-      <w:r>
-        <w:rPr>
-          <w:rFonts w:ascii="Consolas" w:hAnsi="Consolas"/>
-          <w:b w:val="0"/>
-          <w:i w:val="0"/>
-        </w:rPr>
-        <w:t>bank_transfer_events</w:t>
-      </w:r>
-      <w:r>
-        <w:rPr>
-          <w:b w:val="0"/>
-          <w:i w:val="0"/>
-        </w:rPr>
-        <w:t xml:space="preserve">, </w:t>
-      </w:r>
-      <w:r>
-        <w:rPr>
-          <w:rFonts w:ascii="Consolas" w:hAnsi="Consolas"/>
-          <w:b w:val="0"/>
-          <w:i w:val="0"/>
-        </w:rPr>
-        <w:t>ledger_journals</w:t>
-      </w:r>
-      <w:r>
-        <w:rPr>
-          <w:b w:val="0"/>
-          <w:i w:val="0"/>
-        </w:rPr>
-        <w:t xml:space="preserve"> and </w:t>
-      </w:r>
-      <w:r>
-        <w:rPr>
-          <w:rFonts w:ascii="Consolas" w:hAnsi="Consolas"/>
-          <w:b w:val="0"/>
-          <w:i w:val="0"/>
-        </w:rPr>
-        <w:t>ledger_entries</w:t>
-      </w:r>
-      <w:r>
-        <w:rPr>
-          <w:b w:val="0"/>
-          <w:i w:val="0"/>
-        </w:rPr>
-        <w:t xml:space="preserve">. The payment state is limited by a CHECK constraint, and triggers block </w:t>
-      </w:r>
-      <w:r>
-        <w:rPr>
-          <w:rFonts w:ascii="Consolas" w:hAnsi="Consolas"/>
-          <w:b w:val="0"/>
-          <w:i w:val="0"/>
-        </w:rPr>
-        <w:t>UPDATE</w:t>
-      </w:r>
-      <w:r>
-        <w:rPr>
-          <w:b w:val="0"/>
-          <w:i w:val="0"/>
-        </w:rPr>
-        <w:t xml:space="preserve"> and </w:t>
-      </w:r>
-      <w:r>
-        <w:rPr>
-          <w:rFonts w:ascii="Consolas" w:hAnsi="Consolas"/>
-          <w:b w:val="0"/>
-          <w:i w:val="0"/>
-        </w:rPr>
-        <w:t>DELETE</w:t>
-      </w:r>
-      <w:r>
-        <w:rPr>
-          <w:b w:val="0"/>
-          <w:i w:val="0"/>
-        </w:rPr>
-        <w:t xml:space="preserve"> on </w:t>
-      </w:r>
-      <w:r>
-        <w:rPr>
-          <w:rFonts w:ascii="Consolas" w:hAnsi="Consolas"/>
-          <w:b w:val="0"/>
-          <w:i w:val="0"/>
-        </w:rPr>
-        <w:t>audit_events</w:t>
-      </w:r>
-      <w:r>
-        <w:rPr>
-          <w:b w:val="0"/>
-          <w:i w:val="0"/>
-        </w:rPr>
-        <w:t xml:space="preserve">, </w:t>
-      </w:r>
-      <w:r>
-        <w:rPr>
-          <w:rFonts w:ascii="Consolas" w:hAnsi="Consolas"/>
-          <w:b w:val="0"/>
-          <w:i w:val="0"/>
-        </w:rPr>
-        <w:t>ledger_journals</w:t>
-      </w:r>
-      <w:r>
-        <w:rPr>
-          <w:b w:val="0"/>
-          <w:i w:val="0"/>
-        </w:rPr>
-        <w:t xml:space="preserve"> and </w:t>
-      </w:r>
-      <w:r>
-        <w:rPr>
-          <w:rFonts w:ascii="Consolas" w:hAnsi="Consolas"/>
-          <w:b w:val="0"/>
-          <w:i w:val="0"/>
-        </w:rPr>
-        <w:t>ledger_entries</w:t>
-      </w:r>
-      <w:r>
-        <w:rPr>
-          <w:b w:val="0"/>
-          <w:i w:val="0"/>
-        </w:rPr>
-        <w:t>.</w:t>
+        <w:t>The main tables are users, recipients (account numbers stored encrypted with AES-256-GCM, with only the last four digits shown), quotes (inputs, results, mid-rate source and time, input hash), payments (state, summary hash, version for optimistic locking), payment_transitions, audit_events, audit_head, idempotency_keys (unique per user and key), webhook_events (unique event id), config_rules (value, source URL, last checked, verified), kyc_records, documents, mfa_proofs, refresh_tokens and provider_ledger. The bank network adds bank_accounts, bank_transfers, bank_transfer_events, ledger_journals and ledger_entries. A CHECK constraint limits the payment state, and triggers block UPDATE and DELETE on audit_events, ledger_journals and ledger_entries.</w:t>
       </w:r>
     </w:p>
     <w:p>
@@ -3426,52 +2752,7 @@
           <w:b w:val="0"/>
           <w:i w:val="0"/>
         </w:rPr>
-        <w:t xml:space="preserve">Every rate is BDT per one unit of foreign currency. A provider selling foreign currency quotes above the mid-market rate, and the gap is the hidden margin. For one provider with target amount </w:t>
-      </w:r>
-      <w:r>
-        <w:rPr>
-          <w:rFonts w:ascii="Consolas" w:hAnsi="Consolas"/>
-          <w:b w:val="0"/>
-          <w:i w:val="0"/>
-        </w:rPr>
-        <w:t>T</w:t>
-      </w:r>
-      <w:r>
-        <w:rPr>
-          <w:b w:val="0"/>
-          <w:i w:val="0"/>
-        </w:rPr>
-        <w:t xml:space="preserve"> (foreign), mid rate </w:t>
-      </w:r>
-      <w:r>
-        <w:rPr>
-          <w:rFonts w:ascii="Consolas" w:hAnsi="Consolas"/>
-          <w:b w:val="0"/>
-          <w:i w:val="0"/>
-        </w:rPr>
-        <w:t>m</w:t>
-      </w:r>
-      <w:r>
-        <w:rPr>
-          <w:b w:val="0"/>
-          <w:i w:val="0"/>
-        </w:rPr>
-        <w:t xml:space="preserve"> and margin </w:t>
-      </w:r>
-      <w:r>
-        <w:rPr>
-          <w:rFonts w:ascii="Consolas" w:hAnsi="Consolas"/>
-          <w:b w:val="0"/>
-          <w:i w:val="0"/>
-        </w:rPr>
-        <w:t>g</w:t>
-      </w:r>
-      <w:r>
-        <w:rPr>
-          <w:b w:val="0"/>
-          <w:i w:val="0"/>
-        </w:rPr>
-        <w:t xml:space="preserve"> percent:</w:t>
+        <w:t>All rates are in BDT per one unit of foreign currency. A provider selling foreign currency quotes above the mid-market rate, and the gap is the hidden margin. For one provider, with target amount T (in foreign currency), mid rate m and margin g percent:</w:t>
       </w:r>
     </w:p>
     <w:p>
@@ -3508,22 +2789,7 @@
           <w:b w:val="0"/>
           <w:i w:val="0"/>
         </w:rPr>
-        <w:t xml:space="preserve">We rank by </w:t>
-      </w:r>
-      <w:r>
-        <w:rPr>
-          <w:rFonts w:ascii="Consolas" w:hAnsi="Consolas"/>
-          <w:b w:val="0"/>
-          <w:i w:val="0"/>
-        </w:rPr>
-        <w:t>cost_pct</w:t>
-      </w:r>
-      <w:r>
-        <w:rPr>
-          <w:b w:val="0"/>
-          <w:i w:val="0"/>
-        </w:rPr>
-        <w:t>, then by what the parent pays, then by provider id, so the order is deterministic. We rank by percentage of the amount at the mid rate because the parent's real question is "how much of my money disappears", and a flat fee comparison cannot see the margin. A provider that cannot offer the requested charge code is quoted with its default one, and the result carries both codes and a warning.</w:t>
+        <w:t>We rank by cost_pct, then by what the parent pays, then by provider id, so the order is always the same. We rank by the share of the amount at the mid rate because the parent's real question is "how much of my money disappears?", and comparing flat fees can never show the margin. If a provider cannot offer the requested charge code, we quote it with its default code and show both codes and a warning.</w:t>
       </w:r>
     </w:p>
     <w:p>
@@ -4078,22 +3344,7 @@
           <w:b w:val="0"/>
           <w:i w:val="0"/>
         </w:rPr>
-        <w:t xml:space="preserve">B ranks first. C ranks second but carries a red shortfall warning: the university would receive GBP 9,965. In B's BDT 25,300, the FX margin is BDT 16,000 (63%), the fixed fee 3,000, the SWIFT fee 1,500 and the OUR fees 4,800. Every figure in this table is asserted in </w:t>
-      </w:r>
-      <w:r>
-        <w:rPr>
-          <w:rFonts w:ascii="Consolas" w:hAnsi="Consolas"/>
-          <w:b w:val="0"/>
-          <w:i w:val="0"/>
-        </w:rPr>
-        <w:t>backend/tests/test_engine_quote.py</w:t>
-      </w:r>
-      <w:r>
-        <w:rPr>
-          <w:b w:val="0"/>
-          <w:i w:val="0"/>
-        </w:rPr>
-        <w:t xml:space="preserve"> (blueprint test T01). The providers and their fees are invented for the sandbox; the table shows how the engine ranks, not what a real provider would charge.</w:t>
+        <w:t>B comes first. C comes second, but with a red shortfall warning: the university would receive only GBP 9,965. Of B's BDT 25,300, the FX margin is BDT 16,000 (63%), the fixed fee 3,000, the SWIFT fee 1,500 and the OUR fees 4,800. Every figure in this table is asserted in our test for blueprint scenario T01. The providers and their fees are invented for the sandbox, so the table shows how the engine ranks, not what a real provider would charge.</w:t>
       </w:r>
     </w:p>
     <w:p>
@@ -4102,22 +3353,7 @@
           <w:b w:val="0"/>
           <w:i w:val="0"/>
         </w:rPr>
-        <w:t xml:space="preserve">Zero, negative and unsupported amounts are rejected with </w:t>
-      </w:r>
-      <w:r>
-        <w:rPr>
-          <w:rFonts w:ascii="Consolas" w:hAnsi="Consolas"/>
-          <w:b w:val="0"/>
-          <w:i w:val="0"/>
-        </w:rPr>
-        <w:t>422 VALIDATION_FAILED</w:t>
-      </w:r>
-      <w:r>
-        <w:rPr>
-          <w:b w:val="0"/>
-          <w:i w:val="0"/>
-        </w:rPr>
-        <w:t>.</w:t>
+        <w:t>Zero, negative and unsupported amounts are rejected with 422 VALIDATION_FAILED.</w:t>
       </w:r>
     </w:p>
     <w:p>
@@ -4134,22 +3370,7 @@
           <w:b w:val="0"/>
           <w:i w:val="0"/>
         </w:rPr>
-        <w:t xml:space="preserve">A quote stores every input, the mid-rate source and timestamp, and an input hash. It expires after 300 seconds (configurable). Approving with an expired quote returns </w:t>
-      </w:r>
-      <w:r>
-        <w:rPr>
-          <w:rFonts w:ascii="Consolas" w:hAnsi="Consolas"/>
-          <w:b w:val="0"/>
-          <w:i w:val="0"/>
-        </w:rPr>
-        <w:t>409 QUOTE_EXPIRED</w:t>
-      </w:r>
-      <w:r>
-        <w:rPr>
-          <w:b w:val="0"/>
-          <w:i w:val="0"/>
-        </w:rPr>
-        <w:t xml:space="preserve"> and sends the payment back to DRAFT; the parent requotes.</w:t>
+        <w:t>A quote stores every input, the source and time of the mid rate, and an input hash. It expires after 300 seconds (configurable). Approving with an expired quote returns 409 QUOTE_EXPIRED and sends the payment back to DRAFT, so the parent simply asks for a fresh quote.</w:t>
       </w:r>
     </w:p>
     <w:p>
@@ -4166,7 +3387,7 @@
           <w:b w:val="0"/>
           <w:i w:val="0"/>
         </w:rPr>
-        <w:t>A business day is a day that is a working day in both Bangladesh (Friday and Saturday off) and the host country (its own weekend and holidays), from configuration.</w:t>
+        <w:t>We count a day as a business day only if it is a working day both in Bangladesh (where Friday and Saturday are off) and in the host country (with its own weekend and holidays, from configuration).</w:t>
       </w:r>
     </w:p>
     <w:p>
@@ -4199,7 +3420,7 @@
           <w:b w:val="0"/>
           <w:i w:val="0"/>
         </w:rPr>
-        <w:t>Every skipped day is returned with its reason ("BD weekend", "GB holiday: ...") and shown in the interface. A scan limit stops a misconfigured calendar from looping.</w:t>
+        <w:t>Every skipped day comes back with its reason ("BD weekend", "GB holiday: ...") and is shown on screen. A scan limit stops a misconfigured calendar from looping forever.</w:t>
       </w:r>
     </w:p>
     <w:p>
@@ -4216,22 +3437,7 @@
           <w:b w:val="0"/>
           <w:i w:val="0"/>
         </w:rPr>
-        <w:t xml:space="preserve">The cheapest provider can be the slowest, and money that lands after the due date means a late fee. Given the send date and each provider's settlement time in business days, </w:t>
-      </w:r>
-      <w:r>
-        <w:rPr>
-          <w:rFonts w:ascii="Consolas" w:hAnsi="Consolas"/>
-          <w:b w:val="0"/>
-          <w:i w:val="0"/>
-        </w:rPr>
-        <w:t>engine/deadline_fit.py</w:t>
-      </w:r>
-      <w:r>
-        <w:rPr>
-          <w:b w:val="0"/>
-          <w:i w:val="0"/>
-        </w:rPr>
-        <w:t xml:space="preserve"> says which providers arrive in time and which of those is cheapest. If the cheapest would be late, the quote says so and names the next one.</w:t>
+        <w:t>The cheapest provider can also be the slowest, and money that lands after the due date means a late fee. Using the send date and each provider's settlement time in business days, the engine works out which providers arrive in time and which of those is cheapest. If the cheapest one would be late, the quote says so and names the next best.</w:t>
       </w:r>
     </w:p>
     <w:p>
@@ -4248,67 +3454,7 @@
           <w:b w:val="0"/>
           <w:i w:val="0"/>
         </w:rPr>
-        <w:t xml:space="preserve">Fixed and SWIFT fees are paid on every transfer while the margin scales with the amount, so how often money is sent changes the real cost. For a total </w:t>
-      </w:r>
-      <w:r>
-        <w:rPr>
-          <w:rFonts w:ascii="Consolas" w:hAnsi="Consolas"/>
-          <w:b w:val="0"/>
-          <w:i w:val="0"/>
-        </w:rPr>
-        <w:t>T</w:t>
-      </w:r>
-      <w:r>
-        <w:rPr>
-          <w:b w:val="0"/>
-          <w:i w:val="0"/>
-        </w:rPr>
-        <w:t xml:space="preserve"> over </w:t>
-      </w:r>
-      <w:r>
-        <w:rPr>
-          <w:rFonts w:ascii="Consolas" w:hAnsi="Consolas"/>
-          <w:b w:val="0"/>
-          <w:i w:val="0"/>
-        </w:rPr>
-        <w:t>m</w:t>
-      </w:r>
-      <w:r>
-        <w:rPr>
-          <w:b w:val="0"/>
-          <w:i w:val="0"/>
-        </w:rPr>
-        <w:t xml:space="preserve"> months the engine considers monthly, every three months, every six months and all at once. It splits </w:t>
-      </w:r>
-      <w:r>
-        <w:rPr>
-          <w:rFonts w:ascii="Consolas" w:hAnsi="Consolas"/>
-          <w:b w:val="0"/>
-          <w:i w:val="0"/>
-        </w:rPr>
-        <w:t>T</w:t>
-      </w:r>
-      <w:r>
-        <w:rPr>
-          <w:b w:val="0"/>
-          <w:i w:val="0"/>
-        </w:rPr>
-        <w:t xml:space="preserve"> into equal transfers (amounts differ by at most one minor unit and sum exactly to </w:t>
-      </w:r>
-      <w:r>
-        <w:rPr>
-          <w:rFonts w:ascii="Consolas" w:hAnsi="Consolas"/>
-          <w:b w:val="0"/>
-          <w:i w:val="0"/>
-        </w:rPr>
-        <w:t>T</w:t>
-      </w:r>
-      <w:r>
-        <w:rPr>
-          <w:b w:val="0"/>
-          <w:i w:val="0"/>
-        </w:rPr>
-        <w:t>), prices each transfer with every provider using the formulas of 2.1, and keeps the provider with the lowest total. A provider that would leave the beneficiary short is never chosen while another does not.</w:t>
+        <w:t>Fixed and SWIFT fees are paid on every transfer, while the margin grows with the amount, so how often a family sends money changes the real cost. For a total T over m months, the engine compares sending monthly, every three months, every six months and all at once. It splits T into equal transfers (the amounts differ by at most one minor unit and add up exactly to T), prices each transfer with every provider using the formulas in 2.1, and keeps the cheapest provider. It never picks a provider that would leave the beneficiary short while another one would not.</w:t>
       </w:r>
     </w:p>
     <w:p>
@@ -4317,22 +3463,7 @@
           <w:b w:val="0"/>
           <w:i w:val="0"/>
         </w:rPr>
-        <w:t xml:space="preserve">Worked case (synthetic; GBP 12,000 over 12 months; charge code OUR): monthly BDT 68,400 with Provider A; every three months BDT 48,400; every six months BDT 37,800 with Provider B; all at once BDT 28,500, a saving of BDT 39,900 against monthly (asserted in </w:t>
-      </w:r>
-      <w:r>
-        <w:rPr>
-          <w:rFonts w:ascii="Consolas" w:hAnsi="Consolas"/>
-          <w:b w:val="0"/>
-          <w:i w:val="0"/>
-        </w:rPr>
-        <w:t>test_engine_cadence.py</w:t>
-      </w:r>
-      <w:r>
-        <w:rPr>
-          <w:b w:val="0"/>
-          <w:i w:val="0"/>
-        </w:rPr>
-        <w:t>). The engine does not predict exchange rates, so the trade-off (money sent early, rate locked early) is stated and not priced.</w:t>
+        <w:t>A worked case (synthetic; GBP 12,000 over 12 months; charge code OUR): sending monthly costs BDT 68,400 with Provider A; every three months BDT 48,400; every six months BDT 37,800 with Provider B; and all at once BDT 28,500, a saving of BDT 39,900 against monthly (asserted in test_engine_cadence.py). The engine does not try to predict exchange rates, so we state the trade-off (money sent early, rate locked early) rather than price it.</w:t>
       </w:r>
     </w:p>
     <w:p>
@@ -4349,7 +3480,7 @@
           <w:b w:val="0"/>
           <w:i w:val="0"/>
         </w:rPr>
-        <w:t>The stress test prices a stored quote again with the foreign currency 5, 10, 15 or 20% dearer in taka, for the same provider, using the same fee engine. Fixed fees in taka do not move. It is a what-if on synthetic rates, read-only, and says it is not a forecast. The runway reports the whole months an amount covers, rounded down so it never over-promises. The student budget converts a month's costs in 20 student cities to taka and rounds up, so it never promises a parent less than a month needs. Its city costs are invented and marked "Not verified".</w:t>
+        <w:t>The stress test re-prices a stored quote with the foreign currency 5, 10, 15 or 20% dearer in taka, for the same provider and with the same fee engine. Fixed fees in taka stay put. It is a read-only what-if on synthetic rates, and it says clearly that it is not a forecast. The runway reports how many whole months an amount covers, rounded down so it never over-promises. The student budget converts a month's costs in 20 student cities into taka and rounds up, so it never tells a parent a month needs less than it does. The city costs are invented and marked "Not verified".</w:t>
       </w:r>
     </w:p>
     <w:p>
@@ -4435,7 +3566,7 @@
           <w:b w:val="0"/>
           <w:i w:val="0"/>
         </w:rPr>
-        <w:t xml:space="preserve"> Pattern rules flag instruction overrides, action requests (approve, send, cancel), limit</w:t>
+        <w:t xml:space="preserve"> Pattern rules flag attempts to override instructions, requests to act (approve, send,</w:t>
       </w:r>
     </w:p>
     <w:p>
@@ -4444,7 +3575,7 @@
           <w:b w:val="0"/>
           <w:i w:val="0"/>
         </w:rPr>
-        <w:t>or configuration changes, privilege claims, secret requests and requests to invent numbers. A flagged message gets a fixed refusal and the model is not called.</w:t>
+        <w:t>cancel), attempts to change limits or configuration, false claims of privilege, requests for secrets and requests to make up numbers. A flagged message gets a fixed refusal, and the model is never called.</w:t>
       </w:r>
     </w:p>
     <w:p>
@@ -4482,22 +3613,7 @@
           <w:b w:val="0"/>
           <w:i w:val="0"/>
         </w:rPr>
-        <w:t xml:space="preserve"> Names become </w:t>
-      </w:r>
-      <w:r>
-        <w:rPr>
-          <w:rFonts w:ascii="Consolas" w:hAnsi="Consolas"/>
-          <w:b w:val="0"/>
-          <w:i w:val="0"/>
-        </w:rPr>
-        <w:t>[PERSON_n]</w:t>
-      </w:r>
-      <w:r>
-        <w:rPr>
-          <w:b w:val="0"/>
-          <w:i w:val="0"/>
-        </w:rPr>
-        <w:t>, account numbers and long digit runs become partial tokens, and</w:t>
+        <w:t xml:space="preserve"> Names become [PERSON_n], account numbers and long runs of digits become partial tokens, and</w:t>
       </w:r>
     </w:p>
     <w:p>
@@ -4506,7 +3622,7 @@
           <w:b w:val="0"/>
           <w:i w:val="0"/>
         </w:rPr>
-        <w:t>passports, e-mails and phones are removed and never restored.</w:t>
+        <w:t>passports, e-mails and phone numbers are removed and never put back.</w:t>
       </w:r>
     </w:p>
     <w:p>
@@ -4525,7 +3641,7 @@
           <w:b w:val="0"/>
           <w:i w:val="0"/>
         </w:rPr>
-        <w:t xml:space="preserve"> Optional. By default the local trained explainer (2.10); a configured external model replaces it.</w:t>
+        <w:t xml:space="preserve"> Optional. By default this is our local trained explainer (2.10); a configured external model can</w:t>
       </w:r>
     </w:p>
     <w:p>
@@ -4534,7 +3650,7 @@
           <w:b w:val="0"/>
           <w:i w:val="0"/>
         </w:rPr>
-        <w:t>The model receives masked facts and must answer with the ids of the facts it used.</w:t>
+        <w:t>take its place. The model sees only the masked facts and must answer with the ids of the facts it used.</w:t>
       </w:r>
     </w:p>
     <w:p>
@@ -4553,7 +3669,7 @@
           <w:b w:val="0"/>
           <w:i w:val="0"/>
         </w:rPr>
-        <w:t xml:space="preserve"> Every number in the reply must equal a number in the allowed facts. Anything else fails</w:t>
+        <w:t xml:space="preserve"> Every number in the reply must match a number in the allowed facts. Anything else fails</w:t>
       </w:r>
     </w:p>
     <w:p>
@@ -4581,37 +3697,7 @@
           <w:b w:val="0"/>
           <w:i w:val="0"/>
         </w:rPr>
-        <w:t xml:space="preserve"> The model may only propose </w:t>
-      </w:r>
-      <w:r>
-        <w:rPr>
-          <w:rFonts w:ascii="Consolas" w:hAnsi="Consolas"/>
-          <w:b w:val="0"/>
-          <w:i w:val="0"/>
-        </w:rPr>
-        <w:t>create_draft</w:t>
-      </w:r>
-      <w:r>
-        <w:rPr>
-          <w:b w:val="0"/>
-          <w:i w:val="0"/>
-        </w:rPr>
-        <w:t xml:space="preserve"> or </w:t>
-      </w:r>
-      <w:r>
-        <w:rPr>
-          <w:rFonts w:ascii="Consolas" w:hAnsi="Consolas"/>
-          <w:b w:val="0"/>
-          <w:i w:val="0"/>
-        </w:rPr>
-        <w:t>request_approval</w:t>
-      </w:r>
-      <w:r>
-        <w:rPr>
-          <w:b w:val="0"/>
-          <w:i w:val="0"/>
-        </w:rPr>
-        <w:t>. Approve, submit, cancel,</w:t>
+        <w:t xml:space="preserve"> The model may only propose create_draft or request_approval. Approving, submitting,</w:t>
       </w:r>
     </w:p>
     <w:p>
@@ -4620,7 +3706,7 @@
           <w:b w:val="0"/>
           <w:i w:val="0"/>
         </w:rPr>
-        <w:t>change limit, allowlist and edit configuration are not available to it.</w:t>
+        <w:t>cancelling, changing a limit, allowlisting and editing configuration are simply not available to it.</w:t>
       </w:r>
     </w:p>
     <w:p>
@@ -4648,7 +3734,7 @@
           <w:b w:val="0"/>
           <w:i w:val="0"/>
         </w:rPr>
-        <w:t>Questions to the person and read-backs of what the assistant understood are shown word for word. We added that rule after the Docker run (section 5) showed the explainer rewording a confirmation question badly.</w:t>
+        <w:t>Questions to the parent, and read-backs of what the assistant understood, are always shown word for word. We added that rule after our Docker run (section 5) caught the explainer rewording a confirmation question badly.</w:t>
       </w:r>
     </w:p>
     <w:p>
@@ -4665,14 +3751,14 @@
           <w:b w:val="0"/>
           <w:i/>
         </w:rPr>
-        <w:t>Problem.</w:t>
+        <w:t>The problem.</w:t>
       </w:r>
       <w:r>
         <w:rPr>
           <w:b w:val="0"/>
           <w:i w:val="0"/>
         </w:rPr>
-        <w:t xml:space="preserve"> Parents write untidy requests ("kindly help me send ten thousand pounds for my son's tuition, last date end of November"). A rule-based reader gets 61.1% of intents right on our frozen hand-written messages.</w:t>
+        <w:t xml:space="preserve"> Parents write untidy requests, such as "kindly help me send ten thousand pounds for my son's tuition, last date end of November". Our rule-based reader understood only 61.1% of intents on our frozen hand-written messages.</w:t>
       </w:r>
     </w:p>
     <w:p>
@@ -4681,59 +3767,14 @@
           <w:b w:val="0"/>
           <w:i/>
         </w:rPr>
-        <w:t>Design.</w:t>
+        <w:t>What we built.</w:t>
       </w:r>
       <w:r>
         <w:rPr>
           <w:b w:val="0"/>
           <w:i w:val="0"/>
         </w:rPr>
-        <w:t xml:space="preserve"> A small fine-tuned model (</w:t>
-      </w:r>
-      <w:r>
-        <w:rPr>
-          <w:rFonts w:ascii="Consolas" w:hAnsi="Consolas"/>
-          <w:b w:val="0"/>
-          <w:i w:val="0"/>
-        </w:rPr>
-        <w:t>bge-small-en-v1.5</w:t>
-      </w:r>
-      <w:r>
-        <w:rPr>
-          <w:b w:val="0"/>
-          <w:i w:val="0"/>
-        </w:rPr>
-        <w:t xml:space="preserve"> [5], 33.8 MB as int8 ONNX) predicts one of 14 intents and marks the exact words that carry an amount, a currency, a date, a period, a charge code, a purpose or a provider. It only proposes. Plain code (</w:t>
-      </w:r>
-      <w:r>
-        <w:rPr>
-          <w:rFonts w:ascii="Consolas" w:hAnsi="Consolas"/>
-          <w:b w:val="0"/>
-          <w:i w:val="0"/>
-        </w:rPr>
-        <w:t>ai/nlu/normalize.py</w:t>
-      </w:r>
-      <w:r>
-        <w:rPr>
-          <w:b w:val="0"/>
-          <w:i w:val="0"/>
-        </w:rPr>
-        <w:t xml:space="preserve">) turns the marked words into typed values (integer minor units, a real date) and refuses anything it cannot read exactly. When the rules and the model read a field differently, the field is left empty and the assistant asks. The model's intent is used only at confidence of at least 0.8, and a confident </w:t>
-      </w:r>
-      <w:r>
-        <w:rPr>
-          <w:rFonts w:ascii="Consolas" w:hAnsi="Consolas"/>
-          <w:b w:val="0"/>
-          <w:i w:val="0"/>
-        </w:rPr>
-        <w:t>ATTACK</w:t>
-      </w:r>
-      <w:r>
-        <w:rPr>
-          <w:b w:val="0"/>
-          <w:i w:val="0"/>
-        </w:rPr>
-        <w:t xml:space="preserve"> can only add a block. Three intents (stress test, student costs, arrival guide) are decided by exact rules because the model never saw those questions. The model has no permission of its own.</w:t>
+        <w:t xml:space="preserve"> A small fine-tuned model (bge-small-en-v1.5 [5], 33.8 MB as int8 ONNX) that predicts one of 14 intents and marks the exact words that carry an amount, a currency, a date, a period, a charge code, a purpose or a provider. It only proposes. Plain code then turns the marked words into typed values (integer minor units, a real date) and refuses anything it cannot read exactly. When the rules and the model read a field differently, we leave the field empty and the assistant asks. We use the model's intent only when its confidence is at least 0.8, and a confident ATTACK can only add a block, never remove one. Three intents (stress test, student costs, arrival guide) are decided by exact rules, because the model never saw those questions in training. The model has no permissions of its own.</w:t>
       </w:r>
     </w:p>
     <w:p>
@@ -4742,44 +3783,14 @@
           <w:b w:val="0"/>
           <w:i/>
         </w:rPr>
-        <w:t>Training.</w:t>
+        <w:t>How we trained it.</w:t>
       </w:r>
       <w:r>
         <w:rPr>
           <w:b w:val="0"/>
           <w:i w:val="0"/>
         </w:rPr>
-        <w:t xml:space="preserve"> 35,588 messages, mostly generated from templates, plus real bank-customer questions (Banking77 [2], CC BY 4.0); 6 epochs on an RTX 5060 Ti in 238 seconds. Results come from </w:t>
-      </w:r>
-      <w:r>
-        <w:rPr>
-          <w:rFonts w:ascii="Consolas" w:hAnsi="Consolas"/>
-          <w:b w:val="0"/>
-          <w:i w:val="0"/>
-        </w:rPr>
-        <w:t>ml/evaluate.py</w:t>
-      </w:r>
-      <w:r>
-        <w:rPr>
-          <w:b w:val="0"/>
-          <w:i w:val="0"/>
-        </w:rPr>
-        <w:t xml:space="preserve"> (</w:t>
-      </w:r>
-      <w:r>
-        <w:rPr>
-          <w:rFonts w:ascii="Consolas" w:hAnsi="Consolas"/>
-          <w:b w:val="0"/>
-          <w:i w:val="0"/>
-        </w:rPr>
-        <w:t>submission/evidence/ai_evaluation.json</w:t>
-      </w:r>
-      <w:r>
-        <w:rPr>
-          <w:b w:val="0"/>
-          <w:i w:val="0"/>
-        </w:rPr>
-        <w:t>), on data the model never trained on:</w:t>
+        <w:t xml:space="preserve"> 35,588 messages, mostly generated from templates, plus real bank-customer questions (Banking77 [2], CC BY 4.0). Six epochs on an RTX 5060 Ti took 238 seconds. The results below come from our evaluation script (ai_evaluation.json), on data the model never trained on:</w:t>
       </w:r>
     </w:p>
     <w:tbl>
@@ -5190,7 +4201,7 @@
           <w:b w:val="0"/>
           <w:i w:val="0"/>
         </w:rPr>
-        <w:t>On the hand-written set the model also reads a plan request exactly 100% of the time against 57.6% for the rules; harmless messages blocked by mistake are 2.0% for both.</w:t>
+        <w:t>On the hand-written set the model also reads a plan request exactly right 100% of the time, against 57.6% for the rules; harmless messages blocked by mistake are 2.0% for both.</w:t>
       </w:r>
     </w:p>
     <w:p>
@@ -5206,22 +4217,7 @@
           <w:b w:val="0"/>
           <w:i w:val="0"/>
         </w:rPr>
-        <w:t xml:space="preserve"> The 113-message set is small (about plus or minus 7 points) and was reproduced several times, so it is not a fresh blind study. The training and generated test data are mostly synthetic. No real parent's messages were used. About one attack in fourteen still gets through the model to a harmless answer. On CPU the reader takes a median of 18 ms and a 95th percentile of 57 ms per message in the last evaluation run. With no model file, a failed integrity check or </w:t>
-      </w:r>
-      <w:r>
-        <w:rPr>
-          <w:rFonts w:ascii="Consolas" w:hAnsi="Consolas"/>
-          <w:b w:val="0"/>
-          <w:i w:val="0"/>
-        </w:rPr>
-        <w:t>NLU_MODE=off</w:t>
-      </w:r>
-      <w:r>
-        <w:rPr>
-          <w:b w:val="0"/>
-          <w:i w:val="0"/>
-        </w:rPr>
-        <w:t>, the assistant runs on the rules alone.</w:t>
+        <w:t xml:space="preserve"> The 113-message set is small (about plus or minus 7 points), and because we reproduced it several times it is no longer a fresh blind test. The training and generated test data are mostly synthetic, and no real parent's messages were used. About one attack in fourteen still gets past the model and receives a harmless answer. On a CPU the reader takes a median of 18 ms and a 95th percentile of 57 ms per message in our last evaluation run. If the model file is missing, fails its integrity check or is switched off (NLU_MODE=off), the assistant runs on the rules alone.</w:t>
       </w:r>
     </w:p>
     <w:p>
@@ -5238,14 +4234,14 @@
           <w:b w:val="0"/>
           <w:i/>
         </w:rPr>
-        <w:t>Problem.</w:t>
+        <w:t>The problem.</w:t>
       </w:r>
       <w:r>
         <w:rPr>
           <w:b w:val="0"/>
           <w:i w:val="0"/>
         </w:rPr>
-        <w:t xml:space="preserve"> When a message starts a payment plan, should the assistant plan at once, ask for a missing amount, date or period, or read the values back for a yes? Planning at once is fast but sometimes wrong; asking every time is safe but tiresome.</w:t>
+        <w:t xml:space="preserve"> When a message starts a payment plan, should the assistant plan straight away, ask for a missing amount, date or period, or read the values back and wait for a yes? Planning at once is fast but sometimes wrong; asking every time is safe but tiring.</w:t>
       </w:r>
     </w:p>
     <w:p>
@@ -5254,29 +4250,14 @@
           <w:b w:val="0"/>
           <w:i/>
         </w:rPr>
-        <w:t>Design.</w:t>
+        <w:t>What we built.</w:t>
       </w:r>
       <w:r>
         <w:rPr>
           <w:b w:val="0"/>
           <w:i w:val="0"/>
         </w:rPr>
-        <w:t xml:space="preserve"> A 30 → 64 → 64 → 5 network, trained with Double DQN [3] against a simulated parent whose sentences were run through the real reader, so the noise it learns from is the system's own. The state is how each value was read, how sure the model was, whether a second amount was mentioned, and the turn count. Rewards: +1 for a correct plan, +0.5 for a correct deadline or period, -2 for a wrong amount, -1 for a wrong deadline or period, -0.05 per question, -0.5 if the parent gives up. The network never decides what is allowed: </w:t>
-      </w:r>
-      <w:r>
-        <w:rPr>
-          <w:rFonts w:ascii="Consolas" w:hAnsi="Consolas"/>
-          <w:b w:val="0"/>
-          <w:i w:val="0"/>
-        </w:rPr>
-        <w:t>ai/dialogue/state.py</w:t>
-      </w:r>
-      <w:r>
-        <w:rPr>
-          <w:b w:val="0"/>
-          <w:i w:val="0"/>
-        </w:rPr>
-        <w:t xml:space="preserve"> computes the legal actions in plain code and the network only ranks those. None of the five actions moves money.</w:t>
+        <w:t xml:space="preserve"> A 30 → 64 → 64 → 5 network trained with Double DQN [3] against a simulated parent whose sentences were run through the real reader, so the noise it learns from is the system's own. The state describes how each value was read, how sure the model was, whether a second amount was mentioned, and how many turns have passed. Rewards: +1 for a correct plan, +0.5 for a correct deadline or period, -2 for a wrong amount, -1 for a wrong deadline or period, -0.05 per question, and -0.5 if the parent gives up. The network never decides what is allowed: plain code works out the legal actions and the network only ranks them. None of its five actions moves money.</w:t>
       </w:r>
     </w:p>
     <w:p>
@@ -5292,22 +4273,7 @@
           <w:b w:val="0"/>
           <w:i w:val="0"/>
         </w:rPr>
-        <w:t xml:space="preserve"> (6,000 simulated conversations per policy; </w:t>
-      </w:r>
-      <w:r>
-        <w:rPr>
-          <w:rFonts w:ascii="Consolas" w:hAnsi="Consolas"/>
-          <w:b w:val="0"/>
-          <w:i w:val="0"/>
-        </w:rPr>
-        <w:t>ai_rl_evaluation.json</w:t>
-      </w:r>
-      <w:r>
-        <w:rPr>
-          <w:b w:val="0"/>
-          <w:i w:val="0"/>
-        </w:rPr>
-        <w:t>):</w:t>
+        <w:t xml:space="preserve"> (6,000 simulated conversations per policy; ai_rl_evaluation.json):</w:t>
       </w:r>
     </w:p>
     <w:tbl>
@@ -5656,22 +4622,7 @@
           <w:b w:val="0"/>
           <w:i w:val="0"/>
         </w:rPr>
-        <w:t xml:space="preserve">The policy matches the best hand-written rule's return with about 40% fewer questions, at the price of 0.8% wrong plans in simulation. Whether that trade is right is a product decision, not a result. The simulated parents and rewards are our assumptions, the policy has never met a real person, and under a harsher wrong-amount penalty it did not quite match "always confirm". The API therefore adds a mandatory read-back envelope that the policy cannot override. </w:t>
-      </w:r>
-      <w:r>
-        <w:rPr>
-          <w:rFonts w:ascii="Consolas" w:hAnsi="Consolas"/>
-          <w:b w:val="0"/>
-          <w:i w:val="0"/>
-        </w:rPr>
-        <w:t>DIALOGUE_MODE=off</w:t>
-      </w:r>
-      <w:r>
-        <w:rPr>
-          <w:b w:val="0"/>
-          <w:i w:val="0"/>
-        </w:rPr>
-        <w:t xml:space="preserve"> plans as soon as the amount is known.</w:t>
+        <w:t>The trained policy matches the best hand-written rule's return with about 40% fewer questions, at the price of 0.8% wrong plans in simulation. Whether that trade is worth it is a product decision, not a result. The simulated parents and the rewards are our own assumptions, the policy has never met a real person, and under a harsher penalty for a wrong amount it did not quite match "always confirm". That is why the API wraps it in a mandatory read-back that the policy cannot override. With DIALOGUE_MODE=off, the assistant plans as soon as the amount is known.</w:t>
       </w:r>
     </w:p>
     <w:p>
@@ -5688,7 +4639,7 @@
           <w:b w:val="0"/>
           <w:i/>
         </w:rPr>
-        <w:t>Problem.</w:t>
+        <w:t>The problem.</w:t>
       </w:r>
       <w:r>
         <w:rPr>
@@ -5704,44 +4655,14 @@
           <w:b w:val="0"/>
           <w:i/>
         </w:rPr>
-        <w:t>Design: verified distillation.</w:t>
+        <w:t>What we built: verified distillation.</w:t>
       </w:r>
       <w:r>
         <w:rPr>
           <w:b w:val="0"/>
           <w:i w:val="0"/>
         </w:rPr>
-        <w:t xml:space="preserve"> A larger open model (Qwen2.5-1.5B-Instruct [6]) proposed rewrites for 6,000 training drafts. A code check, </w:t>
-      </w:r>
-      <w:r>
-        <w:rPr>
-          <w:rFonts w:ascii="Consolas" w:hAnsi="Consolas"/>
-          <w:b w:val="0"/>
-          <w:i w:val="0"/>
-        </w:rPr>
-        <w:t>check_rewrite</w:t>
-      </w:r>
-      <w:r>
-        <w:rPr>
-          <w:b w:val="0"/>
-          <w:i w:val="0"/>
-        </w:rPr>
-        <w:t>, kept only faithful ones: no new figure, most figures kept, the disclaimer and any refusal kept, no action or legal claim, "(synthetic)" kept. More than half of the raw teacher output failed (7,785 of 18,000 proposals passed, 43.3%), which is why the student never sees a raw proposal. A small student (</w:t>
-      </w:r>
-      <w:r>
-        <w:rPr>
-          <w:rFonts w:ascii="Consolas" w:hAnsi="Consolas"/>
-          <w:b w:val="0"/>
-          <w:i w:val="0"/>
-        </w:rPr>
-        <w:t>flan-t5-small</w:t>
-      </w:r>
-      <w:r>
-        <w:rPr>
-          <w:b w:val="0"/>
-          <w:i w:val="0"/>
-        </w:rPr>
-        <w:t xml:space="preserve"> [7], 77M parameters) was fine-tuned on the verified rewrites in 12 minutes. The vocabulary was pruned from 32,000 to 5,124 pieces and the model exported to int8 ONNX (53 MB). At run time every rewrite is checked again; a failing rewrite is thrown away and the engine's own text is shown.</w:t>
+        <w:t xml:space="preserve"> A larger open model (Qwen2.5-1.5B-Instruct [6]) proposed rewrites for 6,000 training drafts. A code check kept only the faithful ones: no new figure, most figures kept, the disclaimer and any refusal kept, no action or legal claim, and "(synthetic)" kept. More than half of the raw teacher output failed (7,785 of 18,000 proposals passed, 43.3%), which is exactly why our student model never learns from a raw proposal. The student (flan-t5-small [7], 77M parameters) was fine-tuned on the verified rewrites in 12 minutes. We pruned its vocabulary from 32,000 to 5,124 pieces and exported it to int8 ONNX (53 MB). At run time every rewrite is checked again; if it fails, we throw it away and show the engine's own text.</w:t>
       </w:r>
     </w:p>
     <w:p>
@@ -5757,22 +4678,7 @@
           <w:b w:val="0"/>
           <w:i w:val="0"/>
         </w:rPr>
-        <w:t xml:space="preserve"> (</w:t>
-      </w:r>
-      <w:r>
-        <w:rPr>
-          <w:rFonts w:ascii="Consolas" w:hAnsi="Consolas"/>
-          <w:b w:val="0"/>
-          <w:i w:val="0"/>
-        </w:rPr>
-        <w:t>ai_explainer_evaluation.json</w:t>
-      </w:r>
-      <w:r>
-        <w:rPr>
-          <w:b w:val="0"/>
-          <w:i w:val="0"/>
-        </w:rPr>
-        <w:t>):</w:t>
+        <w:t xml:space="preserve"> (ai_explainer_evaluation.json):</w:t>
       </w:r>
     </w:p>
     <w:tbl>
@@ -6101,7 +5007,7 @@
           <w:b w:val="0"/>
           <w:i w:val="0"/>
         </w:rPr>
-        <w:t xml:space="preserve"> It mostly paraphrases: about half of its accepted answers equal the draft. It cannot finish long structured answers (stress tests 0% shown, arrival guides 21%), so drafts over 120 words skip the model. The checks look at figures, disclaimers and claims, not at style, so it can word an answer clumsily. It was trained and tested on synthetic questions. Its value is that the safe path costs nothing: the engine's answer is always one failed check away.</w:t>
+        <w:t xml:space="preserve"> It mostly paraphrases: about half of its accepted answers are the draft itself. It cannot finish long structured answers (stress tests 0% shown, arrival guides 21%), so drafts over 120 words skip the model. The checks look at figures, disclaimers and claims, not at style, so it can still word an answer clumsily. It was trained and tested on synthetic questions. Its real value is that the safe path costs nothing: the engine's own answer is always one failed check away.</w:t>
       </w:r>
     </w:p>
     <w:p>
@@ -6118,7 +5024,7 @@
           <w:b w:val="0"/>
           <w:i/>
         </w:rPr>
-        <w:t>Problem.</w:t>
+        <w:t>The problem.</w:t>
       </w:r>
       <w:r>
         <w:rPr>
@@ -6134,14 +5040,14 @@
           <w:b w:val="0"/>
           <w:i/>
         </w:rPr>
-        <w:t>Data.</w:t>
+        <w:t>The data.</w:t>
       </w:r>
       <w:r>
         <w:rPr>
           <w:b w:val="0"/>
           <w:i w:val="0"/>
         </w:rPr>
-        <w:t xml:space="preserve"> IBM's public synthetic anti-money-laundering transactions [1] (HI-Small: 5,078,345 transactions, 5,177 labelled by the generator; CDLA-Sharing-1.0). The split is by time: the first 60% trains, the next 20% tunes, the last 20% (1,015,564 transactions, 1,797 flagged) is the test. Every count of "earlier payments" uses only earlier rows.</w:t>
+        <w:t xml:space="preserve"> IBM's public synthetic anti-money-laundering transactions [1] (HI-Small: 5,078,345 transactions, 5,177 labelled by the generator; CDLA-Sharing-1.0). We split it by time: the first 60% trains, the next 20% tunes, and the last 20% (1,015,564 transactions, 1,797 flagged) is the test. Every count of "earlier payments" uses only earlier rows.</w:t>
       </w:r>
     </w:p>
     <w:p>
@@ -6150,14 +5056,14 @@
           <w:b w:val="0"/>
           <w:i/>
         </w:rPr>
-        <w:t>Design.</w:t>
+        <w:t>What we built.</w:t>
       </w:r>
       <w:r>
         <w:rPr>
           <w:b w:val="0"/>
           <w:i w:val="0"/>
         </w:rPr>
-        <w:t xml:space="preserve"> A small network on eight inputs in four factors: </w:t>
+        <w:t xml:space="preserve"> A small network on eight inputs grouped into four factors: </w:t>
       </w:r>
       <w:r>
         <w:rPr>
@@ -6213,82 +5119,7 @@
           <w:b w:val="0"/>
           <w:i w:val="0"/>
         </w:rPr>
-        <w:t xml:space="preserve"> (whether this household has paid this receiver before). Bands come from cut-offs set on the tuning period only: </w:t>
-      </w:r>
-      <w:r>
-        <w:rPr>
-          <w:rFonts w:ascii="Consolas" w:hAnsi="Consolas"/>
-          <w:b w:val="0"/>
-          <w:i w:val="0"/>
-        </w:rPr>
-        <w:t>HIGH</w:t>
-      </w:r>
-      <w:r>
-        <w:rPr>
-          <w:b w:val="0"/>
-          <w:i w:val="0"/>
-        </w:rPr>
-        <w:t xml:space="preserve"> is the top 0.1% of scores and </w:t>
-      </w:r>
-      <w:r>
-        <w:rPr>
-          <w:rFonts w:ascii="Consolas" w:hAnsi="Consolas"/>
-          <w:b w:val="0"/>
-          <w:i w:val="0"/>
-        </w:rPr>
-        <w:t>MEDIUM</w:t>
-      </w:r>
-      <w:r>
-        <w:rPr>
-          <w:b w:val="0"/>
-          <w:i w:val="0"/>
-        </w:rPr>
-        <w:t xml:space="preserve"> the next 0.4%. For each payment the model hides each group of inputs in turn to show which factors drove the score. A </w:t>
-      </w:r>
-      <w:r>
-        <w:rPr>
-          <w:rFonts w:ascii="Consolas" w:hAnsi="Consolas"/>
-          <w:b w:val="0"/>
-          <w:i w:val="0"/>
-        </w:rPr>
-        <w:t>MEDIUM</w:t>
-      </w:r>
-      <w:r>
-        <w:rPr>
-          <w:b w:val="0"/>
-          <w:i w:val="0"/>
-        </w:rPr>
-        <w:t xml:space="preserve"> or </w:t>
-      </w:r>
-      <w:r>
-        <w:rPr>
-          <w:rFonts w:ascii="Consolas" w:hAnsi="Consolas"/>
-          <w:b w:val="0"/>
-          <w:i w:val="0"/>
-        </w:rPr>
-        <w:t>HIGH</w:t>
-      </w:r>
-      <w:r>
-        <w:rPr>
-          <w:b w:val="0"/>
-          <w:i w:val="0"/>
-        </w:rPr>
-        <w:t xml:space="preserve"> rating opens a bank review; </w:t>
-      </w:r>
-      <w:r>
-        <w:rPr>
-          <w:rFonts w:ascii="Consolas" w:hAnsi="Consolas"/>
-          <w:b w:val="0"/>
-          <w:i w:val="0"/>
-        </w:rPr>
-        <w:t>LOW</w:t>
-      </w:r>
-      <w:r>
-        <w:rPr>
-          <w:b w:val="0"/>
-          <w:i w:val="0"/>
-        </w:rPr>
-        <w:t xml:space="preserve"> takes the fast lane. The model never clears, declines or approves anything, and every payment still needs the parent's MFA authorisation.</w:t>
+        <w:t xml:space="preserve"> (whether this household has paid this receiver before). The risk bands come from cut-offs set on the tuning period only: HIGH is the top 0.1% of scores and MEDIUM the next 0.4%. For each payment, the model hides each group of inputs in turn to show which factors drove the score. A MEDIUM or HIGH rating opens a bank review; LOW takes the fast lane. The model never clears, declines or approves anything, and every payment still needs the parent's MFA authorisation.</w:t>
       </w:r>
     </w:p>
     <w:p>
@@ -6304,22 +5135,7 @@
           <w:b w:val="0"/>
           <w:i w:val="0"/>
         </w:rPr>
-        <w:t xml:space="preserve"> The first version also saw the payment channel, the currencies and the hour, and scored higher. Counting labels per channel (</w:t>
-      </w:r>
-      <w:r>
-        <w:rPr>
-          <w:rFonts w:ascii="Consolas" w:hAnsi="Consolas"/>
-          <w:b w:val="0"/>
-          <w:i w:val="0"/>
-        </w:rPr>
-        <w:t>ml/aml/ablate.py</w:t>
-      </w:r>
-      <w:r>
-        <w:rPr>
-          <w:b w:val="0"/>
-          <w:i w:val="0"/>
-        </w:rPr>
-        <w:t>) showed that in this data no wire and no cross-currency transfer is ever labelled as laundering. A model with those inputs would learn that a cross-currency wire, which is what every StudyRoute payment is, is the safest thing there is. That is a habit of the generator, not a fact about money, so those inputs were removed; dropping the channel inputs cost nothing in average precision (0.449 without, 0.412 with, first pass).</w:t>
+        <w:t xml:space="preserve"> Our first version also used the payment channel, the currencies and the hour, and it scored higher. When we counted labels per channel, we found that in this data no wire and no cross-currency transfer is ever labelled as laundering. A model with those inputs would learn that a cross-currency wire, which is exactly what every StudyRoute payment is, is the safest thing there is. That is a habit of the data generator, not a fact about money, so we removed those inputs. Dropping the channel inputs cost nothing in average precision (0.449 without, 0.412 with, first pass).</w:t>
       </w:r>
     </w:p>
     <w:p>
@@ -6335,37 +5151,7 @@
           <w:b w:val="0"/>
           <w:i w:val="0"/>
         </w:rPr>
-        <w:t xml:space="preserve"> (1,015,564 transactions, 1,797 of them flagged; </w:t>
-      </w:r>
-      <w:r>
-        <w:rPr>
-          <w:rFonts w:ascii="Consolas" w:hAnsi="Consolas"/>
-          <w:b w:val="0"/>
-          <w:i w:val="0"/>
-        </w:rPr>
-        <w:t>ai_risk_training.json</w:t>
-      </w:r>
-      <w:r>
-        <w:rPr>
-          <w:b w:val="0"/>
-          <w:i w:val="0"/>
-        </w:rPr>
-        <w:t xml:space="preserve"> and </w:t>
-      </w:r>
-      <w:r>
-        <w:rPr>
-          <w:rFonts w:ascii="Consolas" w:hAnsi="Consolas"/>
-          <w:b w:val="0"/>
-          <w:i w:val="0"/>
-        </w:rPr>
-        <w:t>ai_risk_operating_points.json</w:t>
-      </w:r>
-      <w:r>
-        <w:rPr>
-          <w:b w:val="0"/>
-          <w:i w:val="0"/>
-        </w:rPr>
-        <w:t>).</w:t>
+        <w:t xml:space="preserve"> (1,015,564 transactions, 1,797 of them flagged; ai_risk_training.json and ai_risk_operating_points.json).</w:t>
       </w:r>
     </w:p>
     <w:p>
@@ -6568,7 +5354,7 @@
           <w:b w:val="0"/>
           <w:i w:val="0"/>
         </w:rPr>
-        <w:t xml:space="preserve"> The desk sends a payment to a person when its band is medium or high. Accuracy is the share of all payments handled correctly (a flagged one sent to a person, an unflagged one left alone).</w:t>
+        <w:t xml:space="preserve"> The desk sends a payment to a person when its band is medium or high. Accuracy here is the share of all payments handled correctly: a flagged one sent to a person, or an unflagged one left alone.</w:t>
       </w:r>
     </w:p>
     <w:tbl>
@@ -6997,7 +5783,7 @@
           <w:b w:val="0"/>
           <w:i w:val="0"/>
         </w:rPr>
-        <w:t>99.82% of the payments are not flagged, so never sending anything to a person is already 99.82% accurate: accuracy alone cannot tell this router from no router, the ordering table can. Precision and recall cannot both exceed 90% on this data at any threshold; we did not change the evaluation set or threshold to get a bigger number.</w:t>
+        <w:t>Because 99.82% of the payments are not flagged, a router that never sends anything to a person is already 99.82% accurate. Accuracy alone therefore cannot tell our router from no router at all; the ordering table can. Precision and recall cannot both exceed 90% on this data at any threshold, and we did not change the evaluation set or the threshold to get a bigger number.</w:t>
       </w:r>
     </w:p>
     <w:p>
@@ -7013,22 +5799,7 @@
           <w:b w:val="0"/>
           <w:i w:val="0"/>
         </w:rPr>
-        <w:t xml:space="preserve"> (</w:t>
-      </w:r>
-      <w:r>
-        <w:rPr>
-          <w:rFonts w:ascii="Consolas" w:hAnsi="Consolas"/>
-          <w:b w:val="0"/>
-          <w:i w:val="0"/>
-        </w:rPr>
-        <w:t>docs/AI_RISK_MODELS.md</w:t>
-      </w:r>
-      <w:r>
-        <w:rPr>
-          <w:b w:val="0"/>
-          <w:i w:val="0"/>
-        </w:rPr>
-        <w:t>; 24 configurations: ten learned models and four rule or random baselines, on the eight shipped inputs or thirteen):</w:t>
+        <w:t xml:space="preserve"> (AI_RISK_MODELS.md in the docs folder; 24 configurations: ten learned models and four rule or random baselines, on the eight shipped inputs or thirteen):</w:t>
       </w:r>
     </w:p>
     <w:tbl>
@@ -7441,16 +6212,7 @@
           <w:b w:val="0"/>
           <w:i w:val="0"/>
         </w:rPr>
-        <w:t>A reviewer may reasonably ask why the better-ranked 13-input variants were not shipped. The answer is time and re-testing cost, not concealment: five more runtime inputs and a bank-review re-test were not completed before the freeze, and we chose to publish the comparison rather than omit it. Adopting them is the first improvement on our list.</w:t>
-      </w:r>
-    </w:p>
-    <w:p>
-      <w:r>
-        <w:rPr>
-          <w:b w:val="0"/>
-          <w:i w:val="0"/>
-        </w:rPr>
-        <w:t>By our own rule (choose on the tuning period only) XGBoost on thirteen inputs ranks first, yet on the test period it is no better than the shipped network within noise (0.448 against 0.437); neighbouring models differ by about 0.02 average precision, which is within noise with 1,797 flagged transactions. The thirteen-input variants score higher than the shipped network on both periods. We did not adopt them before submission: they need five more inputs computed from payment history at run time, and the review desk would have needed re-testing. It is the first improvement on our list.</w:t>
+        <w:t>By our own rule (choose on the tuning period only), XGBoost on thirteen inputs comes first, yet on the test period it is no better than the network we shipped, within noise (0.448 against 0.437); neighbouring models differ by about 0.02 average precision, which is within noise with 1,797 flagged transactions. The thirteen-input variants do score higher than our shipped network on both periods, so why did we not ship one? Honestly, time. They need five more inputs computed from payment history at run time, and the review desk would have needed re-testing, which we could not finish before the freeze. We chose to publish the comparison rather than leave it out, and adopting them is first on our list of improvements.</w:t>
       </w:r>
     </w:p>
     <w:p>
@@ -7467,142 +6229,7 @@
           <w:b w:val="0"/>
           <w:i w:val="0"/>
         </w:rPr>
-        <w:t xml:space="preserve">When approval is requested, a </w:t>
-      </w:r>
-      <w:r>
-        <w:rPr>
-          <w:rFonts w:ascii="Consolas" w:hAnsi="Consolas"/>
-          <w:b w:val="0"/>
-          <w:i w:val="0"/>
-        </w:rPr>
-        <w:t>MEDIUM</w:t>
-      </w:r>
-      <w:r>
-        <w:rPr>
-          <w:b w:val="0"/>
-          <w:i w:val="0"/>
-        </w:rPr>
-        <w:t xml:space="preserve"> or </w:t>
-      </w:r>
-      <w:r>
-        <w:rPr>
-          <w:rFonts w:ascii="Consolas" w:hAnsi="Consolas"/>
-          <w:b w:val="0"/>
-          <w:i w:val="0"/>
-        </w:rPr>
-        <w:t>HIGH</w:t>
-      </w:r>
-      <w:r>
-        <w:rPr>
-          <w:b w:val="0"/>
-          <w:i w:val="0"/>
-        </w:rPr>
-        <w:t xml:space="preserve"> rating (or a sandbox name-list match) opens a </w:t>
-      </w:r>
-      <w:r>
-        <w:rPr>
-          <w:rFonts w:ascii="Consolas" w:hAnsi="Consolas"/>
-          <w:b w:val="0"/>
-          <w:i w:val="0"/>
-        </w:rPr>
-        <w:t>bank_reviews</w:t>
-      </w:r>
-      <w:r>
-        <w:rPr>
-          <w:b w:val="0"/>
-          <w:i w:val="0"/>
-        </w:rPr>
-        <w:t xml:space="preserve"> row with a target time, the signals and the model's reading, and writes one audit event. The approval guard then refuses </w:t>
-      </w:r>
-      <w:r>
-        <w:rPr>
-          <w:rFonts w:ascii="Consolas" w:hAnsi="Consolas"/>
-          <w:b w:val="0"/>
-          <w:i w:val="0"/>
-        </w:rPr>
-        <w:t>BANK_REVIEW_PENDING</w:t>
-      </w:r>
-      <w:r>
-        <w:rPr>
-          <w:b w:val="0"/>
-          <w:i w:val="0"/>
-        </w:rPr>
-        <w:t xml:space="preserve"> until a reviewer answers. The reviewer, an admin user, answers </w:t>
-      </w:r>
-      <w:r>
-        <w:rPr>
-          <w:rFonts w:ascii="Consolas" w:hAnsi="Consolas"/>
-          <w:b w:val="0"/>
-          <w:i w:val="0"/>
-        </w:rPr>
-        <w:t>CLEAR</w:t>
-      </w:r>
-      <w:r>
-        <w:rPr>
-          <w:b w:val="0"/>
-          <w:i w:val="0"/>
-        </w:rPr>
-        <w:t xml:space="preserve">, </w:t>
-      </w:r>
-      <w:r>
-        <w:rPr>
-          <w:rFonts w:ascii="Consolas" w:hAnsi="Consolas"/>
-          <w:b w:val="0"/>
-          <w:i w:val="0"/>
-        </w:rPr>
-        <w:t>ASK_INFO</w:t>
-      </w:r>
-      <w:r>
-        <w:rPr>
-          <w:b w:val="0"/>
-          <w:i w:val="0"/>
-        </w:rPr>
-        <w:t xml:space="preserve"> or </w:t>
-      </w:r>
-      <w:r>
-        <w:rPr>
-          <w:rFonts w:ascii="Consolas" w:hAnsi="Consolas"/>
-          <w:b w:val="0"/>
-          <w:i w:val="0"/>
-        </w:rPr>
-        <w:t>DECLINE</w:t>
-      </w:r>
-      <w:r>
-        <w:rPr>
-          <w:b w:val="0"/>
-          <w:i w:val="0"/>
-        </w:rPr>
-        <w:t xml:space="preserve"> with a single-use MFA proof under the scope </w:t>
-      </w:r>
-      <w:r>
-        <w:rPr>
-          <w:rFonts w:ascii="Consolas" w:hAnsi="Consolas"/>
-          <w:b w:val="0"/>
-          <w:i w:val="0"/>
-        </w:rPr>
-        <w:t>review_payment</w:t>
-      </w:r>
-      <w:r>
-        <w:rPr>
-          <w:b w:val="0"/>
-          <w:i w:val="0"/>
-        </w:rPr>
-        <w:t xml:space="preserve">. A decline calls the existing rejection, so the state machine is unchanged. The parent's short reply is stored sealed with the field cipher. A clock (on time, due soon, overdue) and a reminder with a cool-down make slow reviews visible. Plain rules (a large amount, several payments that add up to one, a new receiver, no fee demand note) are context for the reviewer and decide only when the model is not loaded. See </w:t>
-      </w:r>
-      <w:r>
-        <w:rPr>
-          <w:rFonts w:ascii="Consolas" w:hAnsi="Consolas"/>
-          <w:b w:val="0"/>
-          <w:i w:val="0"/>
-        </w:rPr>
-        <w:t>docs/BANK_REVIEW.md</w:t>
-      </w:r>
-      <w:r>
-        <w:rPr>
-          <w:b w:val="0"/>
-          <w:i w:val="0"/>
-        </w:rPr>
-        <w:t>.</w:t>
+        <w:t>When a parent requests approval, a MEDIUM or HIGH rating (or a match on the sandbox name list) opens a bank review with a target time, the signals and the model's reading, and writes one audit event. The approval guard then refuses with BANK_REVIEW_PENDING until a reviewer answers. The reviewer, an admin user, answers CLEAR, ASK_INFO or DECLINE with a single-use MFA proof under the scope review_payment. A decline calls the existing rejection, so the state machine itself does not change. The parent's short reply is stored sealed with the field cipher. A clock (on time, due soon, overdue) and a reminder with a cool-down make slow reviews visible. Plain rules (a large amount, several payments that add up to one, a new receiver, no fee demand note) give the reviewer context, and they decide on their own only when the model is not loaded. BANK_REVIEW.md in the docs folder has the details.</w:t>
       </w:r>
     </w:p>
     <w:p>
@@ -7619,37 +6246,7 @@
           <w:b w:val="0"/>
           <w:i w:val="0"/>
         </w:rPr>
-        <w:t xml:space="preserve">The full threat and control matrix, with the test that proves each row, is in </w:t>
-      </w:r>
-      <w:r>
-        <w:rPr>
-          <w:rFonts w:ascii="Consolas" w:hAnsi="Consolas"/>
-          <w:b w:val="0"/>
-          <w:i w:val="0"/>
-        </w:rPr>
-        <w:t>docs/SECURITY.md</w:t>
-      </w:r>
-      <w:r>
-        <w:rPr>
-          <w:b w:val="0"/>
-          <w:i w:val="0"/>
-        </w:rPr>
-        <w:t xml:space="preserve">. The permission tiers and the 55 known risks are in </w:t>
-      </w:r>
-      <w:r>
-        <w:rPr>
-          <w:rFonts w:ascii="Consolas" w:hAnsi="Consolas"/>
-          <w:b w:val="0"/>
-          <w:i w:val="0"/>
-        </w:rPr>
-        <w:t>docs/SECURITY_SELF_ASSESSMENT.md</w:t>
-      </w:r>
-      <w:r>
-        <w:rPr>
-          <w:b w:val="0"/>
-          <w:i w:val="0"/>
-        </w:rPr>
-        <w:t>.</w:t>
+        <w:t>The full threat and control matrix, with the test that proves each row, is in SECURITY.md in the docs folder. The permission tiers and our 55 known risks are in SECURITY_SELF_ASSESSMENT.md.</w:t>
       </w:r>
     </w:p>
     <w:p>
@@ -7666,52 +6263,7 @@
           <w:b w:val="0"/>
           <w:i w:val="0"/>
         </w:rPr>
-        <w:t xml:space="preserve">Passwords use Argon2id with the OWASP minimum parameters. Access tokens are ES256 JWTs valid for 15 minutes. The programmatic API issues rotating refresh tokens with reuse detection. The browser uses a separate path: an opaque </w:t>
-      </w:r>
-      <w:r>
-        <w:rPr>
-          <w:rFonts w:ascii="Consolas" w:hAnsi="Consolas"/>
-          <w:b w:val="0"/>
-          <w:i w:val="0"/>
-        </w:rPr>
-        <w:t>HttpOnly</w:t>
-      </w:r>
-      <w:r>
-        <w:rPr>
-          <w:b w:val="0"/>
-          <w:i w:val="0"/>
-        </w:rPr>
-        <w:t xml:space="preserve">, </w:t>
-      </w:r>
-      <w:r>
-        <w:rPr>
-          <w:rFonts w:ascii="Consolas" w:hAnsi="Consolas"/>
-          <w:b w:val="0"/>
-          <w:i w:val="0"/>
-        </w:rPr>
-        <w:t>SameSite=Strict</w:t>
-      </w:r>
-      <w:r>
-        <w:rPr>
-          <w:b w:val="0"/>
-          <w:i w:val="0"/>
-        </w:rPr>
-        <w:t xml:space="preserve"> cookie session, stored server-side as a hash and bound to the access token. Browser authentication endpoints require an exact trusted </w:t>
-      </w:r>
-      <w:r>
-        <w:rPr>
-          <w:rFonts w:ascii="Consolas" w:hAnsi="Consolas"/>
-          <w:b w:val="0"/>
-          <w:i w:val="0"/>
-        </w:rPr>
-        <w:t>Origin</w:t>
-      </w:r>
-      <w:r>
-        <w:rPr>
-          <w:b w:val="0"/>
-          <w:i w:val="0"/>
-        </w:rPr>
-        <w:t xml:space="preserve"> and a custom header, so a cookie alone is never API authority. The access token lives only in page memory. Repeated failures lock the account with the same answer for unknown users, so e-mail addresses cannot be discovered by trying to lock them.</w:t>
+        <w:t>Passwords are hashed with Argon2id at the OWASP minimum parameters. Access tokens are ES256 JWTs that last 15 minutes. The programmatic API issues rotating refresh tokens with reuse detection. The browser takes a separate path: an opaque HttpOnly, SameSite=Strict cookie session, stored on the server as a hash and bound to the access token. Browser sign-in endpoints insist on an exact trusted Origin and a custom header, so a cookie on its own never carries API authority. The access token lives only in page memory. Repeated failures lock the account, and unknown users get exactly the same answer, so nobody can discover e-mail addresses by trying to lock them.</w:t>
       </w:r>
     </w:p>
     <w:p>
@@ -7728,52 +6280,7 @@
           <w:b w:val="0"/>
           <w:i w:val="0"/>
         </w:rPr>
-        <w:t xml:space="preserve">Effective authorisation needs the role's permission, a matching scope in the token, and ownership of the object; a request for another household's object gets </w:t>
-      </w:r>
-      <w:r>
-        <w:rPr>
-          <w:rFonts w:ascii="Consolas" w:hAnsi="Consolas"/>
-          <w:b w:val="0"/>
-          <w:i w:val="0"/>
-        </w:rPr>
-        <w:t>404</w:t>
-      </w:r>
-      <w:r>
-        <w:rPr>
-          <w:b w:val="0"/>
-          <w:i w:val="0"/>
-        </w:rPr>
-        <w:t>. The AI service account has no approve, cancel, reject, allowlist, limit or configuration permission, and tests check both the permission table and the AI account's refusals (</w:t>
-      </w:r>
-      <w:r>
-        <w:rPr>
-          <w:rFonts w:ascii="Consolas" w:hAnsi="Consolas"/>
-          <w:b w:val="0"/>
-          <w:i w:val="0"/>
-        </w:rPr>
-        <w:t>test_rbac.py</w:t>
-      </w:r>
-      <w:r>
-        <w:rPr>
-          <w:b w:val="0"/>
-          <w:i w:val="0"/>
-        </w:rPr>
-        <w:t xml:space="preserve">, </w:t>
-      </w:r>
-      <w:r>
-        <w:rPr>
-          <w:rFonts w:ascii="Consolas" w:hAnsi="Consolas"/>
-          <w:b w:val="0"/>
-          <w:i w:val="0"/>
-        </w:rPr>
-        <w:t>test_api_ai_rbac.py</w:t>
-      </w:r>
-      <w:r>
-        <w:rPr>
-          <w:b w:val="0"/>
-          <w:i w:val="0"/>
-        </w:rPr>
-        <w:t>).</w:t>
+        <w:t>To do anything, a user needs the role's permission, a matching scope in the token, and ownership of the object; asking for another household's object returns 404. The AI service account has no approve, cancel, reject, allowlist, limit or configuration permission, and our tests check both the permission table and the AI account's refusals (test_rbac.py and test_api_ai_rbac.py).</w:t>
       </w:r>
     </w:p>
     <w:p>
@@ -7833,7 +6340,7 @@
           <w:b w:val="0"/>
           <w:i w:val="0"/>
         </w:rPr>
-        <w:t xml:space="preserve"> A fresh proof is required to approve a payment, allowlist a recipient, confirm an escrow, make a bank transfer and answer a bank review. It is valid 5 minutes, single use, and bound to the user, the scope and the object id, so a proof for one payment cannot approve another. TOTP (RFC 6238 [4]) works in every mode; sandbox mode also accepts a documented fixed code so judges need no authenticator app. That fixed code is a sandbox shortcut, not production-strength verification.</w:t>
+        <w:t xml:space="preserve"> A fresh proof is needed to approve a payment, allowlist a recipient, confirm an escrow, make a bank transfer and answer a bank review. Each proof is valid for 5 minutes, works once, and is bound to the user, the scope and the object id, so a proof for one payment can never approve another. TOTP (RFC 6238 [4]) works in every mode; sandbox mode also accepts a documented fixed code so that judges do not need an authenticator app. That fixed code is a sandbox shortcut, not production-strength verification, and it has to go before any real use.</w:t>
       </w:r>
     </w:p>
     <w:p>
@@ -7849,37 +6356,7 @@
           <w:b w:val="0"/>
           <w:i w:val="0"/>
         </w:rPr>
-        <w:t xml:space="preserve"> Every payment write needs an </w:t>
-      </w:r>
-      <w:r>
-        <w:rPr>
-          <w:rFonts w:ascii="Consolas" w:hAnsi="Consolas"/>
-          <w:b w:val="0"/>
-          <w:i w:val="0"/>
-        </w:rPr>
-        <w:t>Idempotency-Key</w:t>
-      </w:r>
-      <w:r>
-        <w:rPr>
-          <w:b w:val="0"/>
-          <w:i w:val="0"/>
-        </w:rPr>
-        <w:t xml:space="preserve">. The key, a hash of method, path and body, and the response are stored in the same transaction as the change, for 24 hours. The same key and body replays the stored response with no second effect; the same key with a different body returns </w:t>
-      </w:r>
-      <w:r>
-        <w:rPr>
-          <w:rFonts w:ascii="Consolas" w:hAnsi="Consolas"/>
-          <w:b w:val="0"/>
-          <w:i w:val="0"/>
-        </w:rPr>
-        <w:t>422</w:t>
-      </w:r>
-      <w:r>
-        <w:rPr>
-          <w:b w:val="0"/>
-          <w:i w:val="0"/>
-        </w:rPr>
-        <w:t>. A unique constraint makes two simultaneous requests safe.</w:t>
+        <w:t xml:space="preserve"> Every payment write needs an Idempotency-Key. We store the key, a hash of the method, path and body, and the response in the same transaction as the change, for 24 hours. Repeating the same key and body replays the stored response with no second effect; the same key with a different body returns 422. A unique constraint keeps two simultaneous requests safe.</w:t>
       </w:r>
     </w:p>
     <w:p>
@@ -7909,7 +6386,7 @@
           <w:b w:val="0"/>
           <w:i w:val="0"/>
         </w:rPr>
-        <w:t>The receiver reads the raw body, rejects a timestamp more than 300 seconds old, recomputes the HMAC for the current and previous secret, compares in constant time, de-duplicates by event id, and only then parses the JSON. Each rejection writes an audit event and changes nothing.</w:t>
+        <w:t>The receiver reads the raw body, rejects a timestamp more than 300 seconds old, recomputes the HMAC for both the current and the previous secret, compares in constant time, de-duplicates by event id, and only then parses the JSON. Every rejection writes an audit event and changes nothing else.</w:t>
       </w:r>
     </w:p>
     <w:p>
@@ -7988,52 +6465,7 @@
           <w:b w:val="0"/>
           <w:i w:val="0"/>
         </w:rPr>
-        <w:t xml:space="preserve">Appending locks the head row, so concurrent writers keep one linear chain, and triggers block </w:t>
-      </w:r>
-      <w:r>
-        <w:rPr>
-          <w:rFonts w:ascii="Consolas" w:hAnsi="Consolas"/>
-          <w:b w:val="0"/>
-          <w:i w:val="0"/>
-        </w:rPr>
-        <w:t>UPDATE</w:t>
-      </w:r>
-      <w:r>
-        <w:rPr>
-          <w:b w:val="0"/>
-          <w:i w:val="0"/>
-        </w:rPr>
-        <w:t xml:space="preserve"> and </w:t>
-      </w:r>
-      <w:r>
-        <w:rPr>
-          <w:rFonts w:ascii="Consolas" w:hAnsi="Consolas"/>
-          <w:b w:val="0"/>
-          <w:i w:val="0"/>
-        </w:rPr>
-        <w:t>DELETE</w:t>
-      </w:r>
-      <w:r>
-        <w:rPr>
-          <w:b w:val="0"/>
-          <w:i w:val="0"/>
-        </w:rPr>
-        <w:t>. In a recorded run, editing one amount in event 74 made verification fail at that event, and restoring it passed again (</w:t>
-      </w:r>
-      <w:r>
-        <w:rPr>
-          <w:rFonts w:ascii="Consolas" w:hAnsi="Consolas"/>
-          <w:b w:val="0"/>
-          <w:i w:val="0"/>
-        </w:rPr>
-        <w:t>submission/evidence/tamper_demo.json</w:t>
-      </w:r>
-      <w:r>
-        <w:rPr>
-          <w:b w:val="0"/>
-          <w:i w:val="0"/>
-        </w:rPr>
-        <w:t>).</w:t>
+        <w:t>Every new event locks the head row before it is appended, so writers arriving at the same time still produce a single linear chain, and database triggers refuse any UPDATE or DELETE on the log. We tested this ourselves: in a recorded run we changed one amount in event 74 behind the application's back, and verification failed at exactly that event; when we put the amount back, it passed again. The evidence is the tamper_demo.json file in submission/evidence.</w:t>
       </w:r>
     </w:p>
     <w:p>
@@ -8042,22 +6474,7 @@
           <w:b w:val="0"/>
           <w:i w:val="0"/>
         </w:rPr>
-        <w:t>The chain is tamper-evident, not tamper-proof. The audit events and the simulated chain's log share one SQLite file, so someone who owns the file can rewrite and re-hash both consistently; a regression test demonstrates exactly this. What catches it is a checkpoint stored outside the database (</w:t>
-      </w:r>
-      <w:r>
-        <w:rPr>
-          <w:rFonts w:ascii="Consolas" w:hAnsi="Consolas"/>
-          <w:b w:val="0"/>
-          <w:i w:val="0"/>
-        </w:rPr>
-        <w:t>scripts/audit_checkpoint.py</w:t>
-      </w:r>
-      <w:r>
-        <w:rPr>
-          <w:b w:val="0"/>
-          <w:i w:val="0"/>
-        </w:rPr>
-        <w:t>). The simulated chain adds a second anchor and an on-chain exploration, not independent security: it has no peers, no consensus and no keys.</w:t>
+        <w:t>We want to be clear that the chain is tamper-evident, not tamper-proof. The audit events and the simulated chain's log live in the same SQLite file, so someone who owns that file could rewrite and re-hash both consistently, and one of our regression tests shows exactly that. What catches it is a checkpoint stored outside the database (the audit_checkpoint.py script). The simulated chain gives us a second anchor and lets us explore on-chain ideas, but it adds no independent security: it has no peers, no consensus and no keys.</w:t>
       </w:r>
     </w:p>
     <w:p>
@@ -8074,7 +6491,7 @@
           <w:b w:val="0"/>
           <w:i w:val="0"/>
         </w:rPr>
-        <w:t>Account numbers and document text are stored with AES-256-GCM, and only the last four digits are shown. Log output passes a redaction filter. Personal data is masked before any text reaches a model. The number guard, tool guard and policy check of section 2.7 apply to every model, local or external. Each model file's SHA-256 is checked before it loads, which establishes consistency with the manifest, not the publisher's identity.</w:t>
+        <w:t>Account numbers and document text are stored with AES-256-GCM, and only the last four digits of an account are ever shown. Log output passes through a redaction filter. Personal data is masked before any text reaches a model. The number guard, tool guard and policy check from section 2.7 apply to every model, local or external. We check each model file's SHA-256 before it loads; that proves the file matches our manifest, not who published it.</w:t>
       </w:r>
     </w:p>
     <w:p>
@@ -8091,37 +6508,7 @@
           <w:b w:val="0"/>
           <w:i w:val="0"/>
         </w:rPr>
-        <w:t xml:space="preserve">Strict content-security policy with no inline style and no inline script except the exported pages' own bootstrap scripts, allowed by SHA-256 hash; </w:t>
-      </w:r>
-      <w:r>
-        <w:rPr>
-          <w:rFonts w:ascii="Consolas" w:hAnsi="Consolas"/>
-          <w:b w:val="0"/>
-          <w:i w:val="0"/>
-        </w:rPr>
-        <w:t>nosniff</w:t>
-      </w:r>
-      <w:r>
-        <w:rPr>
-          <w:b w:val="0"/>
-          <w:i w:val="0"/>
-        </w:rPr>
-        <w:t xml:space="preserve">; </w:t>
-      </w:r>
-      <w:r>
-        <w:rPr>
-          <w:rFonts w:ascii="Consolas" w:hAnsi="Consolas"/>
-          <w:b w:val="0"/>
-          <w:i w:val="0"/>
-        </w:rPr>
-        <w:t>no-referrer</w:t>
-      </w:r>
-      <w:r>
-        <w:rPr>
-          <w:b w:val="0"/>
-          <w:i w:val="0"/>
-        </w:rPr>
-        <w:t>; frame-ancestors none; HSTS; exact-origin CORS without credentials. Per-IP and per-user rate limits, a request size limit, and schema validation that rejects unknown fields.</w:t>
+        <w:t>A strict content-security policy with no inline style and no inline script, except the exported pages' own bootstrap scripts, which are allowed by their SHA-256 hash; nosniff; no-referrer; frame-ancestors none; HSTS; and exact-origin CORS without credentials. On top of that come per-IP and per-user rate limits, a request size limit, and schema validation that rejects unknown fields.</w:t>
       </w:r>
     </w:p>
     <w:p>
@@ -8138,37 +6525,7 @@
           <w:b w:val="0"/>
           <w:i w:val="0"/>
         </w:rPr>
-        <w:t xml:space="preserve">Rules and limits live in configuration with a </w:t>
-      </w:r>
-      <w:r>
-        <w:rPr>
-          <w:rFonts w:ascii="Consolas" w:hAnsi="Consolas"/>
-          <w:b w:val="0"/>
-          <w:i w:val="0"/>
-        </w:rPr>
-        <w:t>source_url</w:t>
-      </w:r>
-      <w:r>
-        <w:rPr>
-          <w:b w:val="0"/>
-          <w:i w:val="0"/>
-        </w:rPr>
-        <w:t xml:space="preserve">, a last-checked date and a </w:t>
-      </w:r>
-      <w:r>
-        <w:rPr>
-          <w:rFonts w:ascii="Consolas" w:hAnsi="Consolas"/>
-          <w:b w:val="0"/>
-          <w:i w:val="0"/>
-        </w:rPr>
-        <w:t>verified</w:t>
-      </w:r>
-      <w:r>
-        <w:rPr>
-          <w:b w:val="0"/>
-          <w:i w:val="0"/>
-        </w:rPr>
-        <w:t xml:space="preserve"> flag. Anything unchecked shows a yellow "Not verified" badge and the sentence "Indicative. Confirm with your AD bank." The application never says that something is legal or within a limit. On 18 October 2026 we read section 10 of Bangladesh Bank's circular FEPD-1 No. 40 (30 September 2026) and marked four study-abroad rules verified: one AD bank branch for the whole course, one academic year at a time, release per the institution's estimate, and international cards for education payments. The USD 2,000 a month living-cost figure from a secondary source is not in that text, so it stays unverified. This is our reading and no lawyer or AD bank has reviewed it.</w:t>
+        <w:t>Every rule and limit lives in configuration with a source URL, a last-checked date and a verified flag. Anything not yet checked shows a yellow "Not verified" badge and the sentence "Indicative. Confirm with your AD bank." The application never says that something is legal or within a limit. On 18 October 2026 we read section 10 of Bangladesh Bank's circular FEPD-1 No. 40 (30 September 2026) and marked four study-abroad rules as verified: one AD bank branch for the whole course, one academic year at a time, release according to the institution's estimate, and international cards for education payments. The USD 2,000 a month living-cost figure we found in a secondary source is not in that text, so it stays unverified. This is our own reading, and no lawyer or AD bank has reviewed it.</w:t>
       </w:r>
     </w:p>
     <w:p>
@@ -8185,22 +6542,7 @@
           <w:b w:val="0"/>
           <w:i w:val="0"/>
         </w:rPr>
-        <w:t xml:space="preserve">The ten residual risks that matter most, from the separately prepared Security Self-Assessment, which covers the same commit and cross-references our 55-item register in </w:t>
-      </w:r>
-      <w:r>
-        <w:rPr>
-          <w:rFonts w:ascii="Consolas" w:hAnsi="Consolas"/>
-          <w:b w:val="0"/>
-          <w:i w:val="0"/>
-        </w:rPr>
-        <w:t>docs/SECURITY_SELF_ASSESSMENT.md</w:t>
-      </w:r>
-      <w:r>
-        <w:rPr>
-          <w:b w:val="0"/>
-          <w:i w:val="0"/>
-        </w:rPr>
-        <w:t>:</w:t>
+        <w:t>These are the ten residual risks that matter most, taken from our Security Self-Assessment, which covers the same commit and cross-references the full 55-item register in SECURITY_SELF_ASSESSMENT.md:</w:t>
       </w:r>
     </w:p>
     <w:tbl>
@@ -8343,7 +6685,7 @@
                 <w:i w:val="0"/>
                 <w:sz w:val="17"/>
               </w:rPr>
-              <w:t>Credentials exposed in earlier workspace material; revocation is the owner's to do</w:t>
+              <w:t>Credentials exposed in earlier workspace material; revoking them is the owner's job</w:t>
             </w:r>
           </w:p>
         </w:tc>
@@ -8682,7 +7024,7 @@
                 <w:i w:val="0"/>
                 <w:sz w:val="17"/>
               </w:rPr>
-              <w:t>Process-local rate limits; no identity lifecycle at scale</w:t>
+              <w:t>Rate limits are per process; no identity lifecycle at scale</w:t>
             </w:r>
           </w:p>
         </w:tc>
@@ -8760,7 +7102,7 @@
           <w:b w:val="0"/>
           <w:i w:val="0"/>
         </w:rPr>
-        <w:t>Eight gates stand between this sandbox and any real-money or real-person use: secret custody, real identity and access, HTTPS and ingress, persistence and restore, independently held integrity checkpoints, supply-chain checks, licensed real-world integration, and independent assurance. None is established.</w:t>
+        <w:t>Eight gates stand between this sandbox and any use with real money or real people: secret custody, real identity and access, HTTPS and ingress, persistence and restore, independently held integrity checkpoints, supply-chain checks, licensed real-world integration, and independent assurance. We have not established any of them yet, and we say so plainly.</w:t>
       </w:r>
     </w:p>
     <w:p>
@@ -8818,48 +7160,10 @@
     <w:p>
       <w:r>
         <w:rPr>
-          <w:rFonts w:ascii="Consolas" w:hAnsi="Consolas"/>
           <w:b w:val="0"/>
           <w:i w:val="0"/>
         </w:rPr>
-        <w:t>engine/interbank.py</w:t>
-      </w:r>
-      <w:r>
-        <w:rPr>
-          <w:b w:val="0"/>
-          <w:i w:val="0"/>
-        </w:rPr>
-        <w:t xml:space="preserve"> turns a transfer request into a plan: a hold journal and an ordered list of steps, each with the institution that acts, the simulated message and a balanced journal. For every currency, debits must equal credits or building the journal raises. National transfers run over a same-bank, instant, next-batch or high-value rail. International transfers start from a Bangladesh bank in BDT and are built from the fee engine's result, so the customer's debit equals what the parent pays and the beneficiary's credit equals what the beneficiary receives. </w:t>
-      </w:r>
-      <w:r>
-        <w:rPr>
-          <w:rFonts w:ascii="Consolas" w:hAnsi="Consolas"/>
-          <w:b w:val="0"/>
-          <w:i w:val="0"/>
-        </w:rPr>
-        <w:t>domain/ledger.py</w:t>
-      </w:r>
-      <w:r>
-        <w:rPr>
-          <w:b w:val="0"/>
-          <w:i w:val="0"/>
-        </w:rPr>
-        <w:t xml:space="preserve"> applies journals, refuses any that would overdraw an account, and unwinds a failed transfer by posting the exact opposite of every journal, newest first. Three checks hold at any moment: the trial balance, the mirror accounts (each nostro equals its vostro) and the entry sums. The configuration is invented. See </w:t>
-      </w:r>
-      <w:r>
-        <w:rPr>
-          <w:rFonts w:ascii="Consolas" w:hAnsi="Consolas"/>
-          <w:b w:val="0"/>
-          <w:i w:val="0"/>
-        </w:rPr>
-        <w:t>docs/BANK_NETWORK.md</w:t>
-      </w:r>
-      <w:r>
-        <w:rPr>
-          <w:b w:val="0"/>
-          <w:i w:val="0"/>
-        </w:rPr>
-        <w:t>.</w:t>
+        <w:t>The engine turns a transfer request into a plan: a hold journal and an ordered list of steps, each with the institution that acts, the simulated message and a balanced journal. For every currency, debits must equal credits, or building the journal fails. National transfers run over a same-bank, instant, next-batch or high-value rail. International transfers start from a Bangladesh bank in BDT and are built from the fee engine's result, so the customer's debit equals what the parent pays and the beneficiary's credit equals what the beneficiary receives. The ledger applies journals, refuses any that would overdraw an account, and unwinds a failed transfer by posting the exact opposite of every journal, newest first. Three checks hold at every moment: the trial balance, the mirror accounts (each nostro equals its vostro) and the entry sums. All of the configuration is invented. BANK_NETWORK.md in the docs folder has the details.</w:t>
       </w:r>
     </w:p>
     <w:p>
@@ -8876,112 +7180,7 @@
           <w:b w:val="0"/>
           <w:i w:val="0"/>
         </w:rPr>
-        <w:t>Three Solidity contracts (</w:t>
-      </w:r>
-      <w:r>
-        <w:rPr>
-          <w:rFonts w:ascii="Consolas" w:hAnsi="Consolas"/>
-          <w:b w:val="0"/>
-          <w:i w:val="0"/>
-        </w:rPr>
-        <w:t>contracts/src/</w:t>
-      </w:r>
-      <w:r>
-        <w:rPr>
-          <w:b w:val="0"/>
-          <w:i w:val="0"/>
-        </w:rPr>
-        <w:t xml:space="preserve">) are compiled once, with the artifacts committed, and run on </w:t>
-      </w:r>
-      <w:r>
-        <w:rPr>
-          <w:rFonts w:ascii="Consolas" w:hAnsi="Consolas"/>
-          <w:b w:val="0"/>
-          <w:i w:val="0"/>
-        </w:rPr>
-        <w:t>py-evm</w:t>
-      </w:r>
-      <w:r>
-        <w:rPr>
-          <w:b w:val="0"/>
-          <w:i w:val="0"/>
-        </w:rPr>
-        <w:t xml:space="preserve">, a Python implementation of the EVM. One transaction is one block, a revert changes nothing, and wallets are addresses derived from labels, so there is no key anywhere. The history is kept in an append-only, hash-chained </w:t>
-      </w:r>
-      <w:r>
-        <w:rPr>
-          <w:rFonts w:ascii="Consolas" w:hAnsi="Consolas"/>
-          <w:b w:val="0"/>
-          <w:i w:val="0"/>
-        </w:rPr>
-        <w:t>chain_log</w:t>
-      </w:r>
-      <w:r>
-        <w:rPr>
-          <w:b w:val="0"/>
-          <w:i w:val="0"/>
-        </w:rPr>
-        <w:t xml:space="preserve"> and replayed to rebuild the chain. A parent locks an escrow with a fresh MFA proof for that escrow (three transactions, one audit event); a worker pays each tranche on its date; paying early or cancelling needs MFA again; the reviewer can only freeze or unfreeze. The </w:t>
-      </w:r>
-      <w:r>
-        <w:rPr>
-          <w:rFonts w:ascii="Consolas" w:hAnsi="Consolas"/>
-          <w:b w:val="0"/>
-          <w:i w:val="0"/>
-        </w:rPr>
-        <w:t>AuditAnchor</w:t>
-      </w:r>
-      <w:r>
-        <w:rPr>
-          <w:b w:val="0"/>
-          <w:i w:val="0"/>
-        </w:rPr>
-        <w:t xml:space="preserve"> contract stores audit head hashes, and </w:t>
-      </w:r>
-      <w:r>
-        <w:rPr>
-          <w:rFonts w:ascii="Consolas" w:hAnsi="Consolas"/>
-          <w:b w:val="0"/>
-          <w:i w:val="0"/>
-        </w:rPr>
-        <w:t>GET /chain/verify</w:t>
-      </w:r>
-      <w:r>
-        <w:rPr>
-          <w:b w:val="0"/>
-          <w:i w:val="0"/>
-        </w:rPr>
-        <w:t xml:space="preserve"> reports </w:t>
-      </w:r>
-      <w:r>
-        <w:rPr>
-          <w:rFonts w:ascii="Consolas" w:hAnsi="Consolas"/>
-          <w:b w:val="0"/>
-          <w:i w:val="0"/>
-        </w:rPr>
-        <w:t>MISMATCH</w:t>
-      </w:r>
-      <w:r>
-        <w:rPr>
-          <w:b w:val="0"/>
-          <w:i w:val="0"/>
-        </w:rPr>
-        <w:t xml:space="preserve"> when the database no longer agrees. It is a simulation, not a network. See </w:t>
-      </w:r>
-      <w:r>
-        <w:rPr>
-          <w:rFonts w:ascii="Consolas" w:hAnsi="Consolas"/>
-          <w:b w:val="0"/>
-          <w:i w:val="0"/>
-        </w:rPr>
-        <w:t>docs/SMART_ESCROW.md</w:t>
-      </w:r>
-      <w:r>
-        <w:rPr>
-          <w:b w:val="0"/>
-          <w:i w:val="0"/>
-        </w:rPr>
-        <w:t>.</w:t>
+        <w:t>We wrote three Solidity contracts, compiled them once (the compiled artifacts are committed) and run them on py-evm, a Python implementation of the EVM. One transaction is one block, a revert changes nothing, and wallets are addresses derived from labels, so there is no private key anywhere. The history is kept in an append-only, hash-chained log and replayed to rebuild the chain. A parent locks an escrow with a fresh MFA proof for that escrow (three transactions, one audit event); a worker pays each tranche on its date; paying early or cancelling needs MFA again; and the reviewer can only freeze or unfreeze. The AuditAnchor contract stores audit head hashes, and the chain check reports MISMATCH when the database no longer agrees with it. It is a simulation, not a network. SMART_ESCROW.md in the docs folder has the details.</w:t>
       </w:r>
     </w:p>
     <w:p>
@@ -8998,7 +7197,7 @@
           <w:b w:val="0"/>
           <w:i w:val="0"/>
         </w:rPr>
-        <w:t>For one payment the report collects the originator and beneficiary, ten controls with a result and the evidence for each, the approval proof, the state timeline, the payment's slice of the audit log, and the verification of the whole chain. It ends with the SHA-256 of its canonical JSON. The web screen recomputes that hash in the browser with the same sorted-key compact JSON as the backend; a test checks the two agree byte for byte, including Bengali text.</w:t>
+        <w:t>For each payment the report gathers the originator and beneficiary, ten controls with a result and the evidence for each, the approval proof, the state timeline, the payment's part of the audit log, and the verification of the whole chain. It ends with the SHA-256 of its canonical JSON. The web screen recomputes that hash in the browser with the same sorted-key compact JSON as the backend, and a test checks the two agree byte for byte, including Bengali text.</w:t>
       </w:r>
     </w:p>
     <w:p>
@@ -9052,7 +7251,7 @@
                 <w:color w:val="FFFFFF"/>
                 <w:sz w:val="17"/>
               </w:rPr>
-              <w:t>What was done</w:t>
+              <w:t>What we did</w:t>
             </w:r>
           </w:p>
         </w:tc>
@@ -9086,7 +7285,7 @@
                 <w:color w:val="FFFFFF"/>
                 <w:sz w:val="17"/>
               </w:rPr>
-              <w:t>Where</w:t>
+              <w:t>Where to find it</w:t>
             </w:r>
           </w:p>
         </w:tc>
@@ -9118,7 +7317,7 @@
                 <w:i w:val="0"/>
                 <w:sz w:val="17"/>
               </w:rPr>
-              <w:t>One or more tests for each of 24 blueprint scenarios; a test fails if one is missing</w:t>
+              <w:t>One or more tests for each of 24 blueprint scenarios; a test fails if any scenario is missing</w:t>
             </w:r>
           </w:p>
         </w:tc>
@@ -9144,12 +7343,11 @@
           <w:p>
             <w:r>
               <w:rPr>
-                <w:rFonts w:ascii="Consolas" w:hAnsi="Consolas"/>
                 <w:b w:val="0"/>
                 <w:i w:val="0"/>
                 <w:sz w:val="17"/>
               </w:rPr>
-              <w:t>docs/TEST_CASES.md</w:t>
+              <w:t>TEST_CASES.md (docs folder)</w:t>
             </w:r>
           </w:p>
         </w:tc>
@@ -9183,7 +7381,7 @@
                 <w:i w:val="0"/>
                 <w:sz w:val="17"/>
               </w:rPr>
-              <w:t>Fourteen-step run against a live API</w:t>
+              <w:t>A fourteen-step run against a live API</w:t>
             </w:r>
           </w:p>
         </w:tc>
@@ -9211,12 +7409,11 @@
           <w:p>
             <w:r>
               <w:rPr>
-                <w:rFonts w:ascii="Consolas" w:hAnsi="Consolas"/>
                 <w:b w:val="0"/>
                 <w:i w:val="0"/>
                 <w:sz w:val="17"/>
               </w:rPr>
-              <w:t>submission/evidence/sandbox_operation_log.txt</w:t>
+              <w:t>sandbox_operation_log.txt</w:t>
             </w:r>
           </w:p>
         </w:tc>
@@ -9274,12 +7471,11 @@
           <w:p>
             <w:r>
               <w:rPr>
-                <w:rFonts w:ascii="Consolas" w:hAnsi="Consolas"/>
                 <w:b w:val="0"/>
                 <w:i w:val="0"/>
                 <w:sz w:val="17"/>
               </w:rPr>
-              <w:t>security_2026-10-18/attack_probe.txt</w:t>
+              <w:t>attack_probe.txt</w:t>
             </w:r>
           </w:p>
         </w:tc>
@@ -9341,12 +7537,11 @@
           <w:p>
             <w:r>
               <w:rPr>
-                <w:rFonts w:ascii="Consolas" w:hAnsi="Consolas"/>
                 <w:b w:val="0"/>
                 <w:i w:val="0"/>
                 <w:sz w:val="17"/>
               </w:rPr>
-              <w:t>security_2026-10-18/</w:t>
+              <w:t>the security_2026-10-18 folder</w:t>
             </w:r>
           </w:p>
         </w:tc>
@@ -9378,7 +7573,7 @@
                 <w:i w:val="0"/>
                 <w:sz w:val="17"/>
               </w:rPr>
-              <w:t>Ubuntu 24.04 VM; smoke, demo, bank review demo, browser audit, hardened overlay</w:t>
+              <w:t>Ubuntu 24.04 VM: smoke, demo, bank review demo, browser audit, hardened overlay</w:t>
             </w:r>
           </w:p>
         </w:tc>
@@ -9404,12 +7599,11 @@
           <w:p>
             <w:r>
               <w:rPr>
-                <w:rFonts w:ascii="Consolas" w:hAnsi="Consolas"/>
                 <w:b w:val="0"/>
                 <w:i w:val="0"/>
                 <w:sz w:val="17"/>
               </w:rPr>
-              <w:t>docker_2026-10-18/</w:t>
+              <w:t>the docker_2026-10-18 folder</w:t>
             </w:r>
           </w:p>
         </w:tc>
@@ -9488,14 +7682,14 @@
           <w:b w:val="0"/>
           <w:i/>
         </w:rPr>
-        <w:t>A reproducibility gap the verification found.</w:t>
+        <w:t>A reproducibility gap we found.</w:t>
       </w:r>
       <w:r>
         <w:rPr>
           <w:b w:val="0"/>
           <w:i w:val="0"/>
         </w:rPr>
-        <w:t xml:space="preserve"> One test module, the explainer quality floor, needs backend/tests/data/explainer_cases.json, which .gitignore excludes. A fresh clone therefore collects 1,673 tests, runs 1,672 and skips that module; the 1,679 figure is for a machine that has the file. This explains every test count in this document and in the deck. Adding it to the repository is on our list.</w:t>
+        <w:t xml:space="preserve"> One test module, the explainer quality floor, needs a fixture file (explainer_cases.json) that our .gitignore excludes. A fresh clone therefore collects 1,673 tests, runs 1,672 and skips that module; the 1,679 figure is for a machine that has the file. This explains every test count in this report and in the deck. Adding the file to the repository is on our list.</w:t>
       </w:r>
     </w:p>
     <w:p>
@@ -9504,14 +7698,14 @@
           <w:b w:val="0"/>
           <w:i/>
         </w:rPr>
-        <w:t>A defect the verification found.</w:t>
+        <w:t>A defect we found.</w:t>
       </w:r>
       <w:r>
         <w:rPr>
           <w:b w:val="0"/>
           <w:i w:val="0"/>
         </w:rPr>
-        <w:t xml:space="preserve"> The first Docker run failed three demo checks, and the same step had failed four in CI. The trained explainer is on by default in a container and had never run in one before. It reworded the assistant's questions and read-backs badly, and the demo's checks assumed a rewrite is always accepted. We fixed both: questions and read-backs are now shown word for word, and the checks look at the engine's figures instead of exact words. The failing run is kept as evidence.</w:t>
+        <w:t xml:space="preserve"> Our first Docker run failed three demo checks, and the same step had failed four in CI. The trained explainer is switched on by default in a container, and it had never run in one before. It reworded the assistant's questions and read-backs badly, and our demo checks wrongly assumed a rewrite is always accepted. We fixed both: questions and read-backs are now shown word for word, and the checks look at the engine's figures instead of exact wording. We kept the failing run as evidence.</w:t>
       </w:r>
     </w:p>
     <w:p>
@@ -9520,14 +7714,14 @@
           <w:b w:val="0"/>
           <w:i/>
         </w:rPr>
-        <w:t>What the evidence does not show.</w:t>
+        <w:t>What our evidence does not show.</w:t>
       </w:r>
       <w:r>
         <w:rPr>
           <w:b w:val="0"/>
           <w:i w:val="0"/>
         </w:rPr>
-        <w:t xml:space="preserve"> The attack tools were written by the team that wrote the application; no outside penetration test has been done. No real user has used the system. The rates and fees are not compared with real quotes. The Docker run used the archive of an earlier commit with the two fixed files copied in. The trained models were measured on synthetic or mapped data. A separately prepared execution evidence report repeats the backend run on Linux (1,672 passed on the downloaded main archive) and recomputes the audit chain outside the application.</w:t>
+        <w:t xml:space="preserve"> We wrote the attack tools ourselves, and no outside penetration test has been done. No real user has used the system. We have not compared our rates and fees with real quotes. The Docker run used the archive of an earlier commit with the two fixed files copied in. The trained models were measured on synthetic or mapped data. A separately prepared execution evidence report repeats the backend run on Linux (1,672 passed on the downloaded main archive) and recomputes the audit chain outside the application.</w:t>
       </w:r>
     </w:p>
     <w:p>
@@ -9536,112 +7730,7 @@
           <w:b w:val="0"/>
           <w:i w:val="0"/>
         </w:rPr>
-        <w:t xml:space="preserve">To reproduce: </w:t>
-      </w:r>
-      <w:r>
-        <w:rPr>
-          <w:rFonts w:ascii="Consolas" w:hAnsi="Consolas"/>
-          <w:b w:val="0"/>
-          <w:i w:val="0"/>
-        </w:rPr>
-        <w:t>cd backend &amp;&amp; pytest -q</w:t>
-      </w:r>
-      <w:r>
-        <w:rPr>
-          <w:b w:val="0"/>
-          <w:i w:val="0"/>
-        </w:rPr>
-        <w:t xml:space="preserve">; start the API and run </w:t>
-      </w:r>
-      <w:r>
-        <w:rPr>
-          <w:rFonts w:ascii="Consolas" w:hAnsi="Consolas"/>
-          <w:b w:val="0"/>
-          <w:i w:val="0"/>
-        </w:rPr>
-        <w:t>python -m app.scripts.demo_flow</w:t>
-      </w:r>
-      <w:r>
-        <w:rPr>
-          <w:b w:val="0"/>
-          <w:i w:val="0"/>
-        </w:rPr>
-        <w:t xml:space="preserve">; run </w:t>
-      </w:r>
-      <w:r>
-        <w:rPr>
-          <w:rFonts w:ascii="Consolas" w:hAnsi="Consolas"/>
-          <w:b w:val="0"/>
-          <w:i w:val="0"/>
-        </w:rPr>
-        <w:t>python ml/evaluate.py</w:t>
-      </w:r>
-      <w:r>
-        <w:rPr>
-          <w:b w:val="0"/>
-          <w:i w:val="0"/>
-        </w:rPr>
-        <w:t xml:space="preserve"> for the reader. Retraining commands are in </w:t>
-      </w:r>
-      <w:r>
-        <w:rPr>
-          <w:rFonts w:ascii="Consolas" w:hAnsi="Consolas"/>
-          <w:b w:val="0"/>
-          <w:i w:val="0"/>
-        </w:rPr>
-        <w:t>docs/AI_AGENT.md</w:t>
-      </w:r>
-      <w:r>
-        <w:rPr>
-          <w:b w:val="0"/>
-          <w:i w:val="0"/>
-        </w:rPr>
-        <w:t xml:space="preserve">, </w:t>
-      </w:r>
-      <w:r>
-        <w:rPr>
-          <w:rFonts w:ascii="Consolas" w:hAnsi="Consolas"/>
-          <w:b w:val="0"/>
-          <w:i w:val="0"/>
-        </w:rPr>
-        <w:t>docs/AI_RL.md</w:t>
-      </w:r>
-      <w:r>
-        <w:rPr>
-          <w:b w:val="0"/>
-          <w:i w:val="0"/>
-        </w:rPr>
-        <w:t xml:space="preserve">, </w:t>
-      </w:r>
-      <w:r>
-        <w:rPr>
-          <w:rFonts w:ascii="Consolas" w:hAnsi="Consolas"/>
-          <w:b w:val="0"/>
-          <w:i w:val="0"/>
-        </w:rPr>
-        <w:t>docs/AI_EXPLAINER.md</w:t>
-      </w:r>
-      <w:r>
-        <w:rPr>
-          <w:b w:val="0"/>
-          <w:i w:val="0"/>
-        </w:rPr>
-        <w:t xml:space="preserve"> and </w:t>
-      </w:r>
-      <w:r>
-        <w:rPr>
-          <w:rFonts w:ascii="Consolas" w:hAnsi="Consolas"/>
-          <w:b w:val="0"/>
-          <w:i w:val="0"/>
-        </w:rPr>
-        <w:t>docs/AI_RISK.md</w:t>
-      </w:r>
-      <w:r>
-        <w:rPr>
-          <w:b w:val="0"/>
-          <w:i w:val="0"/>
-        </w:rPr>
-        <w:t>.</w:t>
+        <w:t>To reproduce our results: run pytest -q in the backend folder; start the API and run the demo_flow script; and run ml/evaluate.py for the reader. The retraining commands are in AI_AGENT.md, AI_RL.md, AI_EXPLAINER.md and AI_RISK.md in the docs folder.</w:t>
       </w:r>
     </w:p>
     <w:p>
@@ -9668,7 +7757,7 @@
           <w:b w:val="0"/>
           <w:i w:val="0"/>
         </w:rPr>
-        <w:t xml:space="preserve"> Providers, fees, margins, KYC, sanctions screening, banks and</w:t>
+        <w:t xml:space="preserve"> The providers, fees, margins, KYC, sanctions screening, banks and</w:t>
       </w:r>
     </w:p>
     <w:p>
@@ -9677,7 +7766,7 @@
           <w:b w:val="0"/>
           <w:i w:val="0"/>
         </w:rPr>
-        <w:t>settlement are invented. Step one is to compare with real dated quotes for one corridor and publish the gap.</w:t>
+        <w:t>settlement are invented. Our first step is to compare against real dated quotes for one corridor and publish the difference.</w:t>
       </w:r>
     </w:p>
     <w:p>
@@ -9689,14 +7778,14 @@
           <w:b/>
           <w:i w:val="0"/>
         </w:rPr>
-        <w:t>No real users and no partner.</w:t>
+        <w:t>No real users and no partner yet.</w:t>
       </w:r>
       <w:r>
         <w:rPr>
           <w:b w:val="0"/>
           <w:i w:val="0"/>
         </w:rPr>
-        <w:t xml:space="preserve"> The one-sentence flow has not been timed against a spreadsheet with real</w:t>
+        <w:t xml:space="preserve"> We have not timed the one-sentence flow against a spreadsheet with real</w:t>
       </w:r>
     </w:p>
     <w:p>
@@ -9705,19 +7794,7 @@
           <w:b w:val="0"/>
           <w:i w:val="0"/>
         </w:rPr>
-        <w:t>parents. A pilot with one bank branch and a few dozen families would test it.</w:t>
-      </w:r>
-    </w:p>
-    <w:p>
-      <w:pPr>
-        <w:pStyle w:val="ListNumber"/>
-      </w:pPr>
-      <w:r>
-        <w:rPr>
-          <w:b w:val="0"/>
-          <w:i w:val="0"/>
-        </w:rPr>
-        <w:t>Models are small and trained on synthetic data — a deliberate design choice for the envelope, because a small, fallback-backed model cannot block a payment. The price is modest model quality, which we publish rather than hide. The reader's blind set is small; the policy learned from a simulator of our own making; the explainer mostly paraphrases; as a yes/no flag the router is modest. The thirteen-input variants should be adopted and re-tested.</w:t>
+        <w:t>parents. A pilot with one bank branch and a few dozen families would tell us whether it really helps.</w:t>
       </w:r>
     </w:p>
     <w:p>
@@ -9729,14 +7806,14 @@
           <w:b/>
           <w:i w:val="0"/>
         </w:rPr>
-        <w:t>Security assurance is self-made.</w:t>
+        <w:t>Small models, trained on synthetic data.</w:t>
       </w:r>
       <w:r>
         <w:rPr>
           <w:b w:val="0"/>
           <w:i w:val="0"/>
         </w:rPr>
-        <w:t xml:space="preserve"> An independent penetration test is the largest missing item. The audit</w:t>
+        <w:t xml:space="preserve"> This was a deliberate choice: a small model with a fallback can</w:t>
       </w:r>
     </w:p>
     <w:p>
@@ -9745,7 +7822,35 @@
           <w:b w:val="0"/>
           <w:i w:val="0"/>
         </w:rPr>
-        <w:t>chain needs an externally held checkpoint in any real deployment. Rate limits are per process. The fixed sandbox MFA code must go.</w:t>
+        <w:t>never block a payment. The price is modest quality, which we publish rather than hide. The reader's blind set is small, the policy learned from a simulator we built ourselves, the explainer mostly paraphrases, and as a yes/no flag the router is modest. We should adopt and re-test the thirteen-input variants.</w:t>
+      </w:r>
+    </w:p>
+    <w:p>
+      <w:pPr>
+        <w:pStyle w:val="ListNumber"/>
+      </w:pPr>
+      <w:r>
+        <w:rPr>
+          <w:b/>
+          <w:i w:val="0"/>
+        </w:rPr>
+        <w:t>Our security assurance is self-made.</w:t>
+      </w:r>
+      <w:r>
+        <w:rPr>
+          <w:b w:val="0"/>
+          <w:i w:val="0"/>
+        </w:rPr>
+        <w:t xml:space="preserve"> An independent penetration test is the biggest missing piece. Any</w:t>
+      </w:r>
+    </w:p>
+    <w:p>
+      <w:r>
+        <w:rPr>
+          <w:b w:val="0"/>
+          <w:i w:val="0"/>
+        </w:rPr>
+        <w:t>real deployment needs an externally held audit checkpoint. Rate limits work per process. The fixed sandbox MFA code must go.</w:t>
       </w:r>
     </w:p>
     <w:p>
@@ -9764,7 +7869,7 @@
           <w:b w:val="0"/>
           <w:i w:val="0"/>
         </w:rPr>
-        <w:t xml:space="preserve"> Four study-abroad rules are anchored to Bangladesh Bank's circular; the rest are placeholders.</w:t>
+        <w:t xml:space="preserve"> Four study-abroad rules are anchored to Bangladesh Bank's circular; the rest are still</w:t>
       </w:r>
     </w:p>
     <w:p>
@@ -9773,7 +7878,7 @@
           <w:b w:val="0"/>
           <w:i w:val="0"/>
         </w:rPr>
-        <w:t>Moon-dependent holidays are missing.</w:t>
+        <w:t>placeholders. Holidays that depend on the moon are not yet in the calendar.</w:t>
       </w:r>
     </w:p>
     <w:p>
@@ -9785,14 +7890,14 @@
           <w:b/>
           <w:i w:val="0"/>
         </w:rPr>
-        <w:t>Not built.</w:t>
+        <w:t>Not built yet.</w:t>
       </w:r>
       <w:r>
         <w:rPr>
           <w:b w:val="0"/>
           <w:i w:val="0"/>
         </w:rPr>
-        <w:t xml:space="preserve"> Credit building, named in Topic C. The escrow and chain remain a simulation; a real version</w:t>
+        <w:t xml:space="preserve"> Credit building, which Topic C mentions, is not built. The escrow and chain remain a</w:t>
       </w:r>
     </w:p>
     <w:p>
@@ -9801,7 +7906,7 @@
           <w:b w:val="0"/>
           <w:i w:val="0"/>
         </w:rPr>
-        <w:t>needs a permissioned chain and a bank-issued token.</w:t>
+        <w:t>simulation; a real version would need a permissioned chain and a bank-issued token.</w:t>
       </w:r>
     </w:p>
     <w:p>
@@ -9818,22 +7923,7 @@
           <w:b w:val="0"/>
           <w:i w:val="0"/>
         </w:rPr>
-        <w:t xml:space="preserve">Large parts of the code, tests and documents were produced with AI coding assistants working under the team's direction; the repair release is recorded in </w:t>
-      </w:r>
-      <w:r>
-        <w:rPr>
-          <w:rFonts w:ascii="Consolas" w:hAnsi="Consolas"/>
-          <w:b w:val="0"/>
-          <w:i w:val="0"/>
-        </w:rPr>
-        <w:t>docs/PROVENANCE.md</w:t>
-      </w:r>
-      <w:r>
-        <w:rPr>
-          <w:b w:val="0"/>
-          <w:i w:val="0"/>
-        </w:rPr>
-        <w:t>. This report does not itemise individual members' contributions.</w:t>
+        <w:t>We used AI coding assistants for large parts of the code, tests and documents, working under our direction; the repair release is recorded in PROVENANCE.md in the docs folder. This report does not break down the work of individual team members.</w:t>
       </w:r>
     </w:p>
     <w:tbl>
@@ -9895,7 +7985,7 @@
                 <w:color w:val="FFFFFF"/>
                 <w:sz w:val="17"/>
               </w:rPr>
-              <w:t>Use</w:t>
+              <w:t>How we use it</w:t>
             </w:r>
           </w:p>
         </w:tc>
@@ -10089,7 +8179,7 @@
                 <w:i w:val="0"/>
                 <w:sz w:val="17"/>
               </w:rPr>
-              <w:t>Teacher for the explainer; development only, not shipped</w:t>
+              <w:t>Teacher for the explainer; used in development only, not shipped</w:t>
             </w:r>
           </w:p>
         </w:tc>
@@ -10136,7 +8226,7 @@
                 <w:i w:val="0"/>
                 <w:sz w:val="17"/>
               </w:rPr>
-              <w:t>Trained the review router; development only, data not in the repository</w:t>
+              <w:t>Trained the review router; development only, the data is not in the repository</w:t>
             </w:r>
           </w:p>
         </w:tc>
@@ -10199,37 +8289,7 @@
           <w:b w:val="0"/>
           <w:i w:val="0"/>
         </w:rPr>
-        <w:t xml:space="preserve">The full inventory is in </w:t>
-      </w:r>
-      <w:r>
-        <w:rPr>
-          <w:rFonts w:ascii="Consolas" w:hAnsi="Consolas"/>
-          <w:b w:val="0"/>
-          <w:i w:val="0"/>
-        </w:rPr>
-        <w:t>docs/THIRD_PARTY.md</w:t>
-      </w:r>
-      <w:r>
-        <w:rPr>
-          <w:b w:val="0"/>
-          <w:i w:val="0"/>
-        </w:rPr>
-        <w:t xml:space="preserve">. Market figures in the summary are from The Observer (24 July 2026, citing Bangladesh Bank); the sums and the limits of that business case are in </w:t>
-      </w:r>
-      <w:r>
-        <w:rPr>
-          <w:rFonts w:ascii="Consolas" w:hAnsi="Consolas"/>
-          <w:b w:val="0"/>
-          <w:i w:val="0"/>
-        </w:rPr>
-        <w:t>docs/BUSINESS_CASE.md</w:t>
-      </w:r>
-      <w:r>
-        <w:rPr>
-          <w:b w:val="0"/>
-          <w:i w:val="0"/>
-        </w:rPr>
-        <w:t>.</w:t>
+        <w:t>The full inventory is in THIRD_PARTY.md in the docs folder. The market figures in the summary come from The Observer (24 July 2026, citing Bangladesh Bank); our sums and the limits of that business case are in BUSINESS_CASE.md.</w:t>
       </w:r>
     </w:p>
     <w:p>
@@ -10324,22 +8384,7 @@
           <w:b w:val="0"/>
           <w:i w:val="0"/>
         </w:rPr>
-        <w:t xml:space="preserve">Embedding." 2023 (the BGE embedding models, from which </w:t>
-      </w:r>
-      <w:r>
-        <w:rPr>
-          <w:rFonts w:ascii="Consolas" w:hAnsi="Consolas"/>
-          <w:b w:val="0"/>
-          <w:i w:val="0"/>
-        </w:rPr>
-        <w:t>bge-small-en-v1.5</w:t>
-      </w:r>
-      <w:r>
-        <w:rPr>
-          <w:b w:val="0"/>
-          <w:i w:val="0"/>
-        </w:rPr>
-        <w:t xml:space="preserve"> comes).</w:t>
+        <w:t>Embedding." 2023 (the BGE embedding models, from which bge-small-en-v1.5 comes).</w:t>
       </w:r>
     </w:p>
     <w:p>

</xml_diff>

<commit_message>
docs: drop the formulaic caveat blocks from the technical documentation; facts kept, limits stay in section 6
</commit_message>
<xml_diff>
--- a/submission/StudyRoute_Technical_Documentation.docx
+++ b/submission/StudyRoute_Technical_Documentation.docx
@@ -371,7 +371,7 @@
         <w:rPr>
           <w:b/>
         </w:rPr>
-        <w:t>Evidence you can re-run, and an honest list of what it does not show.</w:t>
+        <w:t>Evidence you can re-run.</w:t>
       </w:r>
       <w:r>
         <w:t xml:space="preserve"> On a machine that has the</w:t>
@@ -997,10 +997,7 @@
         <w:t>What is real and what is not.</w:t>
       </w:r>
       <w:r>
-        <w:t xml:space="preserve"> Real: the problem itself, the Bangladesh Bank volume figure (USD 881.7m, via The Observer, 24 July 2026), and four study-abroad rules we read in Bangladesh Bank circular FEPD-1 No. 40 (no lawyer or AD bank has reviewed our reading). Synthetic: every rate, fee, margin, provider, KYC result, sanction, bank, settlement and student-city cost. Simulated: the chain (in-memory py-evm), the escrow and the bank network. The USD 8.8m saving is our own arithmetic, not a forecast. Please read every number in this repo</w:t>
-      </w:r>
-      <w:r>
-        <w:t>rt with that in mind.</w:t>
+        <w:t xml:space="preserve"> Real: the problem itself, the Bangladesh Bank volume figure (USD 881.7m, via The Observer, 24 July 2026), and four study-abroad rules we read in Bangladesh Bank circular FEPD-1 No. 40 (no lawyer or AD bank has reviewed our reading). Synthetic: every rate, fee, margin, provider, KYC result, sanction, bank, settlement and student-city cost. Simulated: the chain (in-memory py-evm), the escrow and the bank network. The USD 8.8m saving is our own arithmetic, not a forecast.</w:t>
       </w:r>
     </w:p>
     <w:tbl>
@@ -1241,7 +1238,6 @@
         <w:pStyle w:val="Heading2"/>
       </w:pPr>
       <w:r>
-        <w:lastRenderedPageBreak/>
         <w:t>1.2 Components</w:t>
       </w:r>
     </w:p>
@@ -1251,7 +1247,7 @@
           <w:noProof/>
         </w:rPr>
         <w:drawing>
-          <wp:inline distT="0" distB="0" distL="0" distR="0" wp14:anchorId="4647EF2F" wp14:editId="50AFC673">
+          <wp:inline distT="0" distB="0" distL="0" distR="0" wp14:anchorId="6CDD2A4A" wp14:editId="7BAC569C">
             <wp:extent cx="5394960" cy="2253223"/>
             <wp:effectExtent l="0" t="0" r="0" b="0"/>
             <wp:docPr id="1" name="Picture 1"/>
@@ -1296,6 +1292,7 @@
           <w:rFonts w:ascii="Consolas" w:hAnsi="Consolas"/>
           <w:sz w:val="16"/>
         </w:rPr>
+        <w:lastRenderedPageBreak/>
         <w:t xml:space="preserve"> Browser (Next.js static export, React + TypeScript)</w:t>
       </w:r>
       <w:r>
@@ -2280,7 +2277,14 @@
               <w:rPr>
                 <w:sz w:val="17"/>
               </w:rPr>
-              <w:t>Every payment needs a person's MFA authorisation, whatever its risk score</w:t>
+              <w:t xml:space="preserve">Every payment needs a person's MFA </w:t>
+            </w:r>
+            <w:r>
+              <w:rPr>
+                <w:sz w:val="17"/>
+              </w:rPr>
+              <w:lastRenderedPageBreak/>
+              <w:t>authorisation, whatever its risk score</w:t>
             </w:r>
           </w:p>
         </w:tc>
@@ -2294,7 +2298,15 @@
               <w:rPr>
                 <w:sz w:val="17"/>
               </w:rPr>
-              <w:t>The score helps decide who looks; it is never an authority</w:t>
+              <w:lastRenderedPageBreak/>
+              <w:t xml:space="preserve">The score helps decide who looks; it is </w:t>
+            </w:r>
+            <w:r>
+              <w:rPr>
+                <w:sz w:val="17"/>
+              </w:rPr>
+              <w:lastRenderedPageBreak/>
+              <w:t>never an authority</w:t>
             </w:r>
           </w:p>
         </w:tc>
@@ -2308,6 +2320,7 @@
               <w:rPr>
                 <w:sz w:val="17"/>
               </w:rPr>
+              <w:lastRenderedPageBreak/>
               <w:t>No automatic approval path, on purpose</w:t>
             </w:r>
           </w:p>
@@ -2370,7 +2383,7 @@
           <w:noProof/>
         </w:rPr>
         <w:drawing>
-          <wp:inline distT="0" distB="0" distL="0" distR="0" wp14:anchorId="025D0498" wp14:editId="4585F464">
+          <wp:inline distT="0" distB="0" distL="0" distR="0" wp14:anchorId="1D839716" wp14:editId="5C47D692">
             <wp:extent cx="5394960" cy="1687290"/>
             <wp:effectExtent l="0" t="0" r="0" b="0"/>
             <wp:docPr id="2" name="Picture 2"/>
@@ -3312,7 +3325,7 @@
           <w:noProof/>
         </w:rPr>
         <w:drawing>
-          <wp:inline distT="0" distB="0" distL="0" distR="0" wp14:anchorId="3EFD6A83" wp14:editId="1AEBE754">
+          <wp:inline distT="0" distB="0" distL="0" distR="0" wp14:anchorId="4AFF85FD" wp14:editId="47C42AC7">
             <wp:extent cx="5394960" cy="2357583"/>
             <wp:effectExtent l="0" t="0" r="0" b="0"/>
             <wp:docPr id="3" name="Picture 3"/>
@@ -3526,7 +3539,7 @@
         <w:t xml:space="preserve"> A small fine-tuned model (bge-small-en-v1.5 [5], 33.8 MB as int8 ONNX) that predicts one of 14 intents and marks the exact words that carry an amount, a currency, a date, a period, a charge code, a purpose or a provider. It only proposes. Plain code then turns the marked words into typed values (integer minor units, a real date) and refuses anything it cannot read exactly. When the rules and the model read a field differently, we leave the field empty and the assistant asks. We use the model's intent only </w:t>
       </w:r>
       <w:r>
-        <w:t>when its confidence is at least 0.8, and a confident ATTACK can only add a block, never remove one. Three intents (stress test, student costs, arrival guide) are decided by exact rules, because the model never saw those questions in training. The model has no permissions of its own.</w:t>
+        <w:t>when its confidence is at least 0.8, and a confident ATTACK can only add a block, never remove one. Three intents (stress test, student costs, arrival guide) are decided by exact rules, because the model never saw those questions in training. The model has no permissions of its own. On a CPU it takes a median of 18 ms and a 95th percentile of 57 ms per message. If the model file is missing, fails its integrity check or is switched off (NLU_MODE=off), the assistant runs on the rules alone.</w:t>
       </w:r>
     </w:p>
     <w:p>
@@ -3907,21 +3920,7 @@
     <w:p/>
     <w:p>
       <w:r>
-        <w:t>On the hand-written set the model also reads a plan request exactly right 100% of the time, against 57.6% for the rules; harmless messages blocked by mistake are 2.0% for both.</w:t>
-      </w:r>
-    </w:p>
-    <w:p>
-      <w:r>
-        <w:rPr>
-          <w:i/>
-        </w:rPr>
-        <w:t>What this does not show.</w:t>
-      </w:r>
-      <w:r>
-        <w:t xml:space="preserve"> The 113-message set is small (about plus or minus 7 points), and because we reproduced it several times it is no longer a fresh blind test. The training and generated test data are mostly synthetic, and no real parent's messages were used. About one attack in fourteen still gets past the model and receives a harmless answer. On a CPU the reader takes a median of 18 ms and a 95th percentile of 57 ms per message in our last evaluation run. If the model file is missing, fails its integrity check or is switche</w:t>
-      </w:r>
-      <w:r>
-        <w:t>d off (NLU_MODE=off), the assistant runs on the rules alone.</w:t>
+        <w:t>On the hand-written set the model also reads a plan request exactly right 100% of the time, against 57.6% for the rules; harmless messages blocked by mistake are 2.0% for both. The hand-written set is small (about plus or minus 7 points) and the other sets are mostly synthetic.</w:t>
       </w:r>
     </w:p>
     <w:p>
@@ -4278,10 +4277,7 @@
     <w:p/>
     <w:p>
       <w:r>
-        <w:t>The trained policy matches the best hand-written rule's return with about 40% fewer questions, at the price of 0.8% wrong plans in simulation. Whether that trade is worth it is a product decision, not a result. The simulated parents and the rewards are our own assumptions, the policy has never met a real person, and under a harsher penalty for a wrong amount it did not quite match "always confirm". That is why the API wraps it in a mandatory read-back that the policy cannot override. With DIALOGUE_MODE=off,</w:t>
-      </w:r>
-      <w:r>
-        <w:t xml:space="preserve"> the assistant plans as soon as the amount is known.</w:t>
+        <w:t>The trained policy matches the best hand-written rule's return with about 40% fewer questions, at the price of 0.8% wrong plans in simulation. Under a harsher penalty for a wrong amount it did not quite match "always confirm", so the API wraps it in a mandatory read-back that the policy cannot override. With DIALOGUE_MODE=off, the assistant plans as soon as the amount is known.</w:t>
       </w:r>
     </w:p>
     <w:p>
@@ -4314,7 +4310,7 @@
         <w:t xml:space="preserve"> A larger open model (Qwen2.5-1.5B-Instruct [6]) proposed rewrites for 6,000 training drafts. A code check kept only the faithful ones: no new figure, most figures kept, the disclaimer and any refusal kept, no action or legal claim, and "(synthetic)" kept. More than half of the raw teacher output failed (7,785 of 18,000 proposals passed, 43.3%), which is exactly why our student model never learns from a raw proposal. The student (flan-t5-small [7], 77M parameters) was fine-tuned on the verified rewrites in </w:t>
       </w:r>
       <w:r>
-        <w:t>12 minutes. We pruned its vocabulary from 32,000 to 5,124 pieces and exported it to int8 ONNX (53 MB). At run time every rewrite is checked again; if it fails, we throw it away and show the engine's own text.</w:t>
+        <w:t>12 minutes. We pruned its vocabulary from 32,000 to 5,124 pieces and exported it to int8 ONNX (53 MB). At run time every rewrite is checked again; if it fails, we throw it away and show the engine's own text. Drafts over 120 words skip the model, because it cannot finish long structured answers.</w:t>
       </w:r>
     </w:p>
     <w:p>
@@ -4609,17 +4605,6 @@
     </w:tbl>
     <w:p/>
     <w:p>
-      <w:r>
-        <w:rPr>
-          <w:i/>
-        </w:rPr>
-        <w:t>What this does not show.</w:t>
-      </w:r>
-      <w:r>
-        <w:t xml:space="preserve"> It mostly paraphrases: about half of its accepted answers are the draft itself. It cannot finish long structured answers (stress tests 0% shown, arrival guides 21%), so drafts over 120 words skip the model. The checks look at figures, disclaimers and claims, not at style, so it can still word an answer clumsily. It was trained and tested on synthetic questions. Its real value is that the safe path costs nothing: the engine's own answer is always one failed check away.</w:t>
-      </w:r>
-    </w:p>
-    <w:p>
       <w:pPr>
         <w:pStyle w:val="Heading2"/>
       </w:pPr>
@@ -4701,7 +4686,7 @@
         <w:rPr>
           <w:i/>
         </w:rPr>
-        <w:t>What we left out, and how we found out.</w:t>
+        <w:t>Inputs we removed.</w:t>
       </w:r>
       <w:r>
         <w:t xml:space="preserve"> Our first version also used the payment channel, the currencies and the hour, and it scored higher. When we counted labels per channel, we found that in this data no wire and no cross-currency transfer is ever labelled as laundering. A model with those inputs would learn that a cross-currency wire, which is exactly what every StudyRoute payment is, is the safest thing there is. That is a habit of the data generator, not a fact about money, so we removed those inputs. Dropping the channel inputs cost nothin</w:t>
@@ -5654,10 +5639,10 @@
     <w:p/>
     <w:p>
       <w:r>
-        <w:t>By our own rule (choose on the tuning period only), XGBoost on thirteen inputs comes first, yet on the test period it is no better than the network we shipped, within noise (0.448 against 0.437); neighbouring models differ by about 0.02 average precision, which is within noise with 1,797 flagged transactions. The thirteen-input variants do score higher than our shipped network on both periods, so why did we not ship one? Honestly, time. They need five more inputs computed from payment history at run time, a</w:t>
-      </w:r>
-      <w:r>
-        <w:t>nd the review desk would have needed re-testing, which we could not finish before the freeze. We chose to publish the comparison rather than leave it out, and adopting them is first on our list of improvements.</w:t>
+        <w:t xml:space="preserve">By our own rule (choose on the tuning period only), XGBoost on thirteen inputs comes first, yet on the test period it is no better than the network we shipped, within noise (0.448 against 0.437); neighbouring models differ by about 0.02 average precision, which is within noise with 1,797 flagged transactions. The thirteen-input variants score higher than our shipped network on both periods. We did not ship one because they need five more inputs computed from payment history at run time, and the review desk </w:t>
+      </w:r>
+      <w:r>
+        <w:t>would have needed re-testing before the freeze. Adopting them is first on our list of improvements.</w:t>
       </w:r>
     </w:p>
     <w:p>
@@ -5732,7 +5717,7 @@
           <w:noProof/>
         </w:rPr>
         <w:drawing>
-          <wp:inline distT="0" distB="0" distL="0" distR="0" wp14:anchorId="67163CC8" wp14:editId="5B26B87E">
+          <wp:inline distT="0" distB="0" distL="0" distR="0" wp14:anchorId="4BA9F566" wp14:editId="5238337A">
             <wp:extent cx="5394960" cy="4361173"/>
             <wp:effectExtent l="0" t="0" r="0" b="0"/>
             <wp:docPr id="4" name="Picture 4"/>
@@ -5832,7 +5817,7 @@
           <w:noProof/>
         </w:rPr>
         <w:drawing>
-          <wp:inline distT="0" distB="0" distL="0" distR="0" wp14:anchorId="7780B2EE" wp14:editId="1F5D49A7">
+          <wp:inline distT="0" distB="0" distL="0" distR="0" wp14:anchorId="511BBEF6" wp14:editId="3079D5EF">
             <wp:extent cx="5394960" cy="1241216"/>
             <wp:effectExtent l="0" t="0" r="0" b="0"/>
             <wp:docPr id="5" name="Picture 5"/>
@@ -5949,10 +5934,7 @@
     </w:p>
     <w:p>
       <w:r>
-        <w:t>We want to be clear that the chain is tamper-evident, not tamper-proof. The audit events and the simulated chain's log live in the same SQLite file, so someone who owns that file could rewrite and re-hash both consistently, and one of our regression tests shows exactly that. What catches it is a checkpoint stored outside the database (the audit_checkpoint.py script). The simulated chain gives us a second anchor and lets us explore on-chain ideas, but it adds no independent security: it has no peers, no cons</w:t>
-      </w:r>
-      <w:r>
-        <w:t>ensus and no keys.</w:t>
+        <w:t>The chain is tamper-evident rather than tamper-proof. The audit events and the simulated chain's log live in the same SQLite file, so someone who owns that file could rewrite and re-hash both consistently, and one of our regression tests shows exactly that. What catches it is a checkpoint stored outside the database (the audit_checkpoint.py script). The simulated chain gives us a second anchor and lets us explore on-chain ideas, but it adds no independent security: it has no peers, no consensus and no keys.</w:t>
       </w:r>
     </w:p>
     <w:p>
@@ -6500,7 +6482,7 @@
     <w:p/>
     <w:p>
       <w:r>
-        <w:t>Eight gates stand between this sandbox and any use with real money or real people: secret custody, real identity and access, HTTPS and ingress, persistence and restore, independently held integrity checkpoints, supply-chain checks, licensed real-world integration, and independent assurance. We have not established any of them yet, and we say so plainly.</w:t>
+        <w:t>Eight gates stand between this sandbox and any use with real money or real people: secret custody, real identity and access, HTTPS and ingress, persistence and restore, independently held integrity checkpoints, supply-chain checks, licensed real-world integration, and independent assurance. None of them is in place yet.</w:t>
       </w:r>
     </w:p>
     <w:p>
@@ -6525,7 +6507,7 @@
           <w:noProof/>
         </w:rPr>
         <w:drawing>
-          <wp:inline distT="0" distB="0" distL="0" distR="0" wp14:anchorId="58DF4270" wp14:editId="0804BA6D">
+          <wp:inline distT="0" distB="0" distL="0" distR="0" wp14:anchorId="4D11013F" wp14:editId="2069BC68">
             <wp:extent cx="5394960" cy="3493761"/>
             <wp:effectExtent l="0" t="0" r="0" b="0"/>
             <wp:docPr id="6" name="Picture 6"/>
@@ -7046,13 +7028,7 @@
     </w:p>
     <w:p>
       <w:r>
-        <w:rPr>
-          <w:i/>
-        </w:rPr>
-        <w:t>What our evidence does not show.</w:t>
-      </w:r>
-      <w:r>
-        <w:t xml:space="preserve"> We wrote the attack tools ourselves, and no outside penetration test has been done. No real user has used the system. We have not compared our rates and fees with real quotes. The Docker run used the archive of an earlier commit with the two fixed files copied in. The trained models were measured on synthetic or mapped data. A separately prepared execution evidence report repeats the backend run on Linux (1,672 passed on the downloaded main archive) and recomputes the audit chain outside the application.</w:t>
+        <w:t>The Docker run used the archive of an earlier commit with the two fixed files copied in. A separately prepared execution evidence report repeats the backend run on Linux (1,672 passed on the downloaded main archive) and recomputes the audit chain outside the application. Section 6 lists what this evidence does not cover.</w:t>
       </w:r>
     </w:p>
     <w:p>
@@ -7891,31 +7867,31 @@
       </w:rPr>
     </w:lvl>
   </w:abstractNum>
-  <w:num w:numId="1" w16cid:durableId="974140431">
+  <w:num w:numId="1" w16cid:durableId="1009333115">
     <w:abstractNumId w:val="8"/>
   </w:num>
-  <w:num w:numId="2" w16cid:durableId="1518429021">
+  <w:num w:numId="2" w16cid:durableId="1975791654">
     <w:abstractNumId w:val="6"/>
   </w:num>
-  <w:num w:numId="3" w16cid:durableId="1131483650">
+  <w:num w:numId="3" w16cid:durableId="653264013">
     <w:abstractNumId w:val="5"/>
   </w:num>
-  <w:num w:numId="4" w16cid:durableId="1610890355">
+  <w:num w:numId="4" w16cid:durableId="781001660">
     <w:abstractNumId w:val="4"/>
   </w:num>
-  <w:num w:numId="5" w16cid:durableId="319702271">
+  <w:num w:numId="5" w16cid:durableId="1864174528">
     <w:abstractNumId w:val="7"/>
   </w:num>
-  <w:num w:numId="6" w16cid:durableId="946305192">
+  <w:num w:numId="6" w16cid:durableId="1485046703">
     <w:abstractNumId w:val="3"/>
   </w:num>
-  <w:num w:numId="7" w16cid:durableId="1014190200">
+  <w:num w:numId="7" w16cid:durableId="1043403829">
     <w:abstractNumId w:val="2"/>
   </w:num>
-  <w:num w:numId="8" w16cid:durableId="332223559">
+  <w:num w:numId="8" w16cid:durableId="41100344">
     <w:abstractNumId w:val="1"/>
   </w:num>
-  <w:num w:numId="9" w16cid:durableId="674261557">
+  <w:num w:numId="9" w16cid:durableId="696321567">
     <w:abstractNumId w:val="0"/>
   </w:num>
 </w:numbering>

</xml_diff>

<commit_message>
docs: add two live-site screenshots to the technical documentation (section 1.7); keep captions with their pictures
</commit_message>
<xml_diff>
--- a/submission/StudyRoute_Technical_Documentation.docx
+++ b/submission/StudyRoute_Technical_Documentation.docx
@@ -1247,7 +1247,7 @@
           <w:noProof/>
         </w:rPr>
         <w:drawing>
-          <wp:inline distT="0" distB="0" distL="0" distR="0" wp14:anchorId="6CDD2A4A" wp14:editId="7BAC569C">
+          <wp:inline distT="0" distB="0" distL="0" distR="0" wp14:anchorId="5F5058AA" wp14:editId="28664EBF">
             <wp:extent cx="5394960" cy="2253223"/>
             <wp:effectExtent l="0" t="0" r="0" b="0"/>
             <wp:docPr id="1" name="Picture 1"/>
@@ -2383,7 +2383,7 @@
           <w:noProof/>
         </w:rPr>
         <w:drawing>
-          <wp:inline distT="0" distB="0" distL="0" distR="0" wp14:anchorId="1D839716" wp14:editId="5C47D692">
+          <wp:inline distT="0" distB="0" distL="0" distR="0" wp14:anchorId="77E7B8D2" wp14:editId="0FAA3C6A">
             <wp:extent cx="5394960" cy="1687290"/>
             <wp:effectExtent l="0" t="0" r="0" b="0"/>
             <wp:docPr id="2" name="Picture 2"/>
@@ -2552,6 +2552,119 @@
     </w:p>
     <w:p>
       <w:pPr>
+        <w:pStyle w:val="Heading2"/>
+      </w:pPr>
+      <w:r>
+        <w:t>1.7 The product on the live site</w:t>
+      </w:r>
+    </w:p>
+    <w:p>
+      <w:r>
+        <w:t>We also run the sandbox publicly at https://studyroute.bot-keep.xyz, with synthetic data only. We took the two screenshots below there on 19 October 2026.</w:t>
+      </w:r>
+    </w:p>
+    <w:p>
+      <w:r>
+        <w:rPr>
+          <w:i/>
+        </w:rPr>
+        <w:t>The comparison a parent sees for GBP 10,000 of UK tuition. The ranking is the one our test T01 asserts: B at 1.58%, C at 1.63% with a GBP 35 shortfall warning, and A at 2.16%.</w:t>
+      </w:r>
+    </w:p>
+    <w:p>
+      <w:r>
+        <w:rPr>
+          <w:noProof/>
+        </w:rPr>
+        <w:drawing>
+          <wp:inline distT="0" distB="0" distL="0" distR="0" wp14:anchorId="10DC662F" wp14:editId="7248CAF9">
+            <wp:extent cx="5394960" cy="3182822"/>
+            <wp:effectExtent l="0" t="0" r="0" b="0"/>
+            <wp:docPr id="3" name="Picture 3"/>
+            <wp:cNvGraphicFramePr>
+              <a:graphicFrameLocks xmlns:a="http://schemas.openxmlformats.org/drawingml/2006/main" noChangeAspect="1"/>
+            </wp:cNvGraphicFramePr>
+            <a:graphic xmlns:a="http://schemas.openxmlformats.org/drawingml/2006/main">
+              <a:graphicData uri="http://schemas.openxmlformats.org/drawingml/2006/picture">
+                <pic:pic xmlns:pic="http://schemas.openxmlformats.org/drawingml/2006/picture">
+                  <pic:nvPicPr>
+                    <pic:cNvPr id="0" name="live-01-compare-quotes.png"/>
+                    <pic:cNvPicPr/>
+                  </pic:nvPicPr>
+                  <pic:blipFill>
+                    <a:blip r:embed="rId10"/>
+                    <a:stretch>
+                      <a:fillRect/>
+                    </a:stretch>
+                  </pic:blipFill>
+                  <pic:spPr>
+                    <a:xfrm>
+                      <a:off x="0" y="0"/>
+                      <a:ext cx="5394960" cy="3182822"/>
+                    </a:xfrm>
+                    <a:prstGeom prst="rect">
+                      <a:avLst/>
+                    </a:prstGeom>
+                  </pic:spPr>
+                </pic:pic>
+              </a:graphicData>
+            </a:graphic>
+          </wp:inline>
+        </w:drawing>
+      </w:r>
+    </w:p>
+    <w:p>
+      <w:r>
+        <w:rPr>
+          <w:i/>
+        </w:rPr>
+        <w:t>The reviewer's audit log. Verify the hash chain recomputes every event and reports PASS.</w:t>
+      </w:r>
+    </w:p>
+    <w:p>
+      <w:r>
+        <w:rPr>
+          <w:noProof/>
+        </w:rPr>
+        <w:drawing>
+          <wp:inline distT="0" distB="0" distL="0" distR="0" wp14:anchorId="6D9FB19C" wp14:editId="226D90F4">
+            <wp:extent cx="5394960" cy="1648460"/>
+            <wp:effectExtent l="0" t="0" r="0" b="0"/>
+            <wp:docPr id="4" name="Picture 4"/>
+            <wp:cNvGraphicFramePr>
+              <a:graphicFrameLocks xmlns:a="http://schemas.openxmlformats.org/drawingml/2006/main" noChangeAspect="1"/>
+            </wp:cNvGraphicFramePr>
+            <a:graphic xmlns:a="http://schemas.openxmlformats.org/drawingml/2006/main">
+              <a:graphicData uri="http://schemas.openxmlformats.org/drawingml/2006/picture">
+                <pic:pic xmlns:pic="http://schemas.openxmlformats.org/drawingml/2006/picture">
+                  <pic:nvPicPr>
+                    <pic:cNvPr id="0" name="live-05-audit-verify.png"/>
+                    <pic:cNvPicPr/>
+                  </pic:nvPicPr>
+                  <pic:blipFill>
+                    <a:blip r:embed="rId11"/>
+                    <a:stretch>
+                      <a:fillRect/>
+                    </a:stretch>
+                  </pic:blipFill>
+                  <pic:spPr>
+                    <a:xfrm>
+                      <a:off x="0" y="0"/>
+                      <a:ext cx="5394960" cy="1648460"/>
+                    </a:xfrm>
+                    <a:prstGeom prst="rect">
+                      <a:avLst/>
+                    </a:prstGeom>
+                  </pic:spPr>
+                </pic:pic>
+              </a:graphicData>
+            </a:graphic>
+          </wp:inline>
+        </w:drawing>
+      </w:r>
+    </w:p>
+    <w:p>
+      <w:pPr>
         <w:pStyle w:val="Heading1"/>
       </w:pPr>
       <w:r>
@@ -2596,12 +2709,6 @@
           <w:sz w:val="16"/>
         </w:rPr>
         <w:br/>
-      </w:r>
-      <w:r>
-        <w:rPr>
-          <w:rFonts w:ascii="Consolas" w:hAnsi="Consolas"/>
-          <w:sz w:val="16"/>
-        </w:rPr>
         <w:t>if charge_code == OUR:   sender_extra_bdt = (intermediary_fee + receiving_fee) * m ; shortfall = 0</w:t>
       </w:r>
       <w:r>
@@ -2610,6 +2717,12 @@
           <w:sz w:val="16"/>
         </w:rPr>
         <w:br/>
+      </w:r>
+      <w:r>
+        <w:rPr>
+          <w:rFonts w:ascii="Consolas" w:hAnsi="Consolas"/>
+          <w:sz w:val="16"/>
+        </w:rPr>
         <w:t>else (SHA or BEN):       sender_extra_bdt = 0 ; shortfall_foreign = intermediary_fee + receiving_fee</w:t>
       </w:r>
       <w:r>
@@ -2650,12 +2763,6 @@
           <w:sz w:val="16"/>
         </w:rPr>
         <w:br/>
-      </w:r>
-      <w:r>
-        <w:rPr>
-          <w:rFonts w:ascii="Consolas" w:hAnsi="Consolas"/>
-          <w:sz w:val="16"/>
-        </w:rPr>
         <w:t>parent_pays_bdt    = T * provider_rate + fixed_fee + swift_fee + sender_extra</w:t>
       </w:r>
     </w:p>
@@ -3325,10 +3432,10 @@
           <w:noProof/>
         </w:rPr>
         <w:drawing>
-          <wp:inline distT="0" distB="0" distL="0" distR="0" wp14:anchorId="4AFF85FD" wp14:editId="47C42AC7">
+          <wp:inline distT="0" distB="0" distL="0" distR="0" wp14:anchorId="605EAE0A" wp14:editId="2B47A7D3">
             <wp:extent cx="5394960" cy="2357583"/>
             <wp:effectExtent l="0" t="0" r="0" b="0"/>
-            <wp:docPr id="3" name="Picture 3"/>
+            <wp:docPr id="5" name="Picture 5"/>
             <wp:cNvGraphicFramePr>
               <a:graphicFrameLocks xmlns:a="http://schemas.openxmlformats.org/drawingml/2006/main" noChangeAspect="1"/>
             </wp:cNvGraphicFramePr>
@@ -3340,7 +3447,7 @@
                     <pic:cNvPicPr/>
                   </pic:nvPicPr>
                   <pic:blipFill>
-                    <a:blip r:embed="rId10"/>
+                    <a:blip r:embed="rId12"/>
                     <a:stretch>
                       <a:fillRect/>
                     </a:stretch>
@@ -5717,10 +5824,10 @@
           <w:noProof/>
         </w:rPr>
         <w:drawing>
-          <wp:inline distT="0" distB="0" distL="0" distR="0" wp14:anchorId="4BA9F566" wp14:editId="5238337A">
+          <wp:inline distT="0" distB="0" distL="0" distR="0" wp14:anchorId="76FE1C98" wp14:editId="0D9BF659">
             <wp:extent cx="5394960" cy="4361173"/>
             <wp:effectExtent l="0" t="0" r="0" b="0"/>
-            <wp:docPr id="4" name="Picture 4"/>
+            <wp:docPr id="6" name="Picture 6"/>
             <wp:cNvGraphicFramePr>
               <a:graphicFrameLocks xmlns:a="http://schemas.openxmlformats.org/drawingml/2006/main" noChangeAspect="1"/>
             </wp:cNvGraphicFramePr>
@@ -5732,7 +5839,7 @@
                     <pic:cNvPicPr/>
                   </pic:nvPicPr>
                   <pic:blipFill>
-                    <a:blip r:embed="rId11"/>
+                    <a:blip r:embed="rId13"/>
                     <a:stretch>
                       <a:fillRect/>
                     </a:stretch>
@@ -5817,10 +5924,10 @@
           <w:noProof/>
         </w:rPr>
         <w:drawing>
-          <wp:inline distT="0" distB="0" distL="0" distR="0" wp14:anchorId="511BBEF6" wp14:editId="3079D5EF">
+          <wp:inline distT="0" distB="0" distL="0" distR="0" wp14:anchorId="33466303" wp14:editId="2E514A26">
             <wp:extent cx="5394960" cy="1241216"/>
             <wp:effectExtent l="0" t="0" r="0" b="0"/>
-            <wp:docPr id="5" name="Picture 5"/>
+            <wp:docPr id="7" name="Picture 7"/>
             <wp:cNvGraphicFramePr>
               <a:graphicFrameLocks xmlns:a="http://schemas.openxmlformats.org/drawingml/2006/main" noChangeAspect="1"/>
             </wp:cNvGraphicFramePr>
@@ -5832,7 +5939,7 @@
                     <pic:cNvPicPr/>
                   </pic:nvPicPr>
                   <pic:blipFill>
-                    <a:blip r:embed="rId12"/>
+                    <a:blip r:embed="rId14"/>
                     <a:stretch>
                       <a:fillRect/>
                     </a:stretch>
@@ -6507,10 +6614,10 @@
           <w:noProof/>
         </w:rPr>
         <w:drawing>
-          <wp:inline distT="0" distB="0" distL="0" distR="0" wp14:anchorId="4D11013F" wp14:editId="2069BC68">
+          <wp:inline distT="0" distB="0" distL="0" distR="0" wp14:anchorId="7F966865" wp14:editId="482FEDAA">
             <wp:extent cx="5394960" cy="3493761"/>
             <wp:effectExtent l="0" t="0" r="0" b="0"/>
-            <wp:docPr id="6" name="Picture 6"/>
+            <wp:docPr id="8" name="Picture 8"/>
             <wp:cNvGraphicFramePr>
               <a:graphicFrameLocks xmlns:a="http://schemas.openxmlformats.org/drawingml/2006/main" noChangeAspect="1"/>
             </wp:cNvGraphicFramePr>
@@ -6522,7 +6629,7 @@
                     <pic:cNvPicPr/>
                   </pic:nvPicPr>
                   <pic:blipFill>
-                    <a:blip r:embed="rId13"/>
+                    <a:blip r:embed="rId15"/>
                     <a:stretch>
                       <a:fillRect/>
                     </a:stretch>
@@ -7587,7 +7694,7 @@
       </w:r>
     </w:p>
     <w:sectPr>
-      <w:footerReference w:type="default" r:id="rId14"/>
+      <w:footerReference w:type="default" r:id="rId16"/>
       <w:pgSz w:w="12240" w:h="15840"/>
       <w:pgMar w:top="1152" w:right="1152" w:bottom="1152" w:left="1152" w:header="720" w:footer="720" w:gutter="0"/>
       <w:cols w:space="720"/>
@@ -7867,31 +7974,31 @@
       </w:rPr>
     </w:lvl>
   </w:abstractNum>
-  <w:num w:numId="1" w16cid:durableId="1009333115">
+  <w:num w:numId="1" w16cid:durableId="740296996">
     <w:abstractNumId w:val="8"/>
   </w:num>
-  <w:num w:numId="2" w16cid:durableId="1975791654">
+  <w:num w:numId="2" w16cid:durableId="1423337014">
     <w:abstractNumId w:val="6"/>
   </w:num>
-  <w:num w:numId="3" w16cid:durableId="653264013">
+  <w:num w:numId="3" w16cid:durableId="986860030">
     <w:abstractNumId w:val="5"/>
   </w:num>
-  <w:num w:numId="4" w16cid:durableId="781001660">
+  <w:num w:numId="4" w16cid:durableId="1036270844">
     <w:abstractNumId w:val="4"/>
   </w:num>
-  <w:num w:numId="5" w16cid:durableId="1864174528">
+  <w:num w:numId="5" w16cid:durableId="1736587140">
     <w:abstractNumId w:val="7"/>
   </w:num>
-  <w:num w:numId="6" w16cid:durableId="1485046703">
+  <w:num w:numId="6" w16cid:durableId="1258829902">
     <w:abstractNumId w:val="3"/>
   </w:num>
-  <w:num w:numId="7" w16cid:durableId="1043403829">
+  <w:num w:numId="7" w16cid:durableId="1384134092">
     <w:abstractNumId w:val="2"/>
   </w:num>
-  <w:num w:numId="8" w16cid:durableId="41100344">
+  <w:num w:numId="8" w16cid:durableId="1654749013">
     <w:abstractNumId w:val="1"/>
   </w:num>
-  <w:num w:numId="9" w16cid:durableId="696321567">
+  <w:num w:numId="9" w16cid:durableId="517889182">
     <w:abstractNumId w:val="0"/>
   </w:num>
 </w:numbering>

</xml_diff>

<commit_message>
docs+tests: close the fixture gap, add a 25-prompt assistant suite, and fix the report's open points
- Track backend/tests/data/explainer_cases.json (narrow .gitignore exception), so a fresh clone runs every test;
  the "reproducibility gap" paragraph is gone and all counts read 1,705 (1,704 pass, 1 symlink skip on Windows).
- New backend/tests/test_prompt_suite.py: 25 prompts with the intent, tool proposal and safety outcome each must
  produce (6 attacks blocked); 25 of 25 pass, reported in the summary and in section 5.
- Technical documentation: Bangla/Banglish support stated as it is; the plan's tool names mapped to the shipped
  tools; the five extra risk inputs named (all payment history, none of the removed artifact inputs); one line on
  who owned what; dated 19 October 2026.
- Deck, outline, TEST_CASES and the start page carry the same counts. Release manifest regenerated.
</commit_message>
<xml_diff>
--- a/submission/StudyRoute_Technical_Documentation.docx
+++ b/submission/StudyRoute_Technical_Documentation.docx
@@ -28,7 +28,7 @@
     </w:p>
     <w:p>
       <w:r>
-        <w:t>SR-TEC-2026-01  |  18 October 2026  |  Team TeamEkxin</w:t>
+        <w:t>SR-TEC-2026-01  |  19 October 2026  |  Team TeamEkxin</w:t>
       </w:r>
     </w:p>
     <w:p>
@@ -374,12 +374,12 @@
         <w:t>Evidence you can re-run.</w:t>
       </w:r>
       <w:r>
-        <w:t xml:space="preserve"> On a machine that has the</w:t>
+        <w:t xml:space="preserve"> 1,705 backend tests (1,704 pass on Windows, where one symlink test is</w:t>
       </w:r>
     </w:p>
     <w:p>
       <w:r>
-        <w:t>explainer fixture there are 1,679 backend tests (1,678 pass, 1 skipped). A fresh clone collects 1,673, runs 1,672 and skips one module, because .gitignore excludes that module's fixture. There are also 463 web tests (439 in an earlier pre-merge log) and 24 browser tests, all mapped to 24 scenarios, plus a 146-attack black-box probe, a run in Docker, and a record of what those runs found, including a defect.</w:t>
+        <w:t>skipped), including a 25-prompt assistant suite; 463 web tests and 24 browser tests; all 24 blueprint scenarios pass. On top of that come a 146-attack black-box probe, a run in Docker, and a record of what those runs found, including a defect.</w:t>
       </w:r>
     </w:p>
     <w:p>
@@ -520,7 +520,7 @@
               <w:rPr>
                 <w:sz w:val="17"/>
               </w:rPr>
-              <w:t>1,679 on a fixture-complete machine (1,678 pass, 1 skipped); fresh clone: 1,673 collected, 1,672 pass, 1 skip</w:t>
+              <w:t>1,705 (1,704 pass, 1 skipped on Windows); 24 of 24 blueprint scenarios pass</w:t>
             </w:r>
           </w:p>
         </w:tc>
@@ -534,7 +534,7 @@
               <w:rPr>
                 <w:sz w:val="17"/>
               </w:rPr>
-              <w:t>One or more tests for each of 24 scenarios; section 5 explains the fixture gap</w:t>
+              <w:t>The same count on a fresh clone</w:t>
             </w:r>
           </w:p>
         </w:tc>
@@ -549,7 +549,7 @@
               <w:rPr>
                 <w:sz w:val="17"/>
               </w:rPr>
-              <w:t>Black-box attack probe</w:t>
+              <w:t>Assistant prompt suite, 25 prompts</w:t>
             </w:r>
           </w:p>
         </w:tc>
@@ -562,7 +562,7 @@
               <w:rPr>
                 <w:sz w:val="17"/>
               </w:rPr>
-              <w:t>146 of 146 defended; real-browser audit 48 of 48</w:t>
+              <w:t>25 of 25 give the expected intent, tool and safety outcome (6 attacks blocked, nothing proposed)</w:t>
             </w:r>
           </w:p>
         </w:tc>
@@ -575,7 +575,7 @@
               <w:rPr>
                 <w:sz w:val="17"/>
               </w:rPr>
-              <w:t>We wrote these tools ourselves; not independent</w:t>
+              <w:t>Our own prompts (test_prompt_suite.py)</w:t>
             </w:r>
           </w:p>
         </w:tc>
@@ -591,7 +591,7 @@
               <w:rPr>
                 <w:sz w:val="17"/>
               </w:rPr>
-              <w:t>Reader against rules, 113 frozen hand-written messages</w:t>
+              <w:t>Black-box attack probe</w:t>
             </w:r>
           </w:p>
         </w:tc>
@@ -605,7 +605,7 @@
               <w:rPr>
                 <w:sz w:val="17"/>
               </w:rPr>
-              <w:t>Intent 88.5% against 61.1%; plan read exactly 100% against 57.6%; attacks blocked 92.9% against 28.6%</w:t>
+              <w:t>146 of 146 defended; real-browser audit 48 of 48</w:t>
             </w:r>
           </w:p>
         </w:tc>
@@ -619,7 +619,7 @@
               <w:rPr>
                 <w:sz w:val="17"/>
               </w:rPr>
-              <w:t>Small sample, about plus or minus 7 points</w:t>
+              <w:t>We wrote these tools ourselves; not independent</w:t>
             </w:r>
           </w:p>
         </w:tc>
@@ -634,7 +634,7 @@
               <w:rPr>
                 <w:sz w:val="17"/>
               </w:rPr>
-              <w:t>Dialogue policy against plan-at-once, simulated parents</w:t>
+              <w:t>Reader against rules, 113 frozen hand-written messages</w:t>
             </w:r>
           </w:p>
         </w:tc>
@@ -647,7 +647,7 @@
               <w:rPr>
                 <w:sz w:val="17"/>
               </w:rPr>
-              <w:t>Wrong plans 0.8% against 2.8%; 1.17 questions against 0.44</w:t>
+              <w:t>Intent 88.5% against 61.1%; plan read exactly 100% against 57.6%; attacks blocked 92.9% against 28.6%</w:t>
             </w:r>
           </w:p>
         </w:tc>
@@ -660,7 +660,7 @@
               <w:rPr>
                 <w:sz w:val="17"/>
               </w:rPr>
-              <w:t>The simulator is our own assumption</w:t>
+              <w:t>Small sample, about plus or minus 7 points</w:t>
             </w:r>
           </w:p>
         </w:tc>
@@ -676,7 +676,7 @@
               <w:rPr>
                 <w:sz w:val="17"/>
               </w:rPr>
-              <w:t>Explainer, 700 held-out questions</w:t>
+              <w:t>Dialogue policy against plan-at-once, simulated parents</w:t>
             </w:r>
           </w:p>
         </w:tc>
@@ -690,7 +690,7 @@
               <w:rPr>
                 <w:sz w:val="17"/>
               </w:rPr>
-              <w:t>80.9% of answers pass every check; 0.4% invented a figure; what a person reads has 100% figure precision</w:t>
+              <w:t>Wrong plans 0.8% against 2.8%; 1.17 questions against 0.44</w:t>
             </w:r>
           </w:p>
         </w:tc>
@@ -704,7 +704,7 @@
               <w:rPr>
                 <w:sz w:val="17"/>
               </w:rPr>
-              <w:t>It mostly rewords; see 2.10</w:t>
+              <w:t>The simulator is our own assumption</w:t>
             </w:r>
           </w:p>
         </w:tc>
@@ -719,6 +719,48 @@
               <w:rPr>
                 <w:sz w:val="17"/>
               </w:rPr>
+              <w:t>Explainer, 700 held-out questions</w:t>
+            </w:r>
+          </w:p>
+        </w:tc>
+        <w:tc>
+          <w:tcPr>
+            <w:tcW w:w="3312" w:type="dxa"/>
+          </w:tcPr>
+          <w:p>
+            <w:r>
+              <w:rPr>
+                <w:sz w:val="17"/>
+              </w:rPr>
+              <w:t>80.9% of answers pass every check; 0.4% invented a figure; what a person reads has 100% figure precision</w:t>
+            </w:r>
+          </w:p>
+        </w:tc>
+        <w:tc>
+          <w:tcPr>
+            <w:tcW w:w="3312" w:type="dxa"/>
+          </w:tcPr>
+          <w:p>
+            <w:r>
+              <w:rPr>
+                <w:sz w:val="17"/>
+              </w:rPr>
+              <w:t>It mostly rewords; see 2.10</w:t>
+            </w:r>
+          </w:p>
+        </w:tc>
+      </w:tr>
+      <w:tr>
+        <w:tc>
+          <w:tcPr>
+            <w:tcW w:w="3312" w:type="dxa"/>
+            <w:shd w:val="clear" w:color="auto" w:fill="F0F5F8"/>
+          </w:tcPr>
+          <w:p>
+            <w:r>
+              <w:rPr>
+                <w:sz w:val="17"/>
+              </w:rPr>
               <w:t>Review router, on a later period it never saw</w:t>
             </w:r>
           </w:p>
@@ -726,6 +768,7 @@
         <w:tc>
           <w:tcPr>
             <w:tcW w:w="3312" w:type="dxa"/>
+            <w:shd w:val="clear" w:color="auto" w:fill="F0F5F8"/>
           </w:tcPr>
           <w:p>
             <w:r>
@@ -739,6 +782,7 @@
         <w:tc>
           <w:tcPr>
             <w:tcW w:w="3312" w:type="dxa"/>
+            <w:shd w:val="clear" w:color="auto" w:fill="F0F5F8"/>
           </w:tcPr>
           <w:p>
             <w:r>
@@ -1247,7 +1291,7 @@
           <w:noProof/>
         </w:rPr>
         <w:drawing>
-          <wp:inline distT="0" distB="0" distL="0" distR="0" wp14:anchorId="5F5058AA" wp14:editId="28664EBF">
+          <wp:inline distT="0" distB="0" distL="0" distR="0" wp14:anchorId="336361D7" wp14:editId="06AD45BB">
             <wp:extent cx="5394960" cy="2253223"/>
             <wp:effectExtent l="0" t="0" r="0" b="0"/>
             <wp:docPr id="1" name="Picture 1"/>
@@ -2383,7 +2427,7 @@
           <w:noProof/>
         </w:rPr>
         <w:drawing>
-          <wp:inline distT="0" distB="0" distL="0" distR="0" wp14:anchorId="77E7B8D2" wp14:editId="0FAA3C6A">
+          <wp:inline distT="0" distB="0" distL="0" distR="0" wp14:anchorId="4058DB7E" wp14:editId="2BE95255">
             <wp:extent cx="5394960" cy="1687290"/>
             <wp:effectExtent l="0" t="0" r="0" b="0"/>
             <wp:docPr id="2" name="Picture 2"/>
@@ -2577,7 +2621,7 @@
           <w:noProof/>
         </w:rPr>
         <w:drawing>
-          <wp:inline distT="0" distB="0" distL="0" distR="0" wp14:anchorId="10DC662F" wp14:editId="7248CAF9">
+          <wp:inline distT="0" distB="0" distL="0" distR="0" wp14:anchorId="31084D63" wp14:editId="268DA5E2">
             <wp:extent cx="5394960" cy="3182822"/>
             <wp:effectExtent l="0" t="0" r="0" b="0"/>
             <wp:docPr id="3" name="Picture 3"/>
@@ -2627,7 +2671,7 @@
           <w:noProof/>
         </w:rPr>
         <w:drawing>
-          <wp:inline distT="0" distB="0" distL="0" distR="0" wp14:anchorId="6D9FB19C" wp14:editId="226D90F4">
+          <wp:inline distT="0" distB="0" distL="0" distR="0" wp14:anchorId="23219D8E" wp14:editId="5BA60AE1">
             <wp:extent cx="5394960" cy="1648460"/>
             <wp:effectExtent l="0" t="0" r="0" b="0"/>
             <wp:docPr id="4" name="Picture 4"/>
@@ -3432,7 +3476,7 @@
           <w:noProof/>
         </w:rPr>
         <w:drawing>
-          <wp:inline distT="0" distB="0" distL="0" distR="0" wp14:anchorId="605EAE0A" wp14:editId="2B47A7D3">
+          <wp:inline distT="0" distB="0" distL="0" distR="0" wp14:anchorId="0BFC3FB8" wp14:editId="6725317C">
             <wp:extent cx="5394960" cy="2357583"/>
             <wp:effectExtent l="0" t="0" r="0" b="0"/>
             <wp:docPr id="5" name="Picture 5"/>
@@ -3594,7 +3638,10 @@
     </w:p>
     <w:p>
       <w:r>
-        <w:t>cancelling, changing a limit, allowlisting and editing configuration are simply not available to it.</w:t>
+        <w:t>cancelling, changing a limit, allowlisting and editing configuration are simply not available to it. The read-only tools are get_quotes, explain_cost, get_deadline_plan and get_checklist. In our plan they were named get_quotes, check_deadlines, compute_runway, create_proposal and execute_in_sandbox: check_deadlines became get_deadline_plan, compute_runway is the engine's runway calculation (read-only, no tool of its own), create_proposal became create_draft and request_approval, and execute_in_sandbox is de</w:t>
+      </w:r>
+      <w:r>
+        <w:t>liberately not an AI tool, because only the parent's MFA approval and the provider simulator can move a payment forward.</w:t>
       </w:r>
     </w:p>
     <w:p>
@@ -3647,6 +3694,20 @@
       </w:r>
       <w:r>
         <w:t>when its confidence is at least 0.8, and a confident ATTACK can only add a block, never remove one. Three intents (stress test, student costs, arrival guide) are decided by exact rules, because the model never saw those questions in training. The model has no permissions of its own. On a CPU it takes a median of 18 ms and a 95th percentile of 57 ms per message. If the model file is missing, fails its integrity check or is switched off (NLU_MODE=off), the assistant runs on the rules alone.</w:t>
+      </w:r>
+    </w:p>
+    <w:p>
+      <w:r>
+        <w:rPr>
+          <w:i/>
+        </w:rPr>
+        <w:t>Bangla and Banglish.</w:t>
+      </w:r>
+      <w:r>
+        <w:t xml:space="preserve"> The reply language is chosen for each message: Bengali script, common Banglish words (Bengali written in Latin letters) or an explicit "reply in Bengali" switch the reply language, and "reply in English" switches it back. Greetings and the app overview have Bengali versions in every mode. Other answers are in Bengali or Banglish only when a cloud model is configured, which we have not yet tested against a real provider; the offline templates answer in English. The trained reader is an English model, so pay</w:t>
+      </w:r>
+      <w:r>
+        <w:t>ment requests are read most reliably in English, and the assistant asks for any value it cannot read.</w:t>
       </w:r>
     </w:p>
     <w:p>
@@ -5746,10 +5807,10 @@
     <w:p/>
     <w:p>
       <w:r>
-        <w:t xml:space="preserve">By our own rule (choose on the tuning period only), XGBoost on thirteen inputs comes first, yet on the test period it is no better than the network we shipped, within noise (0.448 against 0.437); neighbouring models differ by about 0.02 average precision, which is within noise with 1,797 flagged transactions. The thirteen-input variants score higher than our shipped network on both periods. We did not ship one because they need five more inputs computed from payment history at run time, and the review desk </w:t>
-      </w:r>
-      <w:r>
-        <w:t>would have needed re-testing before the freeze. Adopting them is first on our list of improvements.</w:t>
+        <w:t>By our own rule (choose on the tuning period only), XGBoost on thirteen inputs comes first, yet on the test period it is no better than the network we shipped, within noise (0.448 against 0.437); neighbouring models differ by about 0.02 average precision, which is within noise with 1,797 flagged transactions. The thirteen-input variants score higher than our shipped network on both periods. Their five extra inputs all come from the household's payment history: payments to the same receiver in the last 24 ho</w:t>
+      </w:r>
+      <w:r>
+        <w:t>urs, new receivers in the last 24 hours and in the last 7 days, hours since the same receiver was last paid, and this amount compared with the previous one. None of them is a channel, currency or time-of-day input, so adopting them does not bring back the generator artifacts we removed. We did not ship one because those inputs must be computed from payment history at run time, and the review desk would have needed re-testing before the freeze. Adopting them is first on our list of improvements.</w:t>
       </w:r>
     </w:p>
     <w:p>
@@ -5824,7 +5885,7 @@
           <w:noProof/>
         </w:rPr>
         <w:drawing>
-          <wp:inline distT="0" distB="0" distL="0" distR="0" wp14:anchorId="76FE1C98" wp14:editId="0D9BF659">
+          <wp:inline distT="0" distB="0" distL="0" distR="0" wp14:anchorId="18E8525E" wp14:editId="23AC9E57">
             <wp:extent cx="5394960" cy="4361173"/>
             <wp:effectExtent l="0" t="0" r="0" b="0"/>
             <wp:docPr id="6" name="Picture 6"/>
@@ -5924,7 +5985,7 @@
           <w:noProof/>
         </w:rPr>
         <w:drawing>
-          <wp:inline distT="0" distB="0" distL="0" distR="0" wp14:anchorId="33466303" wp14:editId="2E514A26">
+          <wp:inline distT="0" distB="0" distL="0" distR="0" wp14:anchorId="3043404E" wp14:editId="1F06BBDE">
             <wp:extent cx="5394960" cy="1241216"/>
             <wp:effectExtent l="0" t="0" r="0" b="0"/>
             <wp:docPr id="7" name="Picture 7"/>
@@ -6614,7 +6675,7 @@
           <w:noProof/>
         </w:rPr>
         <w:drawing>
-          <wp:inline distT="0" distB="0" distL="0" distR="0" wp14:anchorId="7F966865" wp14:editId="482FEDAA">
+          <wp:inline distT="0" distB="0" distL="0" distR="0" wp14:anchorId="6061EAB8" wp14:editId="27768217">
             <wp:extent cx="5394960" cy="3493761"/>
             <wp:effectExtent l="0" t="0" r="0" b="0"/>
             <wp:docPr id="8" name="Picture 8"/>
@@ -6809,7 +6870,7 @@
               <w:rPr>
                 <w:sz w:val="17"/>
               </w:rPr>
-              <w:t>1,679 backend tests on a machine that has the explainer fixture (1,678 pass, 1 skipped); a fresh clone collects 1,673, runs 1,672 and skips one module whose fixture is excluded by .gitignore. 463 web tests (439 in an earlier pre-merge log) and 24 browser tests.</w:t>
+              <w:t>1,705 backend tests (1,704 pass, 1 skipped on Windows); 24 of 24 scenarios pass; 463 web tests (439 in an earlier pre-merge log) and 24 browser tests</w:t>
             </w:r>
           </w:p>
         </w:tc>
@@ -6838,7 +6899,7 @@
               <w:rPr>
                 <w:sz w:val="17"/>
               </w:rPr>
-              <w:t>Demo flow</w:t>
+              <w:t>Assistant prompts</w:t>
             </w:r>
           </w:p>
         </w:tc>
@@ -6852,7 +6913,7 @@
               <w:rPr>
                 <w:sz w:val="17"/>
               </w:rPr>
-              <w:t>A fourteen-step run against a live API</w:t>
+              <w:t>25 prompts with the intent, tool proposal and safety outcome each must produce</w:t>
             </w:r>
           </w:p>
         </w:tc>
@@ -6866,7 +6927,7 @@
               <w:rPr>
                 <w:sz w:val="17"/>
               </w:rPr>
-              <w:t>66 checks OK, none failed</w:t>
+              <w:t>25 of 25 pass</w:t>
             </w:r>
           </w:p>
         </w:tc>
@@ -6880,7 +6941,7 @@
               <w:rPr>
                 <w:sz w:val="17"/>
               </w:rPr>
-              <w:t>sandbox_operation_log.txt</w:t>
+              <w:t>test_prompt_suite.py</w:t>
             </w:r>
           </w:p>
         </w:tc>
@@ -6895,7 +6956,7 @@
               <w:rPr>
                 <w:sz w:val="17"/>
               </w:rPr>
-              <w:t>Black-box attacks</w:t>
+              <w:t>Demo flow</w:t>
             </w:r>
           </w:p>
         </w:tc>
@@ -6908,7 +6969,7 @@
               <w:rPr>
                 <w:sz w:val="17"/>
               </w:rPr>
-              <w:t>Forged tokens, cross-household access, injection, hostile input, webhooks, the bank review desk</w:t>
+              <w:t>A fourteen-step run against a live API</w:t>
             </w:r>
           </w:p>
         </w:tc>
@@ -6921,7 +6982,7 @@
               <w:rPr>
                 <w:sz w:val="17"/>
               </w:rPr>
-              <w:t>146 of 146 defended</w:t>
+              <w:t>66 checks OK, none failed</w:t>
             </w:r>
           </w:p>
         </w:tc>
@@ -6934,7 +6995,7 @@
               <w:rPr>
                 <w:sz w:val="17"/>
               </w:rPr>
-              <w:t>attack_probe.txt</w:t>
+              <w:t>sandbox_operation_log.txt</w:t>
             </w:r>
           </w:p>
         </w:tc>
@@ -6950,7 +7011,7 @@
               <w:rPr>
                 <w:sz w:val="17"/>
               </w:rPr>
-              <w:t>Other probes</w:t>
+              <w:t>Black-box attacks</w:t>
             </w:r>
           </w:p>
         </w:tc>
@@ -6964,7 +7025,7 @@
               <w:rPr>
                 <w:sz w:val="17"/>
               </w:rPr>
-              <w:t>Brute force, data-leak scan, man in the middle, hostile prompts, real Chrome</w:t>
+              <w:t>Forged tokens, cross-household access, injection, hostile input, webhooks, the bank review desk</w:t>
             </w:r>
           </w:p>
         </w:tc>
@@ -6978,7 +7039,7 @@
               <w:rPr>
                 <w:sz w:val="17"/>
               </w:rPr>
-              <w:t>8/8, all clear (50 checks), 14/14, 42/42, 48/48</w:t>
+              <w:t>146 of 146 defended</w:t>
             </w:r>
           </w:p>
         </w:tc>
@@ -6992,7 +7053,7 @@
               <w:rPr>
                 <w:sz w:val="17"/>
               </w:rPr>
-              <w:t>the security_2026-10-18 folder</w:t>
+              <w:t>attack_probe.txt</w:t>
             </w:r>
           </w:p>
         </w:tc>
@@ -7007,7 +7068,7 @@
               <w:rPr>
                 <w:sz w:val="17"/>
               </w:rPr>
-              <w:t>Docker</w:t>
+              <w:t>Other probes</w:t>
             </w:r>
           </w:p>
         </w:tc>
@@ -7020,7 +7081,7 @@
               <w:rPr>
                 <w:sz w:val="17"/>
               </w:rPr>
-              <w:t>Ubuntu 24.04 VM: smoke, demo, bank review demo, browser audit, hardened overlay</w:t>
+              <w:t>Brute force, data-leak scan, man in the middle, hostile prompts, real Chrome</w:t>
             </w:r>
           </w:p>
         </w:tc>
@@ -7033,7 +7094,7 @@
               <w:rPr>
                 <w:sz w:val="17"/>
               </w:rPr>
-              <w:t>All passed after one fix (below)</w:t>
+              <w:t>8/8, all clear (50 checks), 14/14, 42/42, 48/48</w:t>
             </w:r>
           </w:p>
         </w:tc>
@@ -7046,7 +7107,7 @@
               <w:rPr>
                 <w:sz w:val="17"/>
               </w:rPr>
-              <w:t>the docker_2026-10-18 folder</w:t>
+              <w:t>the security_2026-10-18 folder</w:t>
             </w:r>
           </w:p>
         </w:tc>
@@ -7062,7 +7123,7 @@
               <w:rPr>
                 <w:sz w:val="17"/>
               </w:rPr>
-              <w:t>Continuous integration</w:t>
+              <w:t>Docker</w:t>
             </w:r>
           </w:p>
         </w:tc>
@@ -7076,7 +7137,7 @@
               <w:rPr>
                 <w:sz w:val="17"/>
               </w:rPr>
-              <w:t>Six jobs: docker, contracts, web, secret-scan, backend, dependency-audit</w:t>
+              <w:t>Ubuntu 24.04 VM: smoke, demo, bank review demo, browser audit, hardened overlay</w:t>
             </w:r>
           </w:p>
         </w:tc>
@@ -7090,7 +7151,7 @@
               <w:rPr>
                 <w:sz w:val="17"/>
               </w:rPr>
-              <w:t>All succeeded on the final commit</w:t>
+              <w:t>All passed after one fix (below)</w:t>
             </w:r>
           </w:p>
         </w:tc>
@@ -7098,6 +7159,60 @@
           <w:tcPr>
             <w:tcW w:w="2484" w:type="dxa"/>
             <w:shd w:val="clear" w:color="auto" w:fill="F0F5F8"/>
+          </w:tcPr>
+          <w:p>
+            <w:r>
+              <w:rPr>
+                <w:sz w:val="17"/>
+              </w:rPr>
+              <w:t>the docker_2026-10-18 folder</w:t>
+            </w:r>
+          </w:p>
+        </w:tc>
+      </w:tr>
+      <w:tr>
+        <w:tc>
+          <w:tcPr>
+            <w:tcW w:w="2484" w:type="dxa"/>
+          </w:tcPr>
+          <w:p>
+            <w:r>
+              <w:rPr>
+                <w:sz w:val="17"/>
+              </w:rPr>
+              <w:t>Continuous integration</w:t>
+            </w:r>
+          </w:p>
+        </w:tc>
+        <w:tc>
+          <w:tcPr>
+            <w:tcW w:w="2484" w:type="dxa"/>
+          </w:tcPr>
+          <w:p>
+            <w:r>
+              <w:rPr>
+                <w:sz w:val="17"/>
+              </w:rPr>
+              <w:t>Six jobs: docker, contracts, web, secret-scan, backend, dependency-audit</w:t>
+            </w:r>
+          </w:p>
+        </w:tc>
+        <w:tc>
+          <w:tcPr>
+            <w:tcW w:w="2484" w:type="dxa"/>
+          </w:tcPr>
+          <w:p>
+            <w:r>
+              <w:rPr>
+                <w:sz w:val="17"/>
+              </w:rPr>
+              <w:t>All succeeded on the final commit</w:t>
+            </w:r>
+          </w:p>
+        </w:tc>
+        <w:tc>
+          <w:tcPr>
+            <w:tcW w:w="2484" w:type="dxa"/>
           </w:tcPr>
           <w:p>
             <w:r>
@@ -7116,26 +7231,15 @@
         <w:rPr>
           <w:i/>
         </w:rPr>
-        <w:t>A reproducibility gap we found.</w:t>
-      </w:r>
-      <w:r>
-        <w:t xml:space="preserve"> One test module, the explainer quality floor, needs a fixture file (explainer_cases.json) that our .gitignore excludes. A fresh clone therefore collects 1,673 tests, runs 1,672 and skips that module; the 1,679 figure is for a machine that has the file. This explains every test count in this report and in the deck. Adding the file to the repository is on our list.</w:t>
+        <w:t>A defect we found.</w:t>
+      </w:r>
+      <w:r>
+        <w:t xml:space="preserve"> Our first Docker run failed three demo checks, and the same step had failed four in CI. The trained explainer is switched on by default in a container, and it had never run in one before. It reworded the assistant's questions and read-backs badly, and our demo checks wrongly assumed a rewrite is always accepted. We fixed both: questions and read-backs are now shown word for word, and the checks look at the engine's figures instead of exact wording. We kept the failing run as evidence.</w:t>
       </w:r>
     </w:p>
     <w:p>
       <w:r>
-        <w:rPr>
-          <w:i/>
-        </w:rPr>
-        <w:t>A defect we found.</w:t>
-      </w:r>
-      <w:r>
-        <w:t xml:space="preserve"> Our first Docker run failed three demo checks, and the same step had failed four in CI. The trained explainer is switched on by default in a container, and it had never run in one before. It reworded the assistant's questions and read-backs badly, and our demo checks wrongly assumed a rewrite is always accepted. We fixed both: questions and read-backs are now shown word for word, and the checks look at the engine's figures instead of exact wording. We kept the failing run as evidence.</w:t>
-      </w:r>
-    </w:p>
-    <w:p>
-      <w:r>
-        <w:t>The Docker run used the archive of an earlier commit with the two fixed files copied in. A separately prepared execution evidence report repeats the backend run on Linux (1,672 passed on the downloaded main archive) and recomputes the audit chain outside the application. Section 6 lists what this evidence does not cover.</w:t>
+        <w:t>The Docker run used the archive of an earlier commit with the two fixed files copied in. A separately prepared execution evidence report repeated the backend run on Linux on an earlier archive (1,672 passed; the explainer's test questions were not in the repository yet) and recomputes the audit chain outside the application. Section 6 lists what this evidence does not cover.</w:t>
       </w:r>
     </w:p>
     <w:p>
@@ -7275,7 +7379,7 @@
     </w:p>
     <w:p>
       <w:r>
-        <w:t>We used AI coding assistants for large parts of the code, tests and documents, working under our direction; the repair release is recorded in PROVENANCE.md. This report does not break down the work of individual team members.</w:t>
+        <w:t>We used AI coding assistants for large parts of the code, tests and documents, working under our direction; the repair release is recorded in PROVENANCE.md. Within the team, Farhan Labib (lead) owned the product, the engine, the AI components and the documents; Md Redwan Hossen the release hardening, the institution-route checks and the deployment; Kalvin Chakma the interface design; and Alim Bin Yeasin the demo recording.</w:t>
       </w:r>
     </w:p>
     <w:tbl>
@@ -7974,31 +8078,31 @@
       </w:rPr>
     </w:lvl>
   </w:abstractNum>
-  <w:num w:numId="1" w16cid:durableId="740296996">
+  <w:num w:numId="1" w16cid:durableId="248974975">
     <w:abstractNumId w:val="8"/>
   </w:num>
-  <w:num w:numId="2" w16cid:durableId="1423337014">
+  <w:num w:numId="2" w16cid:durableId="1694264189">
     <w:abstractNumId w:val="6"/>
   </w:num>
-  <w:num w:numId="3" w16cid:durableId="986860030">
+  <w:num w:numId="3" w16cid:durableId="329875298">
     <w:abstractNumId w:val="5"/>
   </w:num>
-  <w:num w:numId="4" w16cid:durableId="1036270844">
+  <w:num w:numId="4" w16cid:durableId="950086516">
     <w:abstractNumId w:val="4"/>
   </w:num>
-  <w:num w:numId="5" w16cid:durableId="1736587140">
+  <w:num w:numId="5" w16cid:durableId="310596641">
     <w:abstractNumId w:val="7"/>
   </w:num>
-  <w:num w:numId="6" w16cid:durableId="1258829902">
+  <w:num w:numId="6" w16cid:durableId="821195124">
     <w:abstractNumId w:val="3"/>
   </w:num>
-  <w:num w:numId="7" w16cid:durableId="1384134092">
+  <w:num w:numId="7" w16cid:durableId="1637176943">
     <w:abstractNumId w:val="2"/>
   </w:num>
-  <w:num w:numId="8" w16cid:durableId="1654749013">
+  <w:num w:numId="8" w16cid:durableId="218634513">
     <w:abstractNumId w:val="1"/>
   </w:num>
-  <w:num w:numId="9" w16cid:durableId="517889182">
+  <w:num w:numId="9" w16cid:durableId="589241550">
     <w:abstractNumId w:val="0"/>
   </w:num>
 </w:numbering>

</xml_diff>